<commit_message>
Uvod i pisanje prvih poglavlja
</commit_message>
<xml_diff>
--- a/diplomski_rad.docx
+++ b/diplomski_rad.docx
@@ -1,6 +1,6 @@
 
 <file path=word/document.xml><?xml version="1.0" encoding="utf-8"?>
-<w:document xmlns:wpc="http://schemas.microsoft.com/office/word/2010/wordprocessingCanvas" xmlns:cx="http://schemas.microsoft.com/office/drawing/2014/chartex" xmlns:cx1="http://schemas.microsoft.com/office/drawing/2015/9/8/chartex" xmlns:cx2="http://schemas.microsoft.com/office/drawing/2015/10/21/chartex" xmlns:cx3="http://schemas.microsoft.com/office/drawing/2016/5/9/chartex" xmlns:cx4="http://schemas.microsoft.com/office/drawing/2016/5/10/chartex" xmlns:cx5="http://schemas.microsoft.com/office/drawing/2016/5/11/chartex" xmlns:cx6="http://schemas.microsoft.com/office/drawing/2016/5/12/chartex" xmlns:cx7="http://schemas.microsoft.com/office/drawing/2016/5/13/chartex" xmlns:cx8="http://schemas.microsoft.com/office/drawing/2016/5/14/chartex" xmlns:mc="http://schemas.openxmlformats.org/markup-compatibility/2006" xmlns:aink="http://schemas.microsoft.com/office/drawing/2016/ink" xmlns:am3d="http://schemas.microsoft.com/office/drawing/2017/model3d" xmlns:o="urn:schemas-microsoft-com:office:office" xmlns:oel="http://schemas.microsoft.com/office/2019/extlst" xmlns:r="http://schemas.openxmlformats.org/officeDocument/2006/relationships" xmlns:m="http://schemas.openxmlformats.org/officeDocument/2006/math" xmlns:v="urn:schemas-microsoft-com:vml" xmlns:wp14="http://schemas.microsoft.com/office/word/2010/wordprocessingDrawing" xmlns:wp="http://schemas.openxmlformats.org/drawingml/2006/wordprocessingDrawing" xmlns:w10="urn:schemas-microsoft-com:office:word" xmlns:w="http://schemas.openxmlformats.org/wordprocessingml/2006/main" xmlns:w14="http://schemas.microsoft.com/office/word/2010/wordml" xmlns:w15="http://schemas.microsoft.com/office/word/2012/wordml" xmlns:w16cex="http://schemas.microsoft.com/office/word/2018/wordml/cex" xmlns:w16cid="http://schemas.microsoft.com/office/word/2016/wordml/cid" xmlns:w16="http://schemas.microsoft.com/office/word/2018/wordml" xmlns:w16du="http://schemas.microsoft.com/office/word/2023/wordml/word16du" xmlns:w16sdtdh="http://schemas.microsoft.com/office/word/2020/wordml/sdtdatahash" xmlns:w16sdtfl="http://schemas.microsoft.com/office/word/2024/wordml/sdtformatlock" xmlns:w16se="http://schemas.microsoft.com/office/word/2015/wordml/symex" xmlns:wpg="http://schemas.microsoft.com/office/word/2010/wordprocessingGroup" xmlns:wpi="http://schemas.microsoft.com/office/word/2010/wordprocessingInk" xmlns:wne="http://schemas.microsoft.com/office/word/2006/wordml" xmlns:wps="http://schemas.microsoft.com/office/word/2010/wordprocessingShape" mc:Ignorable="w14 w15 w16se w16cid w16 w16cex w16sdtdh w16sdtfl w16du wp14">
+<w:document xmlns:wpc="http://schemas.microsoft.com/office/word/2010/wordprocessingCanvas" xmlns:cx="http://schemas.microsoft.com/office/drawing/2014/chartex" xmlns:cx1="http://schemas.microsoft.com/office/drawing/2015/9/8/chartex" xmlns:cx2="http://schemas.microsoft.com/office/drawing/2015/10/21/chartex" xmlns:cx3="http://schemas.microsoft.com/office/drawing/2016/5/9/chartex" xmlns:cx4="http://schemas.microsoft.com/office/drawing/2016/5/10/chartex" xmlns:cx5="http://schemas.microsoft.com/office/drawing/2016/5/11/chartex" xmlns:cx6="http://schemas.microsoft.com/office/drawing/2016/5/12/chartex" xmlns:cx7="http://schemas.microsoft.com/office/drawing/2016/5/13/chartex" xmlns:cx8="http://schemas.microsoft.com/office/drawing/2016/5/14/chartex" xmlns:mc="http://schemas.openxmlformats.org/markup-compatibility/2006" xmlns:aink="http://schemas.microsoft.com/office/drawing/2016/ink" xmlns:am3d="http://schemas.microsoft.com/office/drawing/2017/model3d" xmlns:o="urn:schemas-microsoft-com:office:office" xmlns:r="http://schemas.openxmlformats.org/officeDocument/2006/relationships" xmlns:m="http://schemas.openxmlformats.org/officeDocument/2006/math" xmlns:v="urn:schemas-microsoft-com:vml" xmlns:wp14="http://schemas.microsoft.com/office/word/2010/wordprocessingDrawing" xmlns:wp="http://schemas.openxmlformats.org/drawingml/2006/wordprocessingDrawing" xmlns:w10="urn:schemas-microsoft-com:office:word" xmlns:w="http://schemas.openxmlformats.org/wordprocessingml/2006/main" xmlns:w14="http://schemas.microsoft.com/office/word/2010/wordml" xmlns:w15="http://schemas.microsoft.com/office/word/2012/wordml" xmlns:w16cid="http://schemas.microsoft.com/office/word/2016/wordml/cid" xmlns:w16se="http://schemas.microsoft.com/office/word/2015/wordml/symex" xmlns:wpg="http://schemas.microsoft.com/office/word/2010/wordprocessingGroup" xmlns:wpi="http://schemas.microsoft.com/office/word/2010/wordprocessingInk" xmlns:wne="http://schemas.microsoft.com/office/word/2006/wordml" xmlns:wps="http://schemas.microsoft.com/office/word/2010/wordprocessingShape" mc:Ignorable="w14 w15 w16se w16cid wp14">
   <w:body>
     <w:p>
       <w:pPr>
@@ -14534,7 +14534,7 @@
           </mc:Choice>
           <mc:Fallback>
             <w:pict>
-              <v:group w14:anchorId="4801A0E3" id="Group 132078" o:spid="_x0000_s1026" style="width:497pt;height:79.95pt;mso-position-horizontal-relative:char;mso-position-vertical-relative:line" coordsize="63120,10156" o:gfxdata="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">
+              <v:group w14:anchorId="4801A0E3" id="Group 132078" o:spid="_x0000_s1026" style="width:497pt;height:79.95pt;mso-position-horizontal-relative:char;mso-position-vertical-relative:line" coordsize="63120,10156" o:gfxdata="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">
                 <v:shape id="Shape 9" o:spid="_x0000_s1027" style="position:absolute;left:4968;top:922;width:453;height:763;visibility:visible;mso-wrap-style:square;v-text-anchor:top" coordsize="45305,76314" o:gfxdata="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" path="m16983,r2704,l31005,r2971,2699l39641,2699r,11319l36669,16985,31005,11319,28312,8353r-8625,l16983,11319r-2961,l14022,14018r-2704,2967l11318,19683r2704,2967l16983,25349r5664,2966l28312,31014r2693,2966l36669,33980r5665,5655l45305,42333r,19684l42334,64983r-2693,5666l33976,73347r-2971,l28312,76314r-22647,l2960,76314r,-2967l5665,59329r2960,2688l11318,64983r2704,2699l25351,67682r2961,-2699l31005,64983r,-8620l28312,53664,25351,50697,22647,47999,16983,45032r-5665,l8625,42333,5665,39635,2960,33980,,31014,,16985,2960,11319,5665,5665r2960,l11318,2699,16983,xe" fillcolor="black" stroked="f" strokeweight="0">
                   <v:stroke miterlimit="83231f" joinstyle="miter"/>
                   <v:path arrowok="t" textboxrect="0,0,45305,76314"/>
@@ -22719,7 +22719,13 @@
         <w:rPr>
           <w:lang w:val="bs-Cyrl-BA"/>
         </w:rPr>
-        <w:t>Теоријски оквир.............................................................................................3</w:t>
+        <w:t>Теоријски оквир.............................................................................................</w:t>
+      </w:r>
+      <w:r>
+        <w:rPr>
+          <w:lang w:val="bs-Cyrl-BA"/>
+        </w:rPr>
+        <w:t>2</w:t>
       </w:r>
     </w:p>
     <w:p>
@@ -22765,7 +22771,14 @@
           <w:i/>
           <w:lang w:val="bs-Cyrl-BA"/>
         </w:rPr>
-        <w:t>..........3</w:t>
+        <w:t>..........</w:t>
+      </w:r>
+      <w:r>
+        <w:rPr>
+          <w:i/>
+          <w:lang w:val="bs-Cyrl-BA"/>
+        </w:rPr>
+        <w:t>2</w:t>
       </w:r>
     </w:p>
     <w:p>
@@ -22793,7 +22806,14 @@
           <w:iCs/>
           <w:lang w:val="bs-Cyrl-BA"/>
         </w:rPr>
-        <w:t>..................................................................3</w:t>
+        <w:t>..................................................................</w:t>
+      </w:r>
+      <w:r>
+        <w:rPr>
+          <w:iCs/>
+          <w:lang w:val="bs-Cyrl-BA"/>
+        </w:rPr>
+        <w:t>2</w:t>
       </w:r>
     </w:p>
     <w:p>
@@ -22827,7 +22847,14 @@
           <w:i/>
           <w:lang w:val="bs-Cyrl-BA"/>
         </w:rPr>
-        <w:t xml:space="preserve"> .....................................4</w:t>
+        <w:t xml:space="preserve"> .....................................</w:t>
+      </w:r>
+      <w:r>
+        <w:rPr>
+          <w:i/>
+          <w:lang w:val="bs-Cyrl-BA"/>
+        </w:rPr>
+        <w:t>3</w:t>
       </w:r>
     </w:p>
     <w:p>
@@ -22848,7 +22875,14 @@
           <w:iCs/>
           <w:lang w:val="bs-Cyrl-BA"/>
         </w:rPr>
-        <w:t>Језички модели и нискоресурсни језици......................................................5</w:t>
+        <w:t>Језички модели и нискоресурсни језици......................................................</w:t>
+      </w:r>
+      <w:r>
+        <w:rPr>
+          <w:iCs/>
+          <w:lang w:val="bs-Cyrl-BA"/>
+        </w:rPr>
+        <w:t>4</w:t>
       </w:r>
     </w:p>
     <w:p>
@@ -22876,7 +22910,14 @@
           <w:iCs/>
           <w:lang w:val="bs-Cyrl-BA"/>
         </w:rPr>
-        <w:t>.............................................................................6</w:t>
+        <w:t>.............................................................................</w:t>
+      </w:r>
+      <w:r>
+        <w:rPr>
+          <w:iCs/>
+          <w:lang w:val="bs-Cyrl-BA"/>
+        </w:rPr>
+        <w:t>4</w:t>
       </w:r>
     </w:p>
     <w:p>
@@ -22911,7 +22952,14 @@
           <w:iCs/>
           <w:lang w:val="bs-Cyrl-BA"/>
         </w:rPr>
-        <w:t xml:space="preserve"> тачност, халуцинације, конзистентност...............6</w:t>
+        <w:t xml:space="preserve"> тачност, халуцинације, конзистентност...............</w:t>
+      </w:r>
+      <w:r>
+        <w:rPr>
+          <w:iCs/>
+          <w:lang w:val="bs-Cyrl-BA"/>
+        </w:rPr>
+        <w:t>4</w:t>
       </w:r>
     </w:p>
     <w:p>
@@ -23700,15 +23748,6 @@
         </w:rPr>
         <w:t>Биографија............................................................................................................................33</w:t>
       </w:r>
-    </w:p>
-    <w:p>
-      <w:pPr>
-        <w:ind w:left="720" w:firstLine="0"/>
-        <w:rPr>
-          <w:iCs/>
-          <w:lang w:val="bs-Cyrl-BA"/>
-        </w:rPr>
-      </w:pPr>
     </w:p>
     <w:p>
       <w:pPr>
@@ -23728,12 +23767,188 @@
     </w:p>
     <w:p>
       <w:pPr>
+        <w:rPr>
+          <w:b/>
+          <w:sz w:val="32"/>
+        </w:rPr>
+      </w:pPr>
+    </w:p>
+    <w:p/>
+    <w:p>
+      <w:pPr>
         <w:pStyle w:val="Heading1"/>
         <w:ind w:left="417" w:right="0" w:hanging="432"/>
       </w:pPr>
       <w:r>
-        <w:lastRenderedPageBreak/>
         <w:t xml:space="preserve">УВОД </w:t>
+      </w:r>
+    </w:p>
+    <w:p>
+      <w:pPr>
+        <w:spacing w:after="98" w:line="360" w:lineRule="auto"/>
+        <w:ind w:left="0" w:right="0" w:firstLine="0"/>
+        <w:jc w:val="left"/>
+        <w:rPr>
+          <w:lang w:val="bs-Cyrl-BA"/>
+        </w:rPr>
+      </w:pPr>
+    </w:p>
+    <w:p>
+      <w:pPr>
+        <w:spacing w:after="98" w:line="360" w:lineRule="auto"/>
+        <w:ind w:left="0" w:right="0" w:firstLine="0"/>
+        <w:jc w:val="left"/>
+        <w:rPr>
+          <w:lang w:val="bs-Cyrl-BA"/>
+        </w:rPr>
+      </w:pPr>
+      <w:r>
+        <w:rPr>
+          <w:lang w:val="bs-Cyrl-BA"/>
+        </w:rPr>
+        <w:t>У последње време</w:t>
+      </w:r>
+      <w:r>
+        <w:rPr>
+          <w:lang w:val="bs-Cyrl-BA"/>
+        </w:rPr>
+        <w:t xml:space="preserve"> сведоци смо велике </w:t>
+      </w:r>
+      <w:r>
+        <w:rPr>
+          <w:lang w:val="bs-Cyrl-BA"/>
+        </w:rPr>
+        <w:t xml:space="preserve"> употреб</w:t>
+      </w:r>
+      <w:r>
+        <w:rPr>
+          <w:lang w:val="bs-Cyrl-BA"/>
+        </w:rPr>
+        <w:t>е</w:t>
+      </w:r>
+      <w:r>
+        <w:rPr>
+          <w:lang w:val="bs-Cyrl-BA"/>
+        </w:rPr>
+        <w:t xml:space="preserve"> А алата попут </w:t>
+      </w:r>
+      <w:r>
+        <w:t>GPT-4, Claude</w:t>
+      </w:r>
+      <w:r>
+        <w:rPr>
+          <w:lang w:val="bs-Cyrl-BA"/>
+        </w:rPr>
+        <w:t xml:space="preserve">, </w:t>
+      </w:r>
+      <w:r>
+        <w:t>Mistral</w:t>
+      </w:r>
+      <w:r>
+        <w:rPr>
+          <w:lang w:val="bs-Cyrl-BA"/>
+        </w:rPr>
+        <w:t xml:space="preserve"> и </w:t>
+      </w:r>
+      <w:r>
+        <w:rPr>
+          <w:lang w:val="bs-Latn-BA"/>
+        </w:rPr>
+        <w:t>Gemini</w:t>
+      </w:r>
+      <w:r>
+        <w:rPr>
+          <w:lang w:val="en-US"/>
+        </w:rPr>
+        <w:t xml:space="preserve"> </w:t>
+      </w:r>
+      <w:r>
+        <w:rPr>
+          <w:lang w:val="bs-Cyrl-BA"/>
+        </w:rPr>
+        <w:t xml:space="preserve">развој великих језичких модела </w:t>
+      </w:r>
+      <w:r>
+        <w:t xml:space="preserve">(енгл. </w:t>
+      </w:r>
+      <w:r>
+        <w:rPr>
+          <w:rStyle w:val="Emphasis"/>
+        </w:rPr>
+        <w:t>Large Language Models, LLM</w:t>
+      </w:r>
+      <w:r>
+        <w:t>)</w:t>
+      </w:r>
+      <w:r>
+        <w:rPr>
+          <w:lang w:val="bs-Cyrl-BA"/>
+        </w:rPr>
+        <w:t xml:space="preserve"> долази до великог напретка у области вештачке интелигенције. А алати су изузетно способни у разумевању и генерисању природног језика  омогућавајући аутоматско одговарање на питања, превод и сажимање текста, до помоћи у софтверском инжињерингу, образовању и општем животу људи.</w:t>
+      </w:r>
+    </w:p>
+    <w:p>
+      <w:pPr>
+        <w:spacing w:after="98" w:line="360" w:lineRule="auto"/>
+        <w:ind w:left="0" w:right="0" w:firstLine="0"/>
+        <w:jc w:val="left"/>
+        <w:rPr>
+          <w:lang w:val="bs-Cyrl-BA"/>
+        </w:rPr>
+      </w:pPr>
+    </w:p>
+    <w:p>
+      <w:pPr>
+        <w:spacing w:after="98" w:line="360" w:lineRule="auto"/>
+        <w:ind w:left="0" w:right="0" w:firstLine="0"/>
+        <w:jc w:val="left"/>
+        <w:rPr>
+          <w:lang w:val="bs-Cyrl-BA"/>
+        </w:rPr>
+      </w:pPr>
+      <w:r>
+        <w:rPr>
+          <w:lang w:val="bs-Cyrl-BA"/>
+        </w:rPr>
+        <w:t>Енглески језик, као најраспрострањенији језик света, има велику заступљеност у тренинг скуповима података и доступности алата за евалуацију. За разлику од енглеског, српски језик који припада категорији нискоресурсних језика</w:t>
+      </w:r>
+      <w:r>
+        <w:rPr>
+          <w:lang w:val="bs-Cyrl-BA"/>
+        </w:rPr>
+        <w:t xml:space="preserve">, има велики изазов у евалуацији ових модела и доводи до питања саме поузданости у комуникацији на српском. </w:t>
+      </w:r>
+    </w:p>
+    <w:p>
+      <w:pPr>
+        <w:spacing w:after="98" w:line="360" w:lineRule="auto"/>
+        <w:ind w:left="0" w:right="0" w:firstLine="0"/>
+        <w:jc w:val="left"/>
+        <w:rPr>
+          <w:lang w:val="bs-Cyrl-BA"/>
+        </w:rPr>
+      </w:pPr>
+    </w:p>
+    <w:p>
+      <w:pPr>
+        <w:spacing w:after="98" w:line="360" w:lineRule="auto"/>
+        <w:ind w:left="0" w:right="0" w:firstLine="0"/>
+        <w:jc w:val="left"/>
+        <w:rPr>
+          <w:lang w:val="bs-Cyrl-BA"/>
+        </w:rPr>
+      </w:pPr>
+      <w:r>
+        <w:rPr>
+          <w:lang w:val="bs-Cyrl-BA"/>
+        </w:rPr>
+        <w:t>Овај рад бави се управо том темом, систематском евалуацијом беликих језичких модела на српском језику кроз 3 кљ</w:t>
+      </w:r>
+      <w:r>
+        <w:rPr>
+          <w:lang w:val="bs-Cyrl-BA"/>
+        </w:rPr>
+        <w:t>учна параметра: тачност, халуцинације и конзистентност. Тачност представља способност модела да исправно одговори на питања из различитих домена. Халуцинација подразумева склоност модела да измишља неке особе, догађаје или чињенице а које заправо не постоје. Конзистентност мери да ли модел даје исте одговоре на иста питања али формирана на мало другачији начин.</w:t>
       </w:r>
     </w:p>
     <w:p>
@@ -23742,9 +23957,78 @@
         <w:ind w:left="0" w:right="0" w:firstLine="0"/>
         <w:jc w:val="left"/>
         <w:rPr>
+          <w:lang w:val="bs-Cyrl-BA"/>
+        </w:rPr>
+      </w:pPr>
+    </w:p>
+    <w:p>
+      <w:pPr>
+        <w:spacing w:after="98" w:line="360" w:lineRule="auto"/>
+        <w:ind w:left="0" w:right="0" w:firstLine="0"/>
+        <w:jc w:val="left"/>
+        <w:rPr>
+          <w:lang w:val="bs-Cyrl-BA"/>
+        </w:rPr>
+      </w:pPr>
+      <w:r>
+        <w:rPr>
+          <w:lang w:val="bs-Cyrl-BA"/>
+        </w:rPr>
+        <w:t xml:space="preserve">У оквиру овог истраживања тестирали смо три модела </w:t>
+      </w:r>
+      <w:r>
+        <w:t>— GPT-4, Claude Sonnet и Mistral Small</w:t>
+      </w:r>
+      <w:r>
+        <w:rPr>
+          <w:lang w:val="bs-Cyrl-BA"/>
+        </w:rPr>
+        <w:t xml:space="preserve"> на скупу од преко 150 питања подељених три параметра. Питања су креирана ручно </w:t>
+      </w:r>
+      <w:r>
+        <w:rPr>
+          <w:lang w:val="bs-Cyrl-BA"/>
+        </w:rPr>
+        <w:t>из позданих извора и адаптацијом постојећих бенчмаркова</w:t>
+      </w:r>
+      <w:r>
+        <w:rPr>
           <w:lang w:val="en-US"/>
         </w:rPr>
-      </w:pPr>
+        <w:t xml:space="preserve">, </w:t>
+      </w:r>
+      <w:r>
+        <w:rPr>
+          <w:lang w:val="en-US"/>
+        </w:rPr>
+        <w:t xml:space="preserve">a </w:t>
+      </w:r>
+      <w:r>
+        <w:rPr>
+          <w:lang w:val="bs-Cyrl-BA"/>
+        </w:rPr>
+        <w:t xml:space="preserve">евалуација је сшрпведен аутоматским путем скупа инструкција које су написане у </w:t>
+      </w:r>
+      <w:r>
+        <w:rPr>
+          <w:i/>
+          <w:lang w:val="bs-Latn-BA"/>
+        </w:rPr>
+        <w:t>python</w:t>
+      </w:r>
+      <w:r>
+        <w:rPr>
+          <w:i/>
+          <w:lang w:val="bs-Cyrl-BA"/>
+        </w:rPr>
+        <w:t xml:space="preserve"> </w:t>
+      </w:r>
+      <w:r>
+        <w:rPr>
+          <w:lang w:val="bs-Cyrl-BA"/>
+        </w:rPr>
+        <w:t>коду уз накнадну ручну верификацију. Резултати показују значајне разлике у перформансама модела, нарочито у домену халуцинација на српском језику.</w:t>
+      </w:r>
     </w:p>
     <w:p>
       <w:pPr>
@@ -23780,419 +24064,10 @@
         <w:ind w:left="0" w:right="0" w:firstLine="0"/>
         <w:jc w:val="left"/>
       </w:pPr>
-      <w:r>
-        <w:rPr>
-          <w:rFonts w:ascii="Calibri" w:eastAsia="Calibri" w:hAnsi="Calibri" w:cs="Calibri"/>
-          <w:sz w:val="22"/>
-        </w:rPr>
-        <w:t xml:space="preserve"> </w:t>
-      </w:r>
     </w:p>
     <w:p>
       <w:pPr>
         <w:spacing w:after="98" w:line="259" w:lineRule="auto"/>
-        <w:ind w:left="0" w:right="0" w:firstLine="0"/>
-        <w:jc w:val="left"/>
-      </w:pPr>
-      <w:r>
-        <w:rPr>
-          <w:rFonts w:ascii="Calibri" w:eastAsia="Calibri" w:hAnsi="Calibri" w:cs="Calibri"/>
-          <w:sz w:val="22"/>
-        </w:rPr>
-        <w:t xml:space="preserve"> </w:t>
-      </w:r>
-    </w:p>
-    <w:p>
-      <w:pPr>
-        <w:spacing w:after="98" w:line="259" w:lineRule="auto"/>
-        <w:ind w:left="0" w:right="0" w:firstLine="0"/>
-        <w:jc w:val="left"/>
-      </w:pPr>
-      <w:r>
-        <w:rPr>
-          <w:rFonts w:ascii="Calibri" w:eastAsia="Calibri" w:hAnsi="Calibri" w:cs="Calibri"/>
-          <w:sz w:val="22"/>
-        </w:rPr>
-        <w:t xml:space="preserve"> </w:t>
-      </w:r>
-    </w:p>
-    <w:p>
-      <w:pPr>
-        <w:spacing w:after="98" w:line="259" w:lineRule="auto"/>
-        <w:ind w:left="0" w:right="0" w:firstLine="0"/>
-        <w:jc w:val="left"/>
-      </w:pPr>
-      <w:r>
-        <w:rPr>
-          <w:rFonts w:ascii="Calibri" w:eastAsia="Calibri" w:hAnsi="Calibri" w:cs="Calibri"/>
-          <w:sz w:val="22"/>
-        </w:rPr>
-        <w:t xml:space="preserve"> </w:t>
-      </w:r>
-    </w:p>
-    <w:p>
-      <w:pPr>
-        <w:spacing w:after="98" w:line="259" w:lineRule="auto"/>
-        <w:ind w:left="0" w:right="0" w:firstLine="0"/>
-        <w:jc w:val="left"/>
-      </w:pPr>
-      <w:r>
-        <w:rPr>
-          <w:rFonts w:ascii="Calibri" w:eastAsia="Calibri" w:hAnsi="Calibri" w:cs="Calibri"/>
-          <w:sz w:val="22"/>
-        </w:rPr>
-        <w:t xml:space="preserve"> </w:t>
-      </w:r>
-    </w:p>
-    <w:p>
-      <w:pPr>
-        <w:spacing w:after="98" w:line="259" w:lineRule="auto"/>
-        <w:ind w:left="0" w:right="0" w:firstLine="0"/>
-        <w:jc w:val="left"/>
-      </w:pPr>
-      <w:r>
-        <w:rPr>
-          <w:rFonts w:ascii="Calibri" w:eastAsia="Calibri" w:hAnsi="Calibri" w:cs="Calibri"/>
-          <w:sz w:val="22"/>
-        </w:rPr>
-        <w:t xml:space="preserve"> </w:t>
-      </w:r>
-    </w:p>
-    <w:p>
-      <w:pPr>
-        <w:spacing w:after="98" w:line="259" w:lineRule="auto"/>
-        <w:ind w:left="0" w:right="0" w:firstLine="0"/>
-        <w:jc w:val="left"/>
-      </w:pPr>
-      <w:r>
-        <w:rPr>
-          <w:rFonts w:ascii="Calibri" w:eastAsia="Calibri" w:hAnsi="Calibri" w:cs="Calibri"/>
-          <w:sz w:val="22"/>
-        </w:rPr>
-        <w:t xml:space="preserve"> </w:t>
-      </w:r>
-    </w:p>
-    <w:p>
-      <w:pPr>
-        <w:spacing w:after="93" w:line="259" w:lineRule="auto"/>
-        <w:ind w:left="0" w:right="0" w:firstLine="0"/>
-        <w:jc w:val="left"/>
-      </w:pPr>
-      <w:r>
-        <w:rPr>
-          <w:rFonts w:ascii="Calibri" w:eastAsia="Calibri" w:hAnsi="Calibri" w:cs="Calibri"/>
-          <w:sz w:val="22"/>
-        </w:rPr>
-        <w:t xml:space="preserve"> </w:t>
-      </w:r>
-    </w:p>
-    <w:p>
-      <w:pPr>
-        <w:spacing w:after="98" w:line="259" w:lineRule="auto"/>
-        <w:ind w:left="0" w:right="0" w:firstLine="0"/>
-        <w:jc w:val="left"/>
-      </w:pPr>
-      <w:r>
-        <w:rPr>
-          <w:rFonts w:ascii="Calibri" w:eastAsia="Calibri" w:hAnsi="Calibri" w:cs="Calibri"/>
-          <w:sz w:val="22"/>
-        </w:rPr>
-        <w:t xml:space="preserve"> </w:t>
-      </w:r>
-    </w:p>
-    <w:p>
-      <w:pPr>
-        <w:spacing w:after="98" w:line="259" w:lineRule="auto"/>
-        <w:ind w:left="0" w:right="0" w:firstLine="0"/>
-        <w:jc w:val="left"/>
-      </w:pPr>
-      <w:r>
-        <w:rPr>
-          <w:rFonts w:ascii="Calibri" w:eastAsia="Calibri" w:hAnsi="Calibri" w:cs="Calibri"/>
-          <w:sz w:val="22"/>
-        </w:rPr>
-        <w:t xml:space="preserve"> </w:t>
-      </w:r>
-    </w:p>
-    <w:p>
-      <w:pPr>
-        <w:spacing w:after="98" w:line="259" w:lineRule="auto"/>
-        <w:ind w:left="0" w:right="0" w:firstLine="0"/>
-        <w:jc w:val="left"/>
-      </w:pPr>
-      <w:r>
-        <w:rPr>
-          <w:rFonts w:ascii="Calibri" w:eastAsia="Calibri" w:hAnsi="Calibri" w:cs="Calibri"/>
-          <w:sz w:val="22"/>
-        </w:rPr>
-        <w:t xml:space="preserve"> </w:t>
-      </w:r>
-    </w:p>
-    <w:p>
-      <w:pPr>
-        <w:spacing w:after="98" w:line="259" w:lineRule="auto"/>
-        <w:ind w:left="0" w:right="0" w:firstLine="0"/>
-        <w:jc w:val="left"/>
-      </w:pPr>
-      <w:r>
-        <w:rPr>
-          <w:rFonts w:ascii="Calibri" w:eastAsia="Calibri" w:hAnsi="Calibri" w:cs="Calibri"/>
-          <w:sz w:val="22"/>
-        </w:rPr>
-        <w:t xml:space="preserve"> </w:t>
-      </w:r>
-    </w:p>
-    <w:p>
-      <w:pPr>
-        <w:spacing w:after="98" w:line="259" w:lineRule="auto"/>
-        <w:ind w:left="0" w:right="0" w:firstLine="0"/>
-        <w:jc w:val="left"/>
-      </w:pPr>
-      <w:r>
-        <w:rPr>
-          <w:rFonts w:ascii="Calibri" w:eastAsia="Calibri" w:hAnsi="Calibri" w:cs="Calibri"/>
-          <w:sz w:val="22"/>
-        </w:rPr>
-        <w:t xml:space="preserve"> </w:t>
-      </w:r>
-    </w:p>
-    <w:p>
-      <w:pPr>
-        <w:spacing w:after="98" w:line="259" w:lineRule="auto"/>
-        <w:ind w:left="0" w:right="0" w:firstLine="0"/>
-        <w:jc w:val="left"/>
-      </w:pPr>
-      <w:r>
-        <w:rPr>
-          <w:rFonts w:ascii="Calibri" w:eastAsia="Calibri" w:hAnsi="Calibri" w:cs="Calibri"/>
-          <w:sz w:val="22"/>
-        </w:rPr>
-        <w:t xml:space="preserve"> </w:t>
-      </w:r>
-    </w:p>
-    <w:p>
-      <w:pPr>
-        <w:spacing w:after="98" w:line="259" w:lineRule="auto"/>
-        <w:ind w:left="0" w:right="0" w:firstLine="0"/>
-        <w:jc w:val="left"/>
-      </w:pPr>
-      <w:r>
-        <w:rPr>
-          <w:rFonts w:ascii="Calibri" w:eastAsia="Calibri" w:hAnsi="Calibri" w:cs="Calibri"/>
-          <w:sz w:val="22"/>
-        </w:rPr>
-        <w:t xml:space="preserve"> </w:t>
-      </w:r>
-    </w:p>
-    <w:p>
-      <w:pPr>
-        <w:spacing w:after="98" w:line="259" w:lineRule="auto"/>
-        <w:ind w:left="0" w:right="0" w:firstLine="0"/>
-        <w:jc w:val="left"/>
-      </w:pPr>
-      <w:r>
-        <w:rPr>
-          <w:rFonts w:ascii="Calibri" w:eastAsia="Calibri" w:hAnsi="Calibri" w:cs="Calibri"/>
-          <w:sz w:val="22"/>
-        </w:rPr>
-        <w:t xml:space="preserve"> </w:t>
-      </w:r>
-    </w:p>
-    <w:p>
-      <w:pPr>
-        <w:spacing w:after="98" w:line="259" w:lineRule="auto"/>
-        <w:ind w:left="0" w:right="0" w:firstLine="0"/>
-        <w:jc w:val="left"/>
-      </w:pPr>
-      <w:r>
-        <w:rPr>
-          <w:rFonts w:ascii="Calibri" w:eastAsia="Calibri" w:hAnsi="Calibri" w:cs="Calibri"/>
-          <w:sz w:val="22"/>
-        </w:rPr>
-        <w:t xml:space="preserve"> </w:t>
-      </w:r>
-    </w:p>
-    <w:p>
-      <w:pPr>
-        <w:spacing w:after="98" w:line="259" w:lineRule="auto"/>
-        <w:ind w:left="0" w:right="0" w:firstLine="0"/>
-        <w:jc w:val="left"/>
-      </w:pPr>
-      <w:r>
-        <w:rPr>
-          <w:rFonts w:ascii="Calibri" w:eastAsia="Calibri" w:hAnsi="Calibri" w:cs="Calibri"/>
-          <w:sz w:val="22"/>
-        </w:rPr>
-        <w:t xml:space="preserve"> </w:t>
-      </w:r>
-    </w:p>
-    <w:p>
-      <w:pPr>
-        <w:spacing w:after="98" w:line="259" w:lineRule="auto"/>
-        <w:ind w:left="0" w:right="0" w:firstLine="0"/>
-        <w:jc w:val="left"/>
-      </w:pPr>
-      <w:r>
-        <w:rPr>
-          <w:rFonts w:ascii="Calibri" w:eastAsia="Calibri" w:hAnsi="Calibri" w:cs="Calibri"/>
-          <w:sz w:val="22"/>
-        </w:rPr>
-        <w:t xml:space="preserve"> </w:t>
-      </w:r>
-    </w:p>
-    <w:p>
-      <w:pPr>
-        <w:spacing w:after="0" w:line="259" w:lineRule="auto"/>
-        <w:ind w:left="0" w:right="0" w:firstLine="0"/>
-        <w:jc w:val="left"/>
-      </w:pPr>
-      <w:r>
-        <w:rPr>
-          <w:rFonts w:ascii="Calibri" w:eastAsia="Calibri" w:hAnsi="Calibri" w:cs="Calibri"/>
-          <w:sz w:val="22"/>
-        </w:rPr>
-        <w:t xml:space="preserve"> </w:t>
-      </w:r>
-    </w:p>
-    <w:p>
-      <w:pPr>
-        <w:pStyle w:val="Heading1"/>
-        <w:spacing w:after="457"/>
-        <w:ind w:left="417" w:right="0" w:hanging="432"/>
-      </w:pPr>
-      <w:r>
-        <w:t xml:space="preserve">ТЕОРИЈСКИ ОКВИР </w:t>
-      </w:r>
-    </w:p>
-    <w:p>
-      <w:pPr>
-        <w:spacing w:after="247" w:line="259" w:lineRule="auto"/>
-        <w:ind w:left="0" w:right="0" w:firstLine="0"/>
-        <w:jc w:val="left"/>
-      </w:pPr>
-    </w:p>
-    <w:p>
-      <w:pPr>
-        <w:spacing w:after="247" w:line="259" w:lineRule="auto"/>
-        <w:ind w:left="0" w:right="0" w:firstLine="0"/>
-        <w:jc w:val="left"/>
-      </w:pPr>
-      <w:r>
-        <w:t xml:space="preserve"> </w:t>
-      </w:r>
-    </w:p>
-    <w:p>
-      <w:pPr>
-        <w:spacing w:after="341" w:line="259" w:lineRule="auto"/>
-        <w:ind w:left="0" w:right="0" w:firstLine="0"/>
-        <w:jc w:val="left"/>
-      </w:pPr>
-      <w:r>
-        <w:rPr>
-          <w:rFonts w:ascii="Calibri" w:eastAsia="Calibri" w:hAnsi="Calibri" w:cs="Calibri"/>
-        </w:rPr>
-        <w:t xml:space="preserve"> </w:t>
-      </w:r>
-    </w:p>
-    <w:p>
-      <w:pPr>
-        <w:spacing w:after="98" w:line="259" w:lineRule="auto"/>
-        <w:ind w:left="144" w:right="0" w:firstLine="0"/>
-        <w:jc w:val="left"/>
-      </w:pPr>
-      <w:r>
-        <w:rPr>
-          <w:rFonts w:ascii="Calibri" w:eastAsia="Calibri" w:hAnsi="Calibri" w:cs="Calibri"/>
-          <w:sz w:val="22"/>
-        </w:rPr>
-        <w:t xml:space="preserve"> </w:t>
-      </w:r>
-    </w:p>
-    <w:p>
-      <w:pPr>
-        <w:spacing w:after="0" w:line="259" w:lineRule="auto"/>
-        <w:ind w:left="144" w:right="0" w:firstLine="0"/>
-        <w:jc w:val="left"/>
-      </w:pPr>
-      <w:r>
-        <w:rPr>
-          <w:rFonts w:ascii="Calibri" w:eastAsia="Calibri" w:hAnsi="Calibri" w:cs="Calibri"/>
-          <w:sz w:val="22"/>
-        </w:rPr>
-        <w:t xml:space="preserve"> </w:t>
-      </w:r>
-    </w:p>
-    <w:p>
-      <w:pPr>
-        <w:spacing w:after="223" w:line="259" w:lineRule="auto"/>
-        <w:ind w:left="0" w:right="0" w:firstLine="0"/>
-        <w:jc w:val="left"/>
-      </w:pPr>
-      <w:r>
-        <w:t xml:space="preserve"> </w:t>
-      </w:r>
-    </w:p>
-    <w:p>
-      <w:pPr>
-        <w:spacing w:after="339" w:line="259" w:lineRule="auto"/>
-        <w:ind w:left="0" w:right="0" w:firstLine="0"/>
-        <w:jc w:val="left"/>
-      </w:pPr>
-      <w:r>
-        <w:rPr>
-          <w:i/>
-          <w:sz w:val="22"/>
-        </w:rPr>
-        <w:t xml:space="preserve"> </w:t>
-      </w:r>
-    </w:p>
-    <w:p>
-      <w:pPr>
-        <w:spacing w:after="0" w:line="259" w:lineRule="auto"/>
-        <w:ind w:left="0" w:right="0" w:firstLine="0"/>
-        <w:jc w:val="left"/>
-      </w:pPr>
-      <w:r>
-        <w:rPr>
-          <w:sz w:val="22"/>
-        </w:rPr>
-        <w:t xml:space="preserve"> </w:t>
-      </w:r>
-    </w:p>
-    <w:p>
-      <w:pPr>
-        <w:spacing w:after="237" w:line="259" w:lineRule="auto"/>
-        <w:ind w:left="0" w:right="0" w:firstLine="0"/>
-        <w:jc w:val="left"/>
-      </w:pPr>
-      <w:r>
-        <w:t xml:space="preserve"> </w:t>
-      </w:r>
-    </w:p>
-    <w:p>
-      <w:pPr>
-        <w:spacing w:after="93" w:line="259" w:lineRule="auto"/>
-        <w:ind w:left="0" w:right="0" w:firstLine="0"/>
-        <w:jc w:val="left"/>
-      </w:pPr>
-      <w:r>
-        <w:lastRenderedPageBreak/>
-        <w:t xml:space="preserve"> </w:t>
-      </w:r>
-    </w:p>
-    <w:p>
-      <w:pPr>
-        <w:spacing w:after="98" w:line="259" w:lineRule="auto"/>
-        <w:ind w:left="0" w:right="0" w:firstLine="0"/>
-        <w:jc w:val="left"/>
-      </w:pPr>
-      <w:r>
-        <w:t xml:space="preserve"> </w:t>
-      </w:r>
-    </w:p>
-    <w:p>
-      <w:pPr>
-        <w:spacing w:after="93" w:line="259" w:lineRule="auto"/>
         <w:ind w:left="0" w:right="0" w:firstLine="0"/>
         <w:jc w:val="left"/>
       </w:pPr>
@@ -24203,28 +24078,225 @@
         <w:ind w:left="0" w:right="0" w:firstLine="0"/>
         <w:jc w:val="left"/>
       </w:pPr>
+    </w:p>
+    <w:p>
+      <w:pPr>
+        <w:spacing w:after="98" w:line="259" w:lineRule="auto"/>
+        <w:ind w:left="0" w:right="0" w:firstLine="0"/>
+        <w:jc w:val="left"/>
+      </w:pPr>
+    </w:p>
+    <w:p>
+      <w:pPr>
+        <w:spacing w:after="98" w:line="259" w:lineRule="auto"/>
+        <w:ind w:left="0" w:right="0" w:firstLine="0"/>
+        <w:jc w:val="left"/>
+        <w:rPr>
+          <w:lang w:val="bs-Latn-BA"/>
+        </w:rPr>
+      </w:pPr>
+    </w:p>
+    <w:p>
+      <w:pPr>
+        <w:pStyle w:val="Heading1"/>
+        <w:spacing w:after="457"/>
+        <w:ind w:left="417" w:right="0" w:hanging="432"/>
+      </w:pPr>
       <w:r>
-        <w:t xml:space="preserve"> </w:t>
+        <w:t>ТЕОРИЈСКИ ОКВИР</w:t>
       </w:r>
     </w:p>
     <w:p>
       <w:pPr>
-        <w:spacing w:after="232" w:line="259" w:lineRule="auto"/>
-        <w:ind w:left="0" w:right="0" w:firstLine="0"/>
-        <w:jc w:val="left"/>
+        <w:pStyle w:val="Heading2"/>
       </w:pPr>
       <w:r>
+        <w:rPr>
+          <w:lang w:val="bs-Cyrl-BA"/>
+        </w:rPr>
+        <w:t xml:space="preserve">Велики језички модели </w:t>
+      </w:r>
+      <w:r>
+        <w:t>(</w:t>
+      </w:r>
+      <w:r>
+        <w:rPr>
+          <w:i/>
+        </w:rPr>
+        <w:t>LLM</w:t>
+      </w:r>
+      <w:r>
+        <w:t>)</w:t>
+      </w:r>
+      <w:r>
+        <w:rPr>
+          <w:lang w:val="bs-Cyrl-BA"/>
+        </w:rPr>
         <w:t xml:space="preserve"> </w:t>
+      </w:r>
+      <w:r>
+        <w:rPr>
+          <w:lang w:val="bs-Cyrl-BA"/>
+        </w:rPr>
+        <w:tab/>
+      </w:r>
+      <w:r>
+        <w:rPr>
+          <w:lang w:val="bs-Cyrl-BA"/>
+        </w:rPr>
+        <w:tab/>
+      </w:r>
+      <w:r>
+        <w:rPr>
+          <w:lang w:val="bs-Cyrl-BA"/>
+        </w:rPr>
+        <w:tab/>
+      </w:r>
+      <w:r>
+        <w:rPr>
+          <w:lang w:val="bs-Cyrl-BA"/>
+        </w:rPr>
+        <w:tab/>
       </w:r>
     </w:p>
     <w:p>
       <w:pPr>
-        <w:spacing w:after="247" w:line="259" w:lineRule="auto"/>
-        <w:ind w:left="0" w:right="0" w:firstLine="0"/>
-        <w:jc w:val="left"/>
+        <w:rPr>
+          <w:lang w:val="bs-Cyrl-BA"/>
+        </w:rPr>
       </w:pPr>
       <w:r>
+        <w:t xml:space="preserve">Велики језички модели (енгл. </w:t>
+      </w:r>
+      <w:r>
+        <w:rPr>
+          <w:rStyle w:val="Emphasis"/>
+        </w:rPr>
+        <w:t>Large Language Models</w:t>
+      </w:r>
+      <w:r>
+        <w:t xml:space="preserve">, </w:t>
+      </w:r>
+      <w:r>
+        <w:rPr>
+          <w:i/>
+        </w:rPr>
+        <w:t>LLM</w:t>
+      </w:r>
+      <w:r>
+        <w:t>)</w:t>
+      </w:r>
+      <w:r>
         <w:t xml:space="preserve"> </w:t>
+      </w:r>
+      <w:r>
+        <w:rPr>
+          <w:lang w:val="bs-Cyrl-BA"/>
+        </w:rPr>
+        <w:t>представљају класу модела вештачке интелигенције које имају способност да разумеју и генеришу људски језик. Они се тренирају на огромним скуповима података (милијардама страница са интернета, књига и научних радова) и садрже велики број параметара. Захваљујући томе, они су способни да воде разговор, разумеју</w:t>
+      </w:r>
+      <w:r>
+        <w:rPr>
+          <w:lang w:val="bs-Cyrl-BA"/>
+        </w:rPr>
+        <w:t xml:space="preserve"> и одговарају на</w:t>
+      </w:r>
+      <w:r>
+        <w:rPr>
+          <w:lang w:val="bs-Cyrl-BA"/>
+        </w:rPr>
+        <w:t xml:space="preserve"> питања</w:t>
+      </w:r>
+      <w:r>
+        <w:rPr>
+          <w:lang w:val="bs-Cyrl-BA"/>
+        </w:rPr>
+        <w:t>, пишу код и обављају низ других задатака без додатног тренирања за сваки захтев посебно. У наставку су описане кључне карактеристике ових модела, са посебним акцентом на архитектуру, представнике и изазове везане за нискорангиране језике</w:t>
+      </w:r>
+    </w:p>
+    <w:p>
+      <w:pPr>
+        <w:rPr>
+          <w:lang w:val="bs-Cyrl-BA"/>
+        </w:rPr>
+      </w:pPr>
+      <w:r>
+        <w:rPr>
+          <w:lang w:val="bs-Cyrl-BA"/>
+        </w:rPr>
+        <w:tab/>
+      </w:r>
+      <w:r>
+        <w:rPr>
+          <w:lang w:val="bs-Cyrl-BA"/>
+        </w:rPr>
+        <w:tab/>
+      </w:r>
+      <w:r>
+        <w:rPr>
+          <w:lang w:val="bs-Cyrl-BA"/>
+        </w:rPr>
+        <w:tab/>
+      </w:r>
+      <w:r>
+        <w:rPr>
+          <w:lang w:val="bs-Cyrl-BA"/>
+        </w:rPr>
+        <w:tab/>
+      </w:r>
+      <w:r>
+        <w:rPr>
+          <w:lang w:val="bs-Cyrl-BA"/>
+        </w:rPr>
+        <w:tab/>
+      </w:r>
+      <w:r>
+        <w:rPr>
+          <w:lang w:val="bs-Cyrl-BA"/>
+        </w:rPr>
+        <w:tab/>
+      </w:r>
+      <w:r>
+        <w:rPr>
+          <w:lang w:val="bs-Cyrl-BA"/>
+        </w:rPr>
+        <w:tab/>
+      </w:r>
+      <w:r>
+        <w:rPr>
+          <w:lang w:val="bs-Cyrl-BA"/>
+        </w:rPr>
+        <w:tab/>
+      </w:r>
+      <w:r>
+        <w:rPr>
+          <w:lang w:val="bs-Cyrl-BA"/>
+        </w:rPr>
+        <w:tab/>
+      </w:r>
+      <w:r>
+        <w:rPr>
+          <w:lang w:val="bs-Cyrl-BA"/>
+        </w:rPr>
+        <w:tab/>
+      </w:r>
+      <w:r>
+        <w:rPr>
+          <w:lang w:val="bs-Cyrl-BA"/>
+        </w:rPr>
+        <w:tab/>
+      </w:r>
+      <w:r>
+        <w:rPr>
+          <w:lang w:val="bs-Cyrl-BA"/>
+        </w:rPr>
+        <w:tab/>
+      </w:r>
+      <w:r>
+        <w:rPr>
+          <w:lang w:val="bs-Cyrl-BA"/>
+        </w:rPr>
+        <w:tab/>
       </w:r>
     </w:p>
     <w:p>
@@ -24242,10 +24314,738 @@
     </w:p>
     <w:p>
       <w:pPr>
+        <w:pStyle w:val="Heading3"/>
+        <w:rPr>
+          <w:lang w:val="bs-Cyrl-BA"/>
+        </w:rPr>
+      </w:pPr>
+      <w:r>
+        <w:rPr>
+          <w:lang w:val="bs-Cyrl-BA"/>
+        </w:rPr>
+        <w:t>Архитектура трансформера</w:t>
+      </w:r>
+    </w:p>
+    <w:p>
+      <w:pPr>
+        <w:rPr>
+          <w:lang w:val="bs-Cyrl-BA"/>
+        </w:rPr>
+      </w:pPr>
+    </w:p>
+    <w:p>
+      <w:pPr>
+        <w:rPr>
+          <w:lang w:val="bs-Cyrl-BA"/>
+        </w:rPr>
+      </w:pPr>
+      <w:r>
+        <w:rPr>
+          <w:lang w:val="bs-Cyrl-BA"/>
+        </w:rPr>
+        <w:t xml:space="preserve">Велики језички модели засновани на архитектури трансформера, који су представљени 2017. године у раду </w:t>
+      </w:r>
+      <w:r>
+        <w:t>"Attention Is All You Need"</w:t>
+      </w:r>
+      <w:r>
+        <w:rPr>
+          <w:lang w:val="bs-Cyrl-BA"/>
+        </w:rPr>
+        <w:t xml:space="preserve">. </w:t>
+      </w:r>
+      <w:r>
+        <w:rPr>
+          <w:lang w:val="bs-Cyrl-BA"/>
+        </w:rPr>
+        <w:t>Пре трансформера доминантни приступ обради људског језика биле су рекурентне неуронске мреже(РНН) и дуга краткорочна меморија (ЛСТМ), које су текст обрађивале реч по реч. Такав приступ је имао доста ограничења јер је модел тешко памтио зависности између речи.</w:t>
+      </w:r>
+    </w:p>
+    <w:p>
+      <w:pPr>
+        <w:rPr>
+          <w:lang w:val="bs-Cyrl-BA"/>
+        </w:rPr>
+      </w:pPr>
+    </w:p>
+    <w:p>
+      <w:pPr>
+        <w:rPr>
+          <w:lang w:val="bs-Cyrl-BA"/>
+        </w:rPr>
+      </w:pPr>
+      <w:r>
+        <w:rPr>
+          <w:lang w:val="bs-Cyrl-BA"/>
+        </w:rPr>
+        <w:t>Трансформер је решио проблем секвенцијалне обраде текста увођењем механизма пажње, где трансформер обрађује све речи у реченици истовремено иза сваку реч рачуна колико је свака друга реч у тексту важна за разумевање. Архитектура трансформера се састоји из два дела: енкодера, који улазни текст претвара у нумеричке репрезентације, и декодер који на основу тих репрзентација генерише излазни текст.</w:t>
+      </w:r>
+      <w:r>
+        <w:rPr>
+          <w:lang w:val="bs-Cyrl-BA"/>
+        </w:rPr>
+        <w:t xml:space="preserve"> </w:t>
+      </w:r>
+    </w:p>
+    <w:p>
+      <w:pPr>
+        <w:rPr>
+          <w:lang w:val="bs-Cyrl-BA"/>
+        </w:rPr>
+      </w:pPr>
+    </w:p>
+    <w:p>
+      <w:pPr>
+        <w:rPr>
+          <w:lang w:val="bs-Cyrl-BA"/>
+        </w:rPr>
+      </w:pPr>
+    </w:p>
+    <w:p>
+      <w:pPr>
+        <w:rPr>
+          <w:lang w:val="bs-Cyrl-BA"/>
+        </w:rPr>
+      </w:pPr>
+    </w:p>
+    <w:p>
+      <w:pPr>
+        <w:rPr>
+          <w:lang w:val="bs-Cyrl-BA"/>
+        </w:rPr>
+      </w:pPr>
+    </w:p>
+    <w:p>
+      <w:pPr>
+        <w:rPr>
+          <w:lang w:val="bs-Cyrl-BA"/>
+        </w:rPr>
+      </w:pPr>
+    </w:p>
+    <w:p>
+      <w:pPr>
+        <w:jc w:val="center"/>
+        <w:rPr>
+          <w:lang w:val="bs-Cyrl-BA"/>
+        </w:rPr>
+      </w:pPr>
+      <w:r>
+        <w:rPr>
+          <w:noProof/>
+        </w:rPr>
+        <w:drawing>
+          <wp:inline distT="0" distB="0" distL="0" distR="0" wp14:anchorId="70423575" wp14:editId="5854B251">
+            <wp:extent cx="3859618" cy="3474322"/>
+            <wp:effectExtent l="0" t="0" r="7620" b="0"/>
+            <wp:docPr id="1" name="Picture 1"/>
+            <wp:cNvGraphicFramePr>
+              <a:graphicFrameLocks xmlns:a="http://schemas.openxmlformats.org/drawingml/2006/main" noChangeAspect="1"/>
+            </wp:cNvGraphicFramePr>
+            <a:graphic xmlns:a="http://schemas.openxmlformats.org/drawingml/2006/main">
+              <a:graphicData uri="http://schemas.openxmlformats.org/drawingml/2006/picture">
+                <pic:pic xmlns:pic="http://schemas.openxmlformats.org/drawingml/2006/picture">
+                  <pic:nvPicPr>
+                    <pic:cNvPr id="0" name="Picture 1"/>
+                    <pic:cNvPicPr>
+                      <a:picLocks noChangeAspect="1" noChangeArrowheads="1"/>
+                    </pic:cNvPicPr>
+                  </pic:nvPicPr>
+                  <pic:blipFill>
+                    <a:blip r:embed="rId15">
+                      <a:extLst>
+                        <a:ext uri="{28A0092B-C50C-407E-A947-70E740481C1C}">
+                          <a14:useLocalDpi xmlns:a14="http://schemas.microsoft.com/office/drawing/2010/main" val="0"/>
+                        </a:ext>
+                      </a:extLst>
+                    </a:blip>
+                    <a:srcRect/>
+                    <a:stretch>
+                      <a:fillRect/>
+                    </a:stretch>
+                  </pic:blipFill>
+                  <pic:spPr bwMode="auto">
+                    <a:xfrm>
+                      <a:off x="0" y="0"/>
+                      <a:ext cx="3881440" cy="3493965"/>
+                    </a:xfrm>
+                    <a:prstGeom prst="rect">
+                      <a:avLst/>
+                    </a:prstGeom>
+                    <a:noFill/>
+                    <a:ln>
+                      <a:noFill/>
+                    </a:ln>
+                  </pic:spPr>
+                </pic:pic>
+              </a:graphicData>
+            </a:graphic>
+          </wp:inline>
+        </w:drawing>
+      </w:r>
+    </w:p>
+    <w:p>
+      <w:pPr>
+        <w:jc w:val="center"/>
+        <w:rPr>
+          <w:i/>
+          <w:sz w:val="22"/>
+          <w:lang w:val="bs-Cyrl-BA"/>
+        </w:rPr>
+      </w:pPr>
+      <w:r>
+        <w:rPr>
+          <w:i/>
+          <w:sz w:val="22"/>
+          <w:lang w:val="bs-Cyrl-BA"/>
+        </w:rPr>
+        <w:t>Слика 2.1.1.1 Илустрација архитектуре трансформера</w:t>
+      </w:r>
+      <w:r>
+        <w:rPr>
+          <w:i/>
+          <w:sz w:val="22"/>
+          <w:lang w:val="bs-Cyrl-BA"/>
+        </w:rPr>
+        <w:t>, лева сдео представља енкодер, док је десна декодер</w:t>
+      </w:r>
+    </w:p>
+    <w:p>
+      <w:pPr>
+        <w:rPr>
+          <w:lang w:val="bs-Cyrl-BA"/>
+        </w:rPr>
+      </w:pPr>
+    </w:p>
+    <w:p>
+      <w:pPr>
+        <w:pStyle w:val="Heading3"/>
+      </w:pPr>
+      <w:r>
+        <w:rPr>
+          <w:lang w:val="bs-Cyrl-BA"/>
+        </w:rPr>
+        <w:t>Преглед савремених модела (</w:t>
+      </w:r>
+      <w:r>
+        <w:t>GPT-4, Claude, Mistral)</w:t>
+      </w:r>
+    </w:p>
+    <w:p>
+      <w:pPr>
+        <w:rPr>
+          <w:lang w:val="bs-Cyrl-BA"/>
+        </w:rPr>
+      </w:pPr>
+      <w:r>
+        <w:rPr>
+          <w:lang w:val="bs-Cyrl-BA"/>
+        </w:rPr>
+        <w:t>На основу трансформаторске архитектуре развијена је нова генерација великих језичких модела, који су већ утренирани на огромним количинама података и способни да генеришу разумљив текст, одговарајући на питања, превод и писање кода.</w:t>
+      </w:r>
+    </w:p>
+    <w:p>
+      <w:pPr>
+        <w:rPr>
+          <w:lang w:val="bs-Cyrl-BA"/>
+        </w:rPr>
+      </w:pPr>
+      <w:r>
+        <w:rPr>
+          <w:rStyle w:val="Strong"/>
+        </w:rPr>
+        <w:t>GPT-4</w:t>
+      </w:r>
+      <w:r>
+        <w:t xml:space="preserve"> је модел компаније OpenAI, објављен 2023. године.</w:t>
+      </w:r>
+      <w:r>
+        <w:t xml:space="preserve"> </w:t>
+      </w:r>
+      <w:r>
+        <w:t>Тренiran је на вишејезичном корпусу и представља један од најмоћнијих јавно доступних модела. Приступ је омогућен путем API-ја, а карактерише га висок ниво разумевања контекста и способност дугих разговора</w:t>
+      </w:r>
+    </w:p>
+    <w:p>
+      <w:pPr>
+        <w:rPr>
+          <w:lang w:val="bs-Cyrl-BA"/>
+        </w:rPr>
+      </w:pPr>
+      <w:r>
+        <w:rPr>
+          <w:b/>
+          <w:lang w:val="bs-Cyrl-BA"/>
+        </w:rPr>
+        <w:t>Claude Sonnet</w:t>
+      </w:r>
+      <w:r>
+        <w:rPr>
+          <w:lang w:val="bs-Cyrl-BA"/>
+        </w:rPr>
+        <w:t xml:space="preserve"> је модел компаније Anthropic, развијен са нагласком на безбедност и поузданост. </w:t>
+      </w:r>
+      <w:r>
+        <w:rPr>
+          <w:lang w:val="bs-Cyrl-BA"/>
+        </w:rPr>
+        <w:t>П</w:t>
+      </w:r>
+      <w:r>
+        <w:rPr>
+          <w:lang w:val="bs-Cyrl-BA"/>
+        </w:rPr>
+        <w:t>ружа врхунске перформансе у кодирању, за агенте и професионални рад у великим размерама. Може да компресује вишедневне пројекте кодирања у сате и да испоручи решења спремна за производњу</w:t>
+      </w:r>
+      <w:r>
+        <w:rPr>
+          <w:lang w:val="bs-Cyrl-BA"/>
+        </w:rPr>
+        <w:t xml:space="preserve">. </w:t>
+      </w:r>
+      <w:r>
+        <w:rPr>
+          <w:lang w:val="bs-Cyrl-BA"/>
+        </w:rPr>
+        <w:t xml:space="preserve">Због велике безбедности </w:t>
+      </w:r>
+      <w:r>
+        <w:rPr>
+          <w:lang w:val="bs-Cyrl-BA"/>
+        </w:rPr>
+        <w:t>посеб</w:t>
+      </w:r>
+      <w:r>
+        <w:rPr>
+          <w:lang w:val="bs-Cyrl-BA"/>
+        </w:rPr>
+        <w:t>ан акценат се даје</w:t>
+      </w:r>
+      <w:r>
+        <w:rPr>
+          <w:lang w:val="bs-Cyrl-BA"/>
+        </w:rPr>
+        <w:t xml:space="preserve"> за евалуацију халуцинација.</w:t>
+      </w:r>
+    </w:p>
+    <w:p>
+      <w:pPr>
+        <w:rPr>
+          <w:lang w:val="bs-Cyrl-BA"/>
+        </w:rPr>
+      </w:pPr>
+      <w:r>
+        <w:rPr>
+          <w:b/>
+          <w:lang w:val="bs-Cyrl-BA"/>
+        </w:rPr>
+        <w:t>Mistral Small</w:t>
+      </w:r>
+      <w:r>
+        <w:rPr>
+          <w:lang w:val="bs-Cyrl-BA"/>
+        </w:rPr>
+        <w:t xml:space="preserve"> је модел француске компаније Mistral AI.</w:t>
+      </w:r>
+      <w:r>
+        <w:rPr>
+          <w:lang w:val="bs-Cyrl-BA"/>
+        </w:rPr>
+        <w:t xml:space="preserve"> Он</w:t>
+      </w:r>
+      <w:r>
+        <w:rPr>
+          <w:lang w:val="bs-Cyrl-BA"/>
+        </w:rPr>
+        <w:t xml:space="preserve"> </w:t>
+      </w:r>
+      <w:r>
+        <w:rPr>
+          <w:lang w:val="bs-Cyrl-BA"/>
+        </w:rPr>
+        <w:t>је хибридни модел оптимизован за општ</w:t>
+      </w:r>
+      <w:r>
+        <w:rPr>
+          <w:lang w:val="bs-Cyrl-BA"/>
+        </w:rPr>
+        <w:t>е</w:t>
+      </w:r>
+      <w:r>
+        <w:rPr>
+          <w:lang w:val="bs-Cyrl-BA"/>
+        </w:rPr>
+        <w:t xml:space="preserve"> ћаскање, кодирање, агентске задатке и сложено резоновање. </w:t>
+      </w:r>
+      <w:r>
+        <w:rPr>
+          <w:lang w:val="bs-Cyrl-BA"/>
+        </w:rPr>
+        <w:lastRenderedPageBreak/>
+        <w:t>Његова архитектура подржава и текстуалне и сликовне уносе, што га чини свестраним за широк спектар примена</w:t>
+      </w:r>
+      <w:r>
+        <w:rPr>
+          <w:lang w:val="bs-Cyrl-BA"/>
+        </w:rPr>
+        <w:t xml:space="preserve"> са ограниченим буџетом</w:t>
+      </w:r>
+      <w:r>
+        <w:rPr>
+          <w:lang w:val="bs-Cyrl-BA"/>
+        </w:rPr>
+        <w:t>. Упркос мањој величини, показује конкурентне резултате на вишејезичним задацима.</w:t>
+      </w:r>
+    </w:p>
+    <w:p>
+      <w:pPr>
+        <w:rPr>
+          <w:lang w:val="bs-Cyrl-BA"/>
+        </w:rPr>
+      </w:pPr>
+    </w:p>
+    <w:p>
+      <w:pPr>
+        <w:pStyle w:val="Heading3"/>
+      </w:pPr>
+      <w:r>
+        <w:t>Језички модели и нискоресурсни језици</w:t>
+      </w:r>
+    </w:p>
+    <w:p>
+      <w:pPr>
+        <w:rPr>
+          <w:lang w:val="bs-Cyrl-BA"/>
+        </w:rPr>
+      </w:pPr>
+    </w:p>
+    <w:p>
+      <w:pPr>
+        <w:rPr>
+          <w:lang w:val="bs-Cyrl-BA"/>
+        </w:rPr>
+      </w:pPr>
+      <w:r>
+        <w:rPr>
+          <w:lang w:val="bs-Cyrl-BA"/>
+        </w:rPr>
+        <w:t xml:space="preserve">Једна од главних особина језичких модела јесте перформансе које зависе од количине и квалитета података у тренинг скупу. </w:t>
+      </w:r>
+      <w:r>
+        <w:rPr>
+          <w:lang w:val="bs-Cyrl-BA"/>
+        </w:rPr>
+        <w:t>Најдоминантнији језик на интернету је енглески језик и самим тим се процењује да је више од 90% података у тренинг скуповима чини енглески језик.</w:t>
+      </w:r>
+    </w:p>
+    <w:p>
+      <w:pPr>
+        <w:rPr>
+          <w:lang w:val="bs-Cyrl-BA"/>
+        </w:rPr>
+      </w:pPr>
+    </w:p>
+    <w:p>
+      <w:pPr>
+        <w:rPr>
+          <w:lang w:val="bs-Cyrl-BA"/>
+        </w:rPr>
+      </w:pPr>
+      <w:r>
+        <w:rPr>
+          <w:lang w:val="bs-Cyrl-BA"/>
+        </w:rPr>
+        <w:t>Српски језик спада у категорију нискоресурсних језика, јер је несразмерно мања количина текстова у односу на енглески језик. Последице тога јесте да модели могу да показују мању тачност на питања специфичним за српску историју, културу и књижевност, такође су сконији да халуцинирају на српском него на енглеском.</w:t>
+      </w:r>
+    </w:p>
+    <w:p>
+      <w:pPr>
+        <w:ind w:left="682" w:firstLine="23"/>
+        <w:rPr>
+          <w:lang w:val="bs-Cyrl-BA"/>
+        </w:rPr>
+      </w:pPr>
+      <w:r>
+        <w:rPr>
+          <w:lang w:val="bs-Cyrl-BA"/>
+        </w:rPr>
+        <w:t xml:space="preserve">Истраживања </w:t>
+      </w:r>
+      <w:r>
+        <w:rPr>
+          <w:lang w:val="bs-Cyrl-BA"/>
+        </w:rPr>
+        <w:t xml:space="preserve">као што су </w:t>
+      </w:r>
+      <w:r>
+        <w:rPr>
+          <w:lang w:val="bs-Cyrl-BA"/>
+        </w:rPr>
+        <w:t xml:space="preserve"> </w:t>
+      </w:r>
+      <w:r>
+        <w:t>XTREME и mT5 бенчмаркова</w:t>
+      </w:r>
+      <w:r>
+        <w:rPr>
+          <w:lang w:val="bs-Cyrl-BA"/>
+        </w:rPr>
+        <w:t xml:space="preserve"> доказала су да постоји значајна разлика у перформансама модела између енглеског и других нискоресурсних језика.</w:t>
+      </w:r>
+    </w:p>
+    <w:p>
+      <w:pPr>
+        <w:ind w:left="682" w:firstLine="23"/>
+        <w:rPr>
+          <w:lang w:val="bs-Cyrl-BA"/>
+        </w:rPr>
+      </w:pPr>
+    </w:p>
+    <w:p>
+      <w:pPr>
+        <w:pStyle w:val="Heading2"/>
+        <w:rPr>
+          <w:lang w:val="bs-Cyrl-BA"/>
+        </w:rPr>
+      </w:pPr>
+      <w:r>
+        <w:rPr>
+          <w:lang w:val="bs-Cyrl-BA"/>
+        </w:rPr>
+        <w:t xml:space="preserve">Евалуација језичких модела </w:t>
+      </w:r>
+    </w:p>
+    <w:p>
+      <w:pPr>
+        <w:spacing w:after="160" w:line="360" w:lineRule="auto"/>
+        <w:ind w:left="708" w:right="0" w:firstLine="0"/>
+        <w:jc w:val="left"/>
+        <w:rPr>
+          <w:lang w:val="bs-Cyrl-BA"/>
+        </w:rPr>
+      </w:pPr>
+      <w:r>
+        <w:rPr>
+          <w:lang w:val="bs-Cyrl-BA"/>
+        </w:rPr>
+        <w:t xml:space="preserve">Евалуација језичких модела подразумева систематско мерење перформанси на одређеном скупу задатака. Евалуација </w:t>
+      </w:r>
+      <w:r>
+        <w:t>LLM-ов</w:t>
+      </w:r>
+      <w:r>
+        <w:rPr>
+          <w:lang w:val="bs-Cyrl-BA"/>
+        </w:rPr>
+        <w:t>а представља одговор модела који може бити делимично тачан</w:t>
+      </w:r>
+      <w:r>
+        <w:rPr>
+          <w:lang w:val="bs-Cyrl-BA"/>
+        </w:rPr>
+        <w:t>, граматички исправан али нетачан</w:t>
+      </w:r>
+      <w:r>
+        <w:rPr>
+          <w:lang w:val="bs-Latn-BA"/>
+        </w:rPr>
+        <w:t xml:space="preserve">, </w:t>
+      </w:r>
+      <w:r>
+        <w:rPr>
+          <w:lang w:val="bs-Cyrl-BA"/>
+        </w:rPr>
+        <w:t>на основу чега се даље врше процене.</w:t>
+      </w:r>
+    </w:p>
+    <w:p>
+      <w:pPr>
+        <w:spacing w:after="160" w:line="360" w:lineRule="auto"/>
+        <w:ind w:left="708" w:right="0" w:firstLine="0"/>
+        <w:jc w:val="left"/>
+        <w:rPr>
+          <w:lang w:val="bs-Cyrl-BA"/>
+        </w:rPr>
+      </w:pPr>
+    </w:p>
+    <w:p>
+      <w:pPr>
+        <w:pStyle w:val="Heading3"/>
+        <w:rPr>
+          <w:lang w:val="bs-Cyrl-BA"/>
+        </w:rPr>
+      </w:pPr>
+      <w:r>
+        <w:t>Димензије евалуације — тачност, халуцинације, конзистентност</w:t>
+      </w:r>
+    </w:p>
+    <w:p>
+      <w:pPr>
+        <w:pStyle w:val="Heading3"/>
+        <w:numPr>
+          <w:ilvl w:val="0"/>
+          <w:numId w:val="0"/>
+        </w:numPr>
+        <w:ind w:left="680"/>
+        <w:rPr>
+          <w:lang w:val="bs-Cyrl-BA"/>
+        </w:rPr>
+      </w:pPr>
+    </w:p>
+    <w:p>
+      <w:pPr>
+        <w:rPr>
+          <w:lang w:val="bs-Cyrl-BA"/>
+        </w:rPr>
+      </w:pPr>
+      <w:r>
+        <w:rPr>
+          <w:lang w:val="bs-Cyrl-BA"/>
+        </w:rPr>
+        <w:t>Евалуације је спроведена кроз три димензије које представљају неке од битних карактеристике језичких модела.</w:t>
+      </w:r>
+    </w:p>
+    <w:p>
+      <w:pPr>
+        <w:rPr>
+          <w:lang w:val="bs-Cyrl-BA"/>
+        </w:rPr>
+      </w:pPr>
+      <w:r>
+        <w:rPr>
+          <w:lang w:val="bs-Cyrl-BA"/>
+        </w:rPr>
+        <w:t xml:space="preserve">Тачност представља колико често модел одговори исправно на питање. </w:t>
+      </w:r>
+      <w:r>
+        <w:rPr>
+          <w:lang w:val="bs-Cyrl-BA"/>
+        </w:rPr>
+        <w:t xml:space="preserve">Проценти тачности </w:t>
+      </w:r>
+      <w:r>
+        <w:rPr>
+          <w:lang w:val="bs-Cyrl-BA"/>
+        </w:rPr>
+        <w:t xml:space="preserve"> се рачун</w:t>
+      </w:r>
+      <w:r>
+        <w:rPr>
+          <w:lang w:val="bs-Cyrl-BA"/>
+        </w:rPr>
+        <w:t>ају</w:t>
+      </w:r>
+      <w:r>
+        <w:rPr>
+          <w:lang w:val="bs-Cyrl-BA"/>
+        </w:rPr>
+        <w:t xml:space="preserve"> као однос тачних одговора и укупног броја питања.</w:t>
+      </w:r>
+    </w:p>
+    <w:p>
+      <w:pPr>
+        <w:rPr>
+          <w:i/>
+        </w:rPr>
+      </w:pPr>
+      <w:r>
+        <w:rPr>
+          <w:i/>
+        </w:rPr>
+        <w:t>Тачност = (број тачних одговора / укупан број питања) × 100%</w:t>
+      </w:r>
+    </w:p>
+    <w:p>
+      <w:pPr>
+        <w:rPr>
+          <w:lang w:val="bs-Cyrl-BA"/>
+        </w:rPr>
+      </w:pPr>
+      <w:r>
+        <w:rPr>
+          <w:lang w:val="bs-Cyrl-BA"/>
+        </w:rPr>
+        <w:t xml:space="preserve">Тачност је најједноставнија димензија јер модел на лагана питања одговара тачно, а са сложенијим питањима може да се манипулише и доведе до грешке. Због тог </w:t>
+      </w:r>
+      <w:r>
+        <w:rPr>
+          <w:lang w:val="bs-Cyrl-BA"/>
+        </w:rPr>
+        <w:lastRenderedPageBreak/>
+        <w:t>разлога питања су подељена по категоријама (географија, историја, култура) и степену тежине питања (1-3).</w:t>
+      </w:r>
+    </w:p>
+    <w:p>
+      <w:pPr>
+        <w:rPr>
+          <w:i/>
+          <w:lang w:val="bs-Cyrl-BA"/>
+        </w:rPr>
+      </w:pPr>
+    </w:p>
+    <w:p>
+      <w:pPr>
+        <w:rPr>
+          <w:i/>
+          <w:lang w:val="bs-Cyrl-BA"/>
+        </w:rPr>
+      </w:pPr>
+      <w:r>
+        <w:rPr>
+          <w:lang w:val="bs-Cyrl-BA"/>
+        </w:rPr>
+        <w:t>Халуцинације обухвата</w:t>
+      </w:r>
+      <w:bookmarkStart w:id="0" w:name="_GoBack"/>
+      <w:bookmarkEnd w:id="0"/>
+      <w:r>
+        <w:rPr>
+          <w:i/>
+          <w:lang w:val="bs-Cyrl-BA"/>
+        </w:rPr>
+        <w:br w:type="page"/>
+      </w:r>
+    </w:p>
+    <w:p>
+      <w:pPr>
+        <w:spacing w:after="160" w:line="278" w:lineRule="auto"/>
+        <w:ind w:left="0" w:right="0" w:firstLine="0"/>
+        <w:jc w:val="left"/>
+        <w:rPr>
+          <w:lang w:val="bs-Cyrl-BA"/>
+        </w:rPr>
+      </w:pPr>
+      <w:r>
+        <w:rPr>
+          <w:lang w:val="bs-Cyrl-BA"/>
+        </w:rPr>
+        <w:lastRenderedPageBreak/>
+        <w:br w:type="page"/>
+      </w:r>
+    </w:p>
+    <w:p>
+      <w:pPr>
+        <w:ind w:left="0" w:firstLine="0"/>
+        <w:rPr>
+          <w:lang w:val="bs-Cyrl-BA"/>
+        </w:rPr>
+      </w:pPr>
+    </w:p>
+    <w:p>
+      <w:pPr>
+        <w:rPr>
+          <w:lang w:val="bs-Cyrl-BA"/>
+        </w:rPr>
+      </w:pPr>
+    </w:p>
+    <w:p>
+      <w:pPr>
+        <w:rPr>
+          <w:lang w:val="bs-Cyrl-BA"/>
+        </w:rPr>
         <w:sectPr>
-          <w:footerReference w:type="even" r:id="rId15"/>
-          <w:footerReference w:type="default" r:id="rId16"/>
-          <w:footerReference w:type="first" r:id="rId17"/>
+          <w:footerReference w:type="even" r:id="rId16"/>
+          <w:footerReference w:type="default" r:id="rId17"/>
+          <w:footerReference w:type="first" r:id="rId18"/>
           <w:pgSz w:w="11909" w:h="16838"/>
           <w:pgMar w:top="568" w:right="958" w:bottom="1432" w:left="1416" w:header="720" w:footer="687" w:gutter="0"/>
           <w:pgNumType w:start="1"/>
@@ -24569,7 +25369,7 @@
               </wp:inline>
             </w:drawing>
           </mc:Choice>
-          <mc:Fallback xmlns:a="http://schemas.openxmlformats.org/drawingml/2006/main">
+          <mc:Fallback xmlns:a="http://schemas.openxmlformats.org/drawingml/2006/main" xmlns:w16sdtfl="http://schemas.microsoft.com/office/word/2024/wordml/sdtformatlock" xmlns:w16sdtdh="http://schemas.microsoft.com/office/word/2020/wordml/sdtdatahash" xmlns:w16du="http://schemas.microsoft.com/office/word/2023/wordml/word16du" xmlns:w16="http://schemas.microsoft.com/office/word/2018/wordml" xmlns:w16cex="http://schemas.microsoft.com/office/word/2018/wordml/cex" xmlns:oel="http://schemas.microsoft.com/office/2019/extlst">
             <w:pict>
               <v:group id="Group 138041" style="width:456.67pt;height:0.719971pt;mso-position-horizontal-relative:char;mso-position-vertical-relative:line" coordsize="57997,91">
                 <v:shape id="Shape 179034" style="position:absolute;width:57997;height:91;left:0;top:0;" coordsize="5799709,9144" path="m0,0l5799709,0l5799709,9144l0,9144l0,0">
@@ -24793,9 +25593,9 @@
       </w:r>
     </w:p>
     <w:sectPr>
-      <w:footerReference w:type="even" r:id="rId18"/>
-      <w:footerReference w:type="default" r:id="rId19"/>
-      <w:footerReference w:type="first" r:id="rId20"/>
+      <w:footerReference w:type="even" r:id="rId19"/>
+      <w:footerReference w:type="default" r:id="rId20"/>
+      <w:footerReference w:type="first" r:id="rId21"/>
       <w:pgSz w:w="11909" w:h="16838"/>
       <w:pgMar w:top="581" w:right="1350" w:bottom="1440" w:left="1416" w:header="720" w:footer="720" w:gutter="0"/>
       <w:cols w:space="720"/>
@@ -24805,7 +25605,7 @@
 </file>
 
 <file path=word/endnotes.xml><?xml version="1.0" encoding="utf-8"?>
-<w:endnotes xmlns:wpc="http://schemas.microsoft.com/office/word/2010/wordprocessingCanvas" xmlns:cx="http://schemas.microsoft.com/office/drawing/2014/chartex" xmlns:cx1="http://schemas.microsoft.com/office/drawing/2015/9/8/chartex" xmlns:cx2="http://schemas.microsoft.com/office/drawing/2015/10/21/chartex" xmlns:cx3="http://schemas.microsoft.com/office/drawing/2016/5/9/chartex" xmlns:cx4="http://schemas.microsoft.com/office/drawing/2016/5/10/chartex" xmlns:cx5="http://schemas.microsoft.com/office/drawing/2016/5/11/chartex" xmlns:cx6="http://schemas.microsoft.com/office/drawing/2016/5/12/chartex" xmlns:cx7="http://schemas.microsoft.com/office/drawing/2016/5/13/chartex" xmlns:cx8="http://schemas.microsoft.com/office/drawing/2016/5/14/chartex" xmlns:mc="http://schemas.openxmlformats.org/markup-compatibility/2006" xmlns:aink="http://schemas.microsoft.com/office/drawing/2016/ink" xmlns:am3d="http://schemas.microsoft.com/office/drawing/2017/model3d" xmlns:o="urn:schemas-microsoft-com:office:office" xmlns:oel="http://schemas.microsoft.com/office/2019/extlst" xmlns:r="http://schemas.openxmlformats.org/officeDocument/2006/relationships" xmlns:m="http://schemas.openxmlformats.org/officeDocument/2006/math" xmlns:v="urn:schemas-microsoft-com:vml" xmlns:wp14="http://schemas.microsoft.com/office/word/2010/wordprocessingDrawing" xmlns:wp="http://schemas.openxmlformats.org/drawingml/2006/wordprocessingDrawing" xmlns:w10="urn:schemas-microsoft-com:office:word" xmlns:w="http://schemas.openxmlformats.org/wordprocessingml/2006/main" xmlns:w14="http://schemas.microsoft.com/office/word/2010/wordml" xmlns:w15="http://schemas.microsoft.com/office/word/2012/wordml" xmlns:w16cex="http://schemas.microsoft.com/office/word/2018/wordml/cex" xmlns:w16cid="http://schemas.microsoft.com/office/word/2016/wordml/cid" xmlns:w16="http://schemas.microsoft.com/office/word/2018/wordml" xmlns:w16du="http://schemas.microsoft.com/office/word/2023/wordml/word16du" xmlns:w16sdtdh="http://schemas.microsoft.com/office/word/2020/wordml/sdtdatahash" xmlns:w16sdtfl="http://schemas.microsoft.com/office/word/2024/wordml/sdtformatlock" xmlns:w16se="http://schemas.microsoft.com/office/word/2015/wordml/symex" xmlns:wpg="http://schemas.microsoft.com/office/word/2010/wordprocessingGroup" xmlns:wpi="http://schemas.microsoft.com/office/word/2010/wordprocessingInk" xmlns:wne="http://schemas.microsoft.com/office/word/2006/wordml" xmlns:wps="http://schemas.microsoft.com/office/word/2010/wordprocessingShape" mc:Ignorable="w14 w15 w16se w16cid w16 w16cex w16sdtdh w16sdtfl w16du wp14">
+<w:endnotes xmlns:wpc="http://schemas.microsoft.com/office/word/2010/wordprocessingCanvas" xmlns:cx="http://schemas.microsoft.com/office/drawing/2014/chartex" xmlns:cx1="http://schemas.microsoft.com/office/drawing/2015/9/8/chartex" xmlns:cx2="http://schemas.microsoft.com/office/drawing/2015/10/21/chartex" xmlns:cx3="http://schemas.microsoft.com/office/drawing/2016/5/9/chartex" xmlns:cx4="http://schemas.microsoft.com/office/drawing/2016/5/10/chartex" xmlns:cx5="http://schemas.microsoft.com/office/drawing/2016/5/11/chartex" xmlns:cx6="http://schemas.microsoft.com/office/drawing/2016/5/12/chartex" xmlns:cx7="http://schemas.microsoft.com/office/drawing/2016/5/13/chartex" xmlns:cx8="http://schemas.microsoft.com/office/drawing/2016/5/14/chartex" xmlns:mc="http://schemas.openxmlformats.org/markup-compatibility/2006" xmlns:aink="http://schemas.microsoft.com/office/drawing/2016/ink" xmlns:am3d="http://schemas.microsoft.com/office/drawing/2017/model3d" xmlns:o="urn:schemas-microsoft-com:office:office" xmlns:r="http://schemas.openxmlformats.org/officeDocument/2006/relationships" xmlns:m="http://schemas.openxmlformats.org/officeDocument/2006/math" xmlns:v="urn:schemas-microsoft-com:vml" xmlns:wp14="http://schemas.microsoft.com/office/word/2010/wordprocessingDrawing" xmlns:wp="http://schemas.openxmlformats.org/drawingml/2006/wordprocessingDrawing" xmlns:w10="urn:schemas-microsoft-com:office:word" xmlns:w="http://schemas.openxmlformats.org/wordprocessingml/2006/main" xmlns:w14="http://schemas.microsoft.com/office/word/2010/wordml" xmlns:w15="http://schemas.microsoft.com/office/word/2012/wordml" xmlns:w16cid="http://schemas.microsoft.com/office/word/2016/wordml/cid" xmlns:w16se="http://schemas.microsoft.com/office/word/2015/wordml/symex" xmlns:wpg="http://schemas.microsoft.com/office/word/2010/wordprocessingGroup" xmlns:wpi="http://schemas.microsoft.com/office/word/2010/wordprocessingInk" xmlns:wne="http://schemas.microsoft.com/office/word/2006/wordml" xmlns:wps="http://schemas.microsoft.com/office/word/2010/wordprocessingShape" mc:Ignorable="w14 w15 w16se w16cid wp14">
   <w:endnote w:type="separator" w:id="-1">
     <w:p>
       <w:pPr>
@@ -24830,7 +25630,7 @@
 </file>
 
 <file path=word/footer1.xml><?xml version="1.0" encoding="utf-8"?>
-<w:ftr xmlns:wpc="http://schemas.microsoft.com/office/word/2010/wordprocessingCanvas" xmlns:cx="http://schemas.microsoft.com/office/drawing/2014/chartex" xmlns:cx1="http://schemas.microsoft.com/office/drawing/2015/9/8/chartex" xmlns:cx2="http://schemas.microsoft.com/office/drawing/2015/10/21/chartex" xmlns:cx3="http://schemas.microsoft.com/office/drawing/2016/5/9/chartex" xmlns:cx4="http://schemas.microsoft.com/office/drawing/2016/5/10/chartex" xmlns:cx5="http://schemas.microsoft.com/office/drawing/2016/5/11/chartex" xmlns:cx6="http://schemas.microsoft.com/office/drawing/2016/5/12/chartex" xmlns:cx7="http://schemas.microsoft.com/office/drawing/2016/5/13/chartex" xmlns:cx8="http://schemas.microsoft.com/office/drawing/2016/5/14/chartex" xmlns:mc="http://schemas.openxmlformats.org/markup-compatibility/2006" xmlns:aink="http://schemas.microsoft.com/office/drawing/2016/ink" xmlns:am3d="http://schemas.microsoft.com/office/drawing/2017/model3d" xmlns:o="urn:schemas-microsoft-com:office:office" xmlns:oel="http://schemas.microsoft.com/office/2019/extlst" xmlns:r="http://schemas.openxmlformats.org/officeDocument/2006/relationships" xmlns:m="http://schemas.openxmlformats.org/officeDocument/2006/math" xmlns:v="urn:schemas-microsoft-com:vml" xmlns:wp14="http://schemas.microsoft.com/office/word/2010/wordprocessingDrawing" xmlns:wp="http://schemas.openxmlformats.org/drawingml/2006/wordprocessingDrawing" xmlns:w10="urn:schemas-microsoft-com:office:word" xmlns:w="http://schemas.openxmlformats.org/wordprocessingml/2006/main" xmlns:w14="http://schemas.microsoft.com/office/word/2010/wordml" xmlns:w15="http://schemas.microsoft.com/office/word/2012/wordml" xmlns:w16cex="http://schemas.microsoft.com/office/word/2018/wordml/cex" xmlns:w16cid="http://schemas.microsoft.com/office/word/2016/wordml/cid" xmlns:w16="http://schemas.microsoft.com/office/word/2018/wordml" xmlns:w16du="http://schemas.microsoft.com/office/word/2023/wordml/word16du" xmlns:w16sdtdh="http://schemas.microsoft.com/office/word/2020/wordml/sdtdatahash" xmlns:w16sdtfl="http://schemas.microsoft.com/office/word/2024/wordml/sdtformatlock" xmlns:w16se="http://schemas.microsoft.com/office/word/2015/wordml/symex" xmlns:wpg="http://schemas.microsoft.com/office/word/2010/wordprocessingGroup" xmlns:wpi="http://schemas.microsoft.com/office/word/2010/wordprocessingInk" xmlns:wne="http://schemas.microsoft.com/office/word/2006/wordml" xmlns:wps="http://schemas.microsoft.com/office/word/2010/wordprocessingShape" mc:Ignorable="w14 w15 w16se w16cid w16 w16cex w16sdtdh w16sdtfl w16du wp14">
+<w:ftr xmlns:wpc="http://schemas.microsoft.com/office/word/2010/wordprocessingCanvas" xmlns:cx="http://schemas.microsoft.com/office/drawing/2014/chartex" xmlns:cx1="http://schemas.microsoft.com/office/drawing/2015/9/8/chartex" xmlns:cx2="http://schemas.microsoft.com/office/drawing/2015/10/21/chartex" xmlns:cx3="http://schemas.microsoft.com/office/drawing/2016/5/9/chartex" xmlns:cx4="http://schemas.microsoft.com/office/drawing/2016/5/10/chartex" xmlns:cx5="http://schemas.microsoft.com/office/drawing/2016/5/11/chartex" xmlns:cx6="http://schemas.microsoft.com/office/drawing/2016/5/12/chartex" xmlns:cx7="http://schemas.microsoft.com/office/drawing/2016/5/13/chartex" xmlns:cx8="http://schemas.microsoft.com/office/drawing/2016/5/14/chartex" xmlns:mc="http://schemas.openxmlformats.org/markup-compatibility/2006" xmlns:aink="http://schemas.microsoft.com/office/drawing/2016/ink" xmlns:am3d="http://schemas.microsoft.com/office/drawing/2017/model3d" xmlns:o="urn:schemas-microsoft-com:office:office" xmlns:r="http://schemas.openxmlformats.org/officeDocument/2006/relationships" xmlns:m="http://schemas.openxmlformats.org/officeDocument/2006/math" xmlns:v="urn:schemas-microsoft-com:vml" xmlns:wp14="http://schemas.microsoft.com/office/word/2010/wordprocessingDrawing" xmlns:wp="http://schemas.openxmlformats.org/drawingml/2006/wordprocessingDrawing" xmlns:w10="urn:schemas-microsoft-com:office:word" xmlns:w="http://schemas.openxmlformats.org/wordprocessingml/2006/main" xmlns:w14="http://schemas.microsoft.com/office/word/2010/wordml" xmlns:w15="http://schemas.microsoft.com/office/word/2012/wordml" xmlns:w16cid="http://schemas.microsoft.com/office/word/2016/wordml/cid" xmlns:w16se="http://schemas.microsoft.com/office/word/2015/wordml/symex" xmlns:wpg="http://schemas.microsoft.com/office/word/2010/wordprocessingGroup" xmlns:wpi="http://schemas.microsoft.com/office/word/2010/wordprocessingInk" xmlns:wne="http://schemas.microsoft.com/office/word/2006/wordml" xmlns:wps="http://schemas.microsoft.com/office/word/2010/wordprocessingShape" mc:Ignorable="w14 w15 w16se w16cid wp14">
   <w:p>
     <w:pPr>
       <w:spacing w:after="160" w:line="259" w:lineRule="auto"/>
@@ -24842,7 +25642,7 @@
 </file>
 
 <file path=word/footer2.xml><?xml version="1.0" encoding="utf-8"?>
-<w:ftr xmlns:wpc="http://schemas.microsoft.com/office/word/2010/wordprocessingCanvas" xmlns:cx="http://schemas.microsoft.com/office/drawing/2014/chartex" xmlns:cx1="http://schemas.microsoft.com/office/drawing/2015/9/8/chartex" xmlns:cx2="http://schemas.microsoft.com/office/drawing/2015/10/21/chartex" xmlns:cx3="http://schemas.microsoft.com/office/drawing/2016/5/9/chartex" xmlns:cx4="http://schemas.microsoft.com/office/drawing/2016/5/10/chartex" xmlns:cx5="http://schemas.microsoft.com/office/drawing/2016/5/11/chartex" xmlns:cx6="http://schemas.microsoft.com/office/drawing/2016/5/12/chartex" xmlns:cx7="http://schemas.microsoft.com/office/drawing/2016/5/13/chartex" xmlns:cx8="http://schemas.microsoft.com/office/drawing/2016/5/14/chartex" xmlns:mc="http://schemas.openxmlformats.org/markup-compatibility/2006" xmlns:aink="http://schemas.microsoft.com/office/drawing/2016/ink" xmlns:am3d="http://schemas.microsoft.com/office/drawing/2017/model3d" xmlns:o="urn:schemas-microsoft-com:office:office" xmlns:oel="http://schemas.microsoft.com/office/2019/extlst" xmlns:r="http://schemas.openxmlformats.org/officeDocument/2006/relationships" xmlns:m="http://schemas.openxmlformats.org/officeDocument/2006/math" xmlns:v="urn:schemas-microsoft-com:vml" xmlns:wp14="http://schemas.microsoft.com/office/word/2010/wordprocessingDrawing" xmlns:wp="http://schemas.openxmlformats.org/drawingml/2006/wordprocessingDrawing" xmlns:w10="urn:schemas-microsoft-com:office:word" xmlns:w="http://schemas.openxmlformats.org/wordprocessingml/2006/main" xmlns:w14="http://schemas.microsoft.com/office/word/2010/wordml" xmlns:w15="http://schemas.microsoft.com/office/word/2012/wordml" xmlns:w16cex="http://schemas.microsoft.com/office/word/2018/wordml/cex" xmlns:w16cid="http://schemas.microsoft.com/office/word/2016/wordml/cid" xmlns:w16="http://schemas.microsoft.com/office/word/2018/wordml" xmlns:w16du="http://schemas.microsoft.com/office/word/2023/wordml/word16du" xmlns:w16sdtdh="http://schemas.microsoft.com/office/word/2020/wordml/sdtdatahash" xmlns:w16sdtfl="http://schemas.microsoft.com/office/word/2024/wordml/sdtformatlock" xmlns:w16se="http://schemas.microsoft.com/office/word/2015/wordml/symex" xmlns:wpg="http://schemas.microsoft.com/office/word/2010/wordprocessingGroup" xmlns:wpi="http://schemas.microsoft.com/office/word/2010/wordprocessingInk" xmlns:wne="http://schemas.microsoft.com/office/word/2006/wordml" xmlns:wps="http://schemas.microsoft.com/office/word/2010/wordprocessingShape" mc:Ignorable="w14 w15 w16se w16cid w16 w16cex w16sdtdh w16sdtfl w16du wp14">
+<w:ftr xmlns:wpc="http://schemas.microsoft.com/office/word/2010/wordprocessingCanvas" xmlns:cx="http://schemas.microsoft.com/office/drawing/2014/chartex" xmlns:cx1="http://schemas.microsoft.com/office/drawing/2015/9/8/chartex" xmlns:cx2="http://schemas.microsoft.com/office/drawing/2015/10/21/chartex" xmlns:cx3="http://schemas.microsoft.com/office/drawing/2016/5/9/chartex" xmlns:cx4="http://schemas.microsoft.com/office/drawing/2016/5/10/chartex" xmlns:cx5="http://schemas.microsoft.com/office/drawing/2016/5/11/chartex" xmlns:cx6="http://schemas.microsoft.com/office/drawing/2016/5/12/chartex" xmlns:cx7="http://schemas.microsoft.com/office/drawing/2016/5/13/chartex" xmlns:cx8="http://schemas.microsoft.com/office/drawing/2016/5/14/chartex" xmlns:mc="http://schemas.openxmlformats.org/markup-compatibility/2006" xmlns:aink="http://schemas.microsoft.com/office/drawing/2016/ink" xmlns:am3d="http://schemas.microsoft.com/office/drawing/2017/model3d" xmlns:o="urn:schemas-microsoft-com:office:office" xmlns:r="http://schemas.openxmlformats.org/officeDocument/2006/relationships" xmlns:m="http://schemas.openxmlformats.org/officeDocument/2006/math" xmlns:v="urn:schemas-microsoft-com:vml" xmlns:wp14="http://schemas.microsoft.com/office/word/2010/wordprocessingDrawing" xmlns:wp="http://schemas.openxmlformats.org/drawingml/2006/wordprocessingDrawing" xmlns:w10="urn:schemas-microsoft-com:office:word" xmlns:w="http://schemas.openxmlformats.org/wordprocessingml/2006/main" xmlns:w14="http://schemas.microsoft.com/office/word/2010/wordml" xmlns:w15="http://schemas.microsoft.com/office/word/2012/wordml" xmlns:w16cid="http://schemas.microsoft.com/office/word/2016/wordml/cid" xmlns:w16se="http://schemas.microsoft.com/office/word/2015/wordml/symex" xmlns:wpg="http://schemas.microsoft.com/office/word/2010/wordprocessingGroup" xmlns:wpi="http://schemas.microsoft.com/office/word/2010/wordprocessingInk" xmlns:wne="http://schemas.microsoft.com/office/word/2006/wordml" xmlns:wps="http://schemas.microsoft.com/office/word/2010/wordprocessingShape" mc:Ignorable="w14 w15 w16se w16cid wp14">
   <w:p>
     <w:pPr>
       <w:spacing w:after="160" w:line="259" w:lineRule="auto"/>
@@ -24854,7 +25654,7 @@
 </file>
 
 <file path=word/footer3.xml><?xml version="1.0" encoding="utf-8"?>
-<w:ftr xmlns:wpc="http://schemas.microsoft.com/office/word/2010/wordprocessingCanvas" xmlns:cx="http://schemas.microsoft.com/office/drawing/2014/chartex" xmlns:cx1="http://schemas.microsoft.com/office/drawing/2015/9/8/chartex" xmlns:cx2="http://schemas.microsoft.com/office/drawing/2015/10/21/chartex" xmlns:cx3="http://schemas.microsoft.com/office/drawing/2016/5/9/chartex" xmlns:cx4="http://schemas.microsoft.com/office/drawing/2016/5/10/chartex" xmlns:cx5="http://schemas.microsoft.com/office/drawing/2016/5/11/chartex" xmlns:cx6="http://schemas.microsoft.com/office/drawing/2016/5/12/chartex" xmlns:cx7="http://schemas.microsoft.com/office/drawing/2016/5/13/chartex" xmlns:cx8="http://schemas.microsoft.com/office/drawing/2016/5/14/chartex" xmlns:mc="http://schemas.openxmlformats.org/markup-compatibility/2006" xmlns:aink="http://schemas.microsoft.com/office/drawing/2016/ink" xmlns:am3d="http://schemas.microsoft.com/office/drawing/2017/model3d" xmlns:o="urn:schemas-microsoft-com:office:office" xmlns:oel="http://schemas.microsoft.com/office/2019/extlst" xmlns:r="http://schemas.openxmlformats.org/officeDocument/2006/relationships" xmlns:m="http://schemas.openxmlformats.org/officeDocument/2006/math" xmlns:v="urn:schemas-microsoft-com:vml" xmlns:wp14="http://schemas.microsoft.com/office/word/2010/wordprocessingDrawing" xmlns:wp="http://schemas.openxmlformats.org/drawingml/2006/wordprocessingDrawing" xmlns:w10="urn:schemas-microsoft-com:office:word" xmlns:w="http://schemas.openxmlformats.org/wordprocessingml/2006/main" xmlns:w14="http://schemas.microsoft.com/office/word/2010/wordml" xmlns:w15="http://schemas.microsoft.com/office/word/2012/wordml" xmlns:w16cex="http://schemas.microsoft.com/office/word/2018/wordml/cex" xmlns:w16cid="http://schemas.microsoft.com/office/word/2016/wordml/cid" xmlns:w16="http://schemas.microsoft.com/office/word/2018/wordml" xmlns:w16du="http://schemas.microsoft.com/office/word/2023/wordml/word16du" xmlns:w16sdtdh="http://schemas.microsoft.com/office/word/2020/wordml/sdtdatahash" xmlns:w16sdtfl="http://schemas.microsoft.com/office/word/2024/wordml/sdtformatlock" xmlns:w16se="http://schemas.microsoft.com/office/word/2015/wordml/symex" xmlns:wpg="http://schemas.microsoft.com/office/word/2010/wordprocessingGroup" xmlns:wpi="http://schemas.microsoft.com/office/word/2010/wordprocessingInk" xmlns:wne="http://schemas.microsoft.com/office/word/2006/wordml" xmlns:wps="http://schemas.microsoft.com/office/word/2010/wordprocessingShape" mc:Ignorable="w14 w15 w16se w16cid w16 w16cex w16sdtdh w16sdtfl w16du wp14">
+<w:ftr xmlns:wpc="http://schemas.microsoft.com/office/word/2010/wordprocessingCanvas" xmlns:cx="http://schemas.microsoft.com/office/drawing/2014/chartex" xmlns:cx1="http://schemas.microsoft.com/office/drawing/2015/9/8/chartex" xmlns:cx2="http://schemas.microsoft.com/office/drawing/2015/10/21/chartex" xmlns:cx3="http://schemas.microsoft.com/office/drawing/2016/5/9/chartex" xmlns:cx4="http://schemas.microsoft.com/office/drawing/2016/5/10/chartex" xmlns:cx5="http://schemas.microsoft.com/office/drawing/2016/5/11/chartex" xmlns:cx6="http://schemas.microsoft.com/office/drawing/2016/5/12/chartex" xmlns:cx7="http://schemas.microsoft.com/office/drawing/2016/5/13/chartex" xmlns:cx8="http://schemas.microsoft.com/office/drawing/2016/5/14/chartex" xmlns:mc="http://schemas.openxmlformats.org/markup-compatibility/2006" xmlns:aink="http://schemas.microsoft.com/office/drawing/2016/ink" xmlns:am3d="http://schemas.microsoft.com/office/drawing/2017/model3d" xmlns:o="urn:schemas-microsoft-com:office:office" xmlns:r="http://schemas.openxmlformats.org/officeDocument/2006/relationships" xmlns:m="http://schemas.openxmlformats.org/officeDocument/2006/math" xmlns:v="urn:schemas-microsoft-com:vml" xmlns:wp14="http://schemas.microsoft.com/office/word/2010/wordprocessingDrawing" xmlns:wp="http://schemas.openxmlformats.org/drawingml/2006/wordprocessingDrawing" xmlns:w10="urn:schemas-microsoft-com:office:word" xmlns:w="http://schemas.openxmlformats.org/wordprocessingml/2006/main" xmlns:w14="http://schemas.microsoft.com/office/word/2010/wordml" xmlns:w15="http://schemas.microsoft.com/office/word/2012/wordml" xmlns:w16cid="http://schemas.microsoft.com/office/word/2016/wordml/cid" xmlns:w16se="http://schemas.microsoft.com/office/word/2015/wordml/symex" xmlns:wpg="http://schemas.microsoft.com/office/word/2010/wordprocessingGroup" xmlns:wpi="http://schemas.microsoft.com/office/word/2010/wordprocessingInk" xmlns:wne="http://schemas.microsoft.com/office/word/2006/wordml" xmlns:wps="http://schemas.microsoft.com/office/word/2010/wordprocessingShape" mc:Ignorable="w14 w15 w16se w16cid wp14">
   <w:p>
     <w:pPr>
       <w:spacing w:after="160" w:line="259" w:lineRule="auto"/>
@@ -24866,7 +25666,7 @@
 </file>
 
 <file path=word/footer4.xml><?xml version="1.0" encoding="utf-8"?>
-<w:ftr xmlns:wpc="http://schemas.microsoft.com/office/word/2010/wordprocessingCanvas" xmlns:cx="http://schemas.microsoft.com/office/drawing/2014/chartex" xmlns:cx1="http://schemas.microsoft.com/office/drawing/2015/9/8/chartex" xmlns:cx2="http://schemas.microsoft.com/office/drawing/2015/10/21/chartex" xmlns:cx3="http://schemas.microsoft.com/office/drawing/2016/5/9/chartex" xmlns:cx4="http://schemas.microsoft.com/office/drawing/2016/5/10/chartex" xmlns:cx5="http://schemas.microsoft.com/office/drawing/2016/5/11/chartex" xmlns:cx6="http://schemas.microsoft.com/office/drawing/2016/5/12/chartex" xmlns:cx7="http://schemas.microsoft.com/office/drawing/2016/5/13/chartex" xmlns:cx8="http://schemas.microsoft.com/office/drawing/2016/5/14/chartex" xmlns:mc="http://schemas.openxmlformats.org/markup-compatibility/2006" xmlns:aink="http://schemas.microsoft.com/office/drawing/2016/ink" xmlns:am3d="http://schemas.microsoft.com/office/drawing/2017/model3d" xmlns:o="urn:schemas-microsoft-com:office:office" xmlns:oel="http://schemas.microsoft.com/office/2019/extlst" xmlns:r="http://schemas.openxmlformats.org/officeDocument/2006/relationships" xmlns:m="http://schemas.openxmlformats.org/officeDocument/2006/math" xmlns:v="urn:schemas-microsoft-com:vml" xmlns:wp14="http://schemas.microsoft.com/office/word/2010/wordprocessingDrawing" xmlns:wp="http://schemas.openxmlformats.org/drawingml/2006/wordprocessingDrawing" xmlns:w10="urn:schemas-microsoft-com:office:word" xmlns:w="http://schemas.openxmlformats.org/wordprocessingml/2006/main" xmlns:w14="http://schemas.microsoft.com/office/word/2010/wordml" xmlns:w15="http://schemas.microsoft.com/office/word/2012/wordml" xmlns:w16cex="http://schemas.microsoft.com/office/word/2018/wordml/cex" xmlns:w16cid="http://schemas.microsoft.com/office/word/2016/wordml/cid" xmlns:w16="http://schemas.microsoft.com/office/word/2018/wordml" xmlns:w16du="http://schemas.microsoft.com/office/word/2023/wordml/word16du" xmlns:w16sdtdh="http://schemas.microsoft.com/office/word/2020/wordml/sdtdatahash" xmlns:w16sdtfl="http://schemas.microsoft.com/office/word/2024/wordml/sdtformatlock" xmlns:w16se="http://schemas.microsoft.com/office/word/2015/wordml/symex" xmlns:wpg="http://schemas.microsoft.com/office/word/2010/wordprocessingGroup" xmlns:wpi="http://schemas.microsoft.com/office/word/2010/wordprocessingInk" xmlns:wne="http://schemas.microsoft.com/office/word/2006/wordml" xmlns:wps="http://schemas.microsoft.com/office/word/2010/wordprocessingShape" mc:Ignorable="w14 w15 w16se w16cid w16 w16cex w16sdtdh w16sdtfl w16du wp14">
+<w:ftr xmlns:wpc="http://schemas.microsoft.com/office/word/2010/wordprocessingCanvas" xmlns:cx="http://schemas.microsoft.com/office/drawing/2014/chartex" xmlns:cx1="http://schemas.microsoft.com/office/drawing/2015/9/8/chartex" xmlns:cx2="http://schemas.microsoft.com/office/drawing/2015/10/21/chartex" xmlns:cx3="http://schemas.microsoft.com/office/drawing/2016/5/9/chartex" xmlns:cx4="http://schemas.microsoft.com/office/drawing/2016/5/10/chartex" xmlns:cx5="http://schemas.microsoft.com/office/drawing/2016/5/11/chartex" xmlns:cx6="http://schemas.microsoft.com/office/drawing/2016/5/12/chartex" xmlns:cx7="http://schemas.microsoft.com/office/drawing/2016/5/13/chartex" xmlns:cx8="http://schemas.microsoft.com/office/drawing/2016/5/14/chartex" xmlns:mc="http://schemas.openxmlformats.org/markup-compatibility/2006" xmlns:aink="http://schemas.microsoft.com/office/drawing/2016/ink" xmlns:am3d="http://schemas.microsoft.com/office/drawing/2017/model3d" xmlns:o="urn:schemas-microsoft-com:office:office" xmlns:r="http://schemas.openxmlformats.org/officeDocument/2006/relationships" xmlns:m="http://schemas.openxmlformats.org/officeDocument/2006/math" xmlns:v="urn:schemas-microsoft-com:vml" xmlns:wp14="http://schemas.microsoft.com/office/word/2010/wordprocessingDrawing" xmlns:wp="http://schemas.openxmlformats.org/drawingml/2006/wordprocessingDrawing" xmlns:w10="urn:schemas-microsoft-com:office:word" xmlns:w="http://schemas.openxmlformats.org/wordprocessingml/2006/main" xmlns:w14="http://schemas.microsoft.com/office/word/2010/wordml" xmlns:w15="http://schemas.microsoft.com/office/word/2012/wordml" xmlns:w16cid="http://schemas.microsoft.com/office/word/2016/wordml/cid" xmlns:w16se="http://schemas.microsoft.com/office/word/2015/wordml/symex" xmlns:wpg="http://schemas.microsoft.com/office/word/2010/wordprocessingGroup" xmlns:wpi="http://schemas.microsoft.com/office/word/2010/wordprocessingInk" xmlns:wne="http://schemas.microsoft.com/office/word/2006/wordml" xmlns:wps="http://schemas.microsoft.com/office/word/2010/wordprocessingShape" mc:Ignorable="w14 w15 w16se w16cid wp14">
   <w:p>
     <w:pPr>
       <w:spacing w:after="99" w:line="259" w:lineRule="auto"/>
@@ -24910,7 +25710,7 @@
 </file>
 
 <file path=word/footer5.xml><?xml version="1.0" encoding="utf-8"?>
-<w:ftr xmlns:wpc="http://schemas.microsoft.com/office/word/2010/wordprocessingCanvas" xmlns:cx="http://schemas.microsoft.com/office/drawing/2014/chartex" xmlns:cx1="http://schemas.microsoft.com/office/drawing/2015/9/8/chartex" xmlns:cx2="http://schemas.microsoft.com/office/drawing/2015/10/21/chartex" xmlns:cx3="http://schemas.microsoft.com/office/drawing/2016/5/9/chartex" xmlns:cx4="http://schemas.microsoft.com/office/drawing/2016/5/10/chartex" xmlns:cx5="http://schemas.microsoft.com/office/drawing/2016/5/11/chartex" xmlns:cx6="http://schemas.microsoft.com/office/drawing/2016/5/12/chartex" xmlns:cx7="http://schemas.microsoft.com/office/drawing/2016/5/13/chartex" xmlns:cx8="http://schemas.microsoft.com/office/drawing/2016/5/14/chartex" xmlns:mc="http://schemas.openxmlformats.org/markup-compatibility/2006" xmlns:aink="http://schemas.microsoft.com/office/drawing/2016/ink" xmlns:am3d="http://schemas.microsoft.com/office/drawing/2017/model3d" xmlns:o="urn:schemas-microsoft-com:office:office" xmlns:oel="http://schemas.microsoft.com/office/2019/extlst" xmlns:r="http://schemas.openxmlformats.org/officeDocument/2006/relationships" xmlns:m="http://schemas.openxmlformats.org/officeDocument/2006/math" xmlns:v="urn:schemas-microsoft-com:vml" xmlns:wp14="http://schemas.microsoft.com/office/word/2010/wordprocessingDrawing" xmlns:wp="http://schemas.openxmlformats.org/drawingml/2006/wordprocessingDrawing" xmlns:w10="urn:schemas-microsoft-com:office:word" xmlns:w="http://schemas.openxmlformats.org/wordprocessingml/2006/main" xmlns:w14="http://schemas.microsoft.com/office/word/2010/wordml" xmlns:w15="http://schemas.microsoft.com/office/word/2012/wordml" xmlns:w16cex="http://schemas.microsoft.com/office/word/2018/wordml/cex" xmlns:w16cid="http://schemas.microsoft.com/office/word/2016/wordml/cid" xmlns:w16="http://schemas.microsoft.com/office/word/2018/wordml" xmlns:w16du="http://schemas.microsoft.com/office/word/2023/wordml/word16du" xmlns:w16sdtdh="http://schemas.microsoft.com/office/word/2020/wordml/sdtdatahash" xmlns:w16sdtfl="http://schemas.microsoft.com/office/word/2024/wordml/sdtformatlock" xmlns:w16se="http://schemas.microsoft.com/office/word/2015/wordml/symex" xmlns:wpg="http://schemas.microsoft.com/office/word/2010/wordprocessingGroup" xmlns:wpi="http://schemas.microsoft.com/office/word/2010/wordprocessingInk" xmlns:wne="http://schemas.microsoft.com/office/word/2006/wordml" xmlns:wps="http://schemas.microsoft.com/office/word/2010/wordprocessingShape" mc:Ignorable="w14 w15 w16se w16cid w16 w16cex w16sdtdh w16sdtfl w16du wp14">
+<w:ftr xmlns:wpc="http://schemas.microsoft.com/office/word/2010/wordprocessingCanvas" xmlns:cx="http://schemas.microsoft.com/office/drawing/2014/chartex" xmlns:cx1="http://schemas.microsoft.com/office/drawing/2015/9/8/chartex" xmlns:cx2="http://schemas.microsoft.com/office/drawing/2015/10/21/chartex" xmlns:cx3="http://schemas.microsoft.com/office/drawing/2016/5/9/chartex" xmlns:cx4="http://schemas.microsoft.com/office/drawing/2016/5/10/chartex" xmlns:cx5="http://schemas.microsoft.com/office/drawing/2016/5/11/chartex" xmlns:cx6="http://schemas.microsoft.com/office/drawing/2016/5/12/chartex" xmlns:cx7="http://schemas.microsoft.com/office/drawing/2016/5/13/chartex" xmlns:cx8="http://schemas.microsoft.com/office/drawing/2016/5/14/chartex" xmlns:mc="http://schemas.openxmlformats.org/markup-compatibility/2006" xmlns:aink="http://schemas.microsoft.com/office/drawing/2016/ink" xmlns:am3d="http://schemas.microsoft.com/office/drawing/2017/model3d" xmlns:o="urn:schemas-microsoft-com:office:office" xmlns:r="http://schemas.openxmlformats.org/officeDocument/2006/relationships" xmlns:m="http://schemas.openxmlformats.org/officeDocument/2006/math" xmlns:v="urn:schemas-microsoft-com:vml" xmlns:wp14="http://schemas.microsoft.com/office/word/2010/wordprocessingDrawing" xmlns:wp="http://schemas.openxmlformats.org/drawingml/2006/wordprocessingDrawing" xmlns:w10="urn:schemas-microsoft-com:office:word" xmlns:w="http://schemas.openxmlformats.org/wordprocessingml/2006/main" xmlns:w14="http://schemas.microsoft.com/office/word/2010/wordml" xmlns:w15="http://schemas.microsoft.com/office/word/2012/wordml" xmlns:w16cid="http://schemas.microsoft.com/office/word/2016/wordml/cid" xmlns:w16se="http://schemas.microsoft.com/office/word/2015/wordml/symex" xmlns:wpg="http://schemas.microsoft.com/office/word/2010/wordprocessingGroup" xmlns:wpi="http://schemas.microsoft.com/office/word/2010/wordprocessingInk" xmlns:wne="http://schemas.microsoft.com/office/word/2006/wordml" xmlns:wps="http://schemas.microsoft.com/office/word/2010/wordprocessingShape" mc:Ignorable="w14 w15 w16se w16cid wp14">
   <w:p>
     <w:pPr>
       <w:spacing w:after="99" w:line="259" w:lineRule="auto"/>
@@ -24954,7 +25754,7 @@
 </file>
 
 <file path=word/footer6.xml><?xml version="1.0" encoding="utf-8"?>
-<w:ftr xmlns:wpc="http://schemas.microsoft.com/office/word/2010/wordprocessingCanvas" xmlns:cx="http://schemas.microsoft.com/office/drawing/2014/chartex" xmlns:cx1="http://schemas.microsoft.com/office/drawing/2015/9/8/chartex" xmlns:cx2="http://schemas.microsoft.com/office/drawing/2015/10/21/chartex" xmlns:cx3="http://schemas.microsoft.com/office/drawing/2016/5/9/chartex" xmlns:cx4="http://schemas.microsoft.com/office/drawing/2016/5/10/chartex" xmlns:cx5="http://schemas.microsoft.com/office/drawing/2016/5/11/chartex" xmlns:cx6="http://schemas.microsoft.com/office/drawing/2016/5/12/chartex" xmlns:cx7="http://schemas.microsoft.com/office/drawing/2016/5/13/chartex" xmlns:cx8="http://schemas.microsoft.com/office/drawing/2016/5/14/chartex" xmlns:mc="http://schemas.openxmlformats.org/markup-compatibility/2006" xmlns:aink="http://schemas.microsoft.com/office/drawing/2016/ink" xmlns:am3d="http://schemas.microsoft.com/office/drawing/2017/model3d" xmlns:o="urn:schemas-microsoft-com:office:office" xmlns:oel="http://schemas.microsoft.com/office/2019/extlst" xmlns:r="http://schemas.openxmlformats.org/officeDocument/2006/relationships" xmlns:m="http://schemas.openxmlformats.org/officeDocument/2006/math" xmlns:v="urn:schemas-microsoft-com:vml" xmlns:wp14="http://schemas.microsoft.com/office/word/2010/wordprocessingDrawing" xmlns:wp="http://schemas.openxmlformats.org/drawingml/2006/wordprocessingDrawing" xmlns:w10="urn:schemas-microsoft-com:office:word" xmlns:w="http://schemas.openxmlformats.org/wordprocessingml/2006/main" xmlns:w14="http://schemas.microsoft.com/office/word/2010/wordml" xmlns:w15="http://schemas.microsoft.com/office/word/2012/wordml" xmlns:w16cex="http://schemas.microsoft.com/office/word/2018/wordml/cex" xmlns:w16cid="http://schemas.microsoft.com/office/word/2016/wordml/cid" xmlns:w16="http://schemas.microsoft.com/office/word/2018/wordml" xmlns:w16du="http://schemas.microsoft.com/office/word/2023/wordml/word16du" xmlns:w16sdtdh="http://schemas.microsoft.com/office/word/2020/wordml/sdtdatahash" xmlns:w16sdtfl="http://schemas.microsoft.com/office/word/2024/wordml/sdtformatlock" xmlns:w16se="http://schemas.microsoft.com/office/word/2015/wordml/symex" xmlns:wpg="http://schemas.microsoft.com/office/word/2010/wordprocessingGroup" xmlns:wpi="http://schemas.microsoft.com/office/word/2010/wordprocessingInk" xmlns:wne="http://schemas.microsoft.com/office/word/2006/wordml" xmlns:wps="http://schemas.microsoft.com/office/word/2010/wordprocessingShape" mc:Ignorable="w14 w15 w16se w16cid w16 w16cex w16sdtdh w16sdtfl w16du wp14">
+<w:ftr xmlns:wpc="http://schemas.microsoft.com/office/word/2010/wordprocessingCanvas" xmlns:cx="http://schemas.microsoft.com/office/drawing/2014/chartex" xmlns:cx1="http://schemas.microsoft.com/office/drawing/2015/9/8/chartex" xmlns:cx2="http://schemas.microsoft.com/office/drawing/2015/10/21/chartex" xmlns:cx3="http://schemas.microsoft.com/office/drawing/2016/5/9/chartex" xmlns:cx4="http://schemas.microsoft.com/office/drawing/2016/5/10/chartex" xmlns:cx5="http://schemas.microsoft.com/office/drawing/2016/5/11/chartex" xmlns:cx6="http://schemas.microsoft.com/office/drawing/2016/5/12/chartex" xmlns:cx7="http://schemas.microsoft.com/office/drawing/2016/5/13/chartex" xmlns:cx8="http://schemas.microsoft.com/office/drawing/2016/5/14/chartex" xmlns:mc="http://schemas.openxmlformats.org/markup-compatibility/2006" xmlns:aink="http://schemas.microsoft.com/office/drawing/2016/ink" xmlns:am3d="http://schemas.microsoft.com/office/drawing/2017/model3d" xmlns:o="urn:schemas-microsoft-com:office:office" xmlns:r="http://schemas.openxmlformats.org/officeDocument/2006/relationships" xmlns:m="http://schemas.openxmlformats.org/officeDocument/2006/math" xmlns:v="urn:schemas-microsoft-com:vml" xmlns:wp14="http://schemas.microsoft.com/office/word/2010/wordprocessingDrawing" xmlns:wp="http://schemas.openxmlformats.org/drawingml/2006/wordprocessingDrawing" xmlns:w10="urn:schemas-microsoft-com:office:word" xmlns:w="http://schemas.openxmlformats.org/wordprocessingml/2006/main" xmlns:w14="http://schemas.microsoft.com/office/word/2010/wordml" xmlns:w15="http://schemas.microsoft.com/office/word/2012/wordml" xmlns:w16cid="http://schemas.microsoft.com/office/word/2016/wordml/cid" xmlns:w16se="http://schemas.microsoft.com/office/word/2015/wordml/symex" xmlns:wpg="http://schemas.microsoft.com/office/word/2010/wordprocessingGroup" xmlns:wpi="http://schemas.microsoft.com/office/word/2010/wordprocessingInk" xmlns:wne="http://schemas.microsoft.com/office/word/2006/wordml" xmlns:wps="http://schemas.microsoft.com/office/word/2010/wordprocessingShape" mc:Ignorable="w14 w15 w16se w16cid wp14">
   <w:p>
     <w:pPr>
       <w:spacing w:after="99" w:line="259" w:lineRule="auto"/>
@@ -24994,7 +25794,7 @@
 </file>
 
 <file path=word/footer7.xml><?xml version="1.0" encoding="utf-8"?>
-<w:ftr xmlns:wpc="http://schemas.microsoft.com/office/word/2010/wordprocessingCanvas" xmlns:cx="http://schemas.microsoft.com/office/drawing/2014/chartex" xmlns:cx1="http://schemas.microsoft.com/office/drawing/2015/9/8/chartex" xmlns:cx2="http://schemas.microsoft.com/office/drawing/2015/10/21/chartex" xmlns:cx3="http://schemas.microsoft.com/office/drawing/2016/5/9/chartex" xmlns:cx4="http://schemas.microsoft.com/office/drawing/2016/5/10/chartex" xmlns:cx5="http://schemas.microsoft.com/office/drawing/2016/5/11/chartex" xmlns:cx6="http://schemas.microsoft.com/office/drawing/2016/5/12/chartex" xmlns:cx7="http://schemas.microsoft.com/office/drawing/2016/5/13/chartex" xmlns:cx8="http://schemas.microsoft.com/office/drawing/2016/5/14/chartex" xmlns:mc="http://schemas.openxmlformats.org/markup-compatibility/2006" xmlns:aink="http://schemas.microsoft.com/office/drawing/2016/ink" xmlns:am3d="http://schemas.microsoft.com/office/drawing/2017/model3d" xmlns:o="urn:schemas-microsoft-com:office:office" xmlns:oel="http://schemas.microsoft.com/office/2019/extlst" xmlns:r="http://schemas.openxmlformats.org/officeDocument/2006/relationships" xmlns:m="http://schemas.openxmlformats.org/officeDocument/2006/math" xmlns:v="urn:schemas-microsoft-com:vml" xmlns:wp14="http://schemas.microsoft.com/office/word/2010/wordprocessingDrawing" xmlns:wp="http://schemas.openxmlformats.org/drawingml/2006/wordprocessingDrawing" xmlns:w10="urn:schemas-microsoft-com:office:word" xmlns:w="http://schemas.openxmlformats.org/wordprocessingml/2006/main" xmlns:w14="http://schemas.microsoft.com/office/word/2010/wordml" xmlns:w15="http://schemas.microsoft.com/office/word/2012/wordml" xmlns:w16cex="http://schemas.microsoft.com/office/word/2018/wordml/cex" xmlns:w16cid="http://schemas.microsoft.com/office/word/2016/wordml/cid" xmlns:w16="http://schemas.microsoft.com/office/word/2018/wordml" xmlns:w16du="http://schemas.microsoft.com/office/word/2023/wordml/word16du" xmlns:w16sdtdh="http://schemas.microsoft.com/office/word/2020/wordml/sdtdatahash" xmlns:w16sdtfl="http://schemas.microsoft.com/office/word/2024/wordml/sdtformatlock" xmlns:w16se="http://schemas.microsoft.com/office/word/2015/wordml/symex" xmlns:wpg="http://schemas.microsoft.com/office/word/2010/wordprocessingGroup" xmlns:wpi="http://schemas.microsoft.com/office/word/2010/wordprocessingInk" xmlns:wne="http://schemas.microsoft.com/office/word/2006/wordml" xmlns:wps="http://schemas.microsoft.com/office/word/2010/wordprocessingShape" mc:Ignorable="w14 w15 w16se w16cid w16 w16cex w16sdtdh w16sdtfl w16du wp14">
+<w:ftr xmlns:wpc="http://schemas.microsoft.com/office/word/2010/wordprocessingCanvas" xmlns:cx="http://schemas.microsoft.com/office/drawing/2014/chartex" xmlns:cx1="http://schemas.microsoft.com/office/drawing/2015/9/8/chartex" xmlns:cx2="http://schemas.microsoft.com/office/drawing/2015/10/21/chartex" xmlns:cx3="http://schemas.microsoft.com/office/drawing/2016/5/9/chartex" xmlns:cx4="http://schemas.microsoft.com/office/drawing/2016/5/10/chartex" xmlns:cx5="http://schemas.microsoft.com/office/drawing/2016/5/11/chartex" xmlns:cx6="http://schemas.microsoft.com/office/drawing/2016/5/12/chartex" xmlns:cx7="http://schemas.microsoft.com/office/drawing/2016/5/13/chartex" xmlns:cx8="http://schemas.microsoft.com/office/drawing/2016/5/14/chartex" xmlns:mc="http://schemas.openxmlformats.org/markup-compatibility/2006" xmlns:aink="http://schemas.microsoft.com/office/drawing/2016/ink" xmlns:am3d="http://schemas.microsoft.com/office/drawing/2017/model3d" xmlns:o="urn:schemas-microsoft-com:office:office" xmlns:r="http://schemas.openxmlformats.org/officeDocument/2006/relationships" xmlns:m="http://schemas.openxmlformats.org/officeDocument/2006/math" xmlns:v="urn:schemas-microsoft-com:vml" xmlns:wp14="http://schemas.microsoft.com/office/word/2010/wordprocessingDrawing" xmlns:wp="http://schemas.openxmlformats.org/drawingml/2006/wordprocessingDrawing" xmlns:w10="urn:schemas-microsoft-com:office:word" xmlns:w="http://schemas.openxmlformats.org/wordprocessingml/2006/main" xmlns:w14="http://schemas.microsoft.com/office/word/2010/wordml" xmlns:w15="http://schemas.microsoft.com/office/word/2012/wordml" xmlns:w16cid="http://schemas.microsoft.com/office/word/2016/wordml/cid" xmlns:w16se="http://schemas.microsoft.com/office/word/2015/wordml/symex" xmlns:wpg="http://schemas.microsoft.com/office/word/2010/wordprocessingGroup" xmlns:wpi="http://schemas.microsoft.com/office/word/2010/wordprocessingInk" xmlns:wne="http://schemas.microsoft.com/office/word/2006/wordml" xmlns:wps="http://schemas.microsoft.com/office/word/2010/wordprocessingShape" mc:Ignorable="w14 w15 w16se w16cid wp14">
   <w:p>
     <w:pPr>
       <w:spacing w:after="160" w:line="259" w:lineRule="auto"/>
@@ -25006,7 +25806,7 @@
 </file>
 
 <file path=word/footer8.xml><?xml version="1.0" encoding="utf-8"?>
-<w:ftr xmlns:wpc="http://schemas.microsoft.com/office/word/2010/wordprocessingCanvas" xmlns:cx="http://schemas.microsoft.com/office/drawing/2014/chartex" xmlns:cx1="http://schemas.microsoft.com/office/drawing/2015/9/8/chartex" xmlns:cx2="http://schemas.microsoft.com/office/drawing/2015/10/21/chartex" xmlns:cx3="http://schemas.microsoft.com/office/drawing/2016/5/9/chartex" xmlns:cx4="http://schemas.microsoft.com/office/drawing/2016/5/10/chartex" xmlns:cx5="http://schemas.microsoft.com/office/drawing/2016/5/11/chartex" xmlns:cx6="http://schemas.microsoft.com/office/drawing/2016/5/12/chartex" xmlns:cx7="http://schemas.microsoft.com/office/drawing/2016/5/13/chartex" xmlns:cx8="http://schemas.microsoft.com/office/drawing/2016/5/14/chartex" xmlns:mc="http://schemas.openxmlformats.org/markup-compatibility/2006" xmlns:aink="http://schemas.microsoft.com/office/drawing/2016/ink" xmlns:am3d="http://schemas.microsoft.com/office/drawing/2017/model3d" xmlns:o="urn:schemas-microsoft-com:office:office" xmlns:oel="http://schemas.microsoft.com/office/2019/extlst" xmlns:r="http://schemas.openxmlformats.org/officeDocument/2006/relationships" xmlns:m="http://schemas.openxmlformats.org/officeDocument/2006/math" xmlns:v="urn:schemas-microsoft-com:vml" xmlns:wp14="http://schemas.microsoft.com/office/word/2010/wordprocessingDrawing" xmlns:wp="http://schemas.openxmlformats.org/drawingml/2006/wordprocessingDrawing" xmlns:w10="urn:schemas-microsoft-com:office:word" xmlns:w="http://schemas.openxmlformats.org/wordprocessingml/2006/main" xmlns:w14="http://schemas.microsoft.com/office/word/2010/wordml" xmlns:w15="http://schemas.microsoft.com/office/word/2012/wordml" xmlns:w16cex="http://schemas.microsoft.com/office/word/2018/wordml/cex" xmlns:w16cid="http://schemas.microsoft.com/office/word/2016/wordml/cid" xmlns:w16="http://schemas.microsoft.com/office/word/2018/wordml" xmlns:w16du="http://schemas.microsoft.com/office/word/2023/wordml/word16du" xmlns:w16sdtdh="http://schemas.microsoft.com/office/word/2020/wordml/sdtdatahash" xmlns:w16sdtfl="http://schemas.microsoft.com/office/word/2024/wordml/sdtformatlock" xmlns:w16se="http://schemas.microsoft.com/office/word/2015/wordml/symex" xmlns:wpg="http://schemas.microsoft.com/office/word/2010/wordprocessingGroup" xmlns:wpi="http://schemas.microsoft.com/office/word/2010/wordprocessingInk" xmlns:wne="http://schemas.microsoft.com/office/word/2006/wordml" xmlns:wps="http://schemas.microsoft.com/office/word/2010/wordprocessingShape" mc:Ignorable="w14 w15 w16se w16cid w16 w16cex w16sdtdh w16sdtfl w16du wp14">
+<w:ftr xmlns:wpc="http://schemas.microsoft.com/office/word/2010/wordprocessingCanvas" xmlns:cx="http://schemas.microsoft.com/office/drawing/2014/chartex" xmlns:cx1="http://schemas.microsoft.com/office/drawing/2015/9/8/chartex" xmlns:cx2="http://schemas.microsoft.com/office/drawing/2015/10/21/chartex" xmlns:cx3="http://schemas.microsoft.com/office/drawing/2016/5/9/chartex" xmlns:cx4="http://schemas.microsoft.com/office/drawing/2016/5/10/chartex" xmlns:cx5="http://schemas.microsoft.com/office/drawing/2016/5/11/chartex" xmlns:cx6="http://schemas.microsoft.com/office/drawing/2016/5/12/chartex" xmlns:cx7="http://schemas.microsoft.com/office/drawing/2016/5/13/chartex" xmlns:cx8="http://schemas.microsoft.com/office/drawing/2016/5/14/chartex" xmlns:mc="http://schemas.openxmlformats.org/markup-compatibility/2006" xmlns:aink="http://schemas.microsoft.com/office/drawing/2016/ink" xmlns:am3d="http://schemas.microsoft.com/office/drawing/2017/model3d" xmlns:o="urn:schemas-microsoft-com:office:office" xmlns:r="http://schemas.openxmlformats.org/officeDocument/2006/relationships" xmlns:m="http://schemas.openxmlformats.org/officeDocument/2006/math" xmlns:v="urn:schemas-microsoft-com:vml" xmlns:wp14="http://schemas.microsoft.com/office/word/2010/wordprocessingDrawing" xmlns:wp="http://schemas.openxmlformats.org/drawingml/2006/wordprocessingDrawing" xmlns:w10="urn:schemas-microsoft-com:office:word" xmlns:w="http://schemas.openxmlformats.org/wordprocessingml/2006/main" xmlns:w14="http://schemas.microsoft.com/office/word/2010/wordml" xmlns:w15="http://schemas.microsoft.com/office/word/2012/wordml" xmlns:w16cid="http://schemas.microsoft.com/office/word/2016/wordml/cid" xmlns:w16se="http://schemas.microsoft.com/office/word/2015/wordml/symex" xmlns:wpg="http://schemas.microsoft.com/office/word/2010/wordprocessingGroup" xmlns:wpi="http://schemas.microsoft.com/office/word/2010/wordprocessingInk" xmlns:wne="http://schemas.microsoft.com/office/word/2006/wordml" xmlns:wps="http://schemas.microsoft.com/office/word/2010/wordprocessingShape" mc:Ignorable="w14 w15 w16se w16cid wp14">
   <w:p>
     <w:pPr>
       <w:spacing w:after="160" w:line="259" w:lineRule="auto"/>
@@ -25018,7 +25818,7 @@
 </file>
 
 <file path=word/footer9.xml><?xml version="1.0" encoding="utf-8"?>
-<w:ftr xmlns:wpc="http://schemas.microsoft.com/office/word/2010/wordprocessingCanvas" xmlns:cx="http://schemas.microsoft.com/office/drawing/2014/chartex" xmlns:cx1="http://schemas.microsoft.com/office/drawing/2015/9/8/chartex" xmlns:cx2="http://schemas.microsoft.com/office/drawing/2015/10/21/chartex" xmlns:cx3="http://schemas.microsoft.com/office/drawing/2016/5/9/chartex" xmlns:cx4="http://schemas.microsoft.com/office/drawing/2016/5/10/chartex" xmlns:cx5="http://schemas.microsoft.com/office/drawing/2016/5/11/chartex" xmlns:cx6="http://schemas.microsoft.com/office/drawing/2016/5/12/chartex" xmlns:cx7="http://schemas.microsoft.com/office/drawing/2016/5/13/chartex" xmlns:cx8="http://schemas.microsoft.com/office/drawing/2016/5/14/chartex" xmlns:mc="http://schemas.openxmlformats.org/markup-compatibility/2006" xmlns:aink="http://schemas.microsoft.com/office/drawing/2016/ink" xmlns:am3d="http://schemas.microsoft.com/office/drawing/2017/model3d" xmlns:o="urn:schemas-microsoft-com:office:office" xmlns:oel="http://schemas.microsoft.com/office/2019/extlst" xmlns:r="http://schemas.openxmlformats.org/officeDocument/2006/relationships" xmlns:m="http://schemas.openxmlformats.org/officeDocument/2006/math" xmlns:v="urn:schemas-microsoft-com:vml" xmlns:wp14="http://schemas.microsoft.com/office/word/2010/wordprocessingDrawing" xmlns:wp="http://schemas.openxmlformats.org/drawingml/2006/wordprocessingDrawing" xmlns:w10="urn:schemas-microsoft-com:office:word" xmlns:w="http://schemas.openxmlformats.org/wordprocessingml/2006/main" xmlns:w14="http://schemas.microsoft.com/office/word/2010/wordml" xmlns:w15="http://schemas.microsoft.com/office/word/2012/wordml" xmlns:w16cex="http://schemas.microsoft.com/office/word/2018/wordml/cex" xmlns:w16cid="http://schemas.microsoft.com/office/word/2016/wordml/cid" xmlns:w16="http://schemas.microsoft.com/office/word/2018/wordml" xmlns:w16du="http://schemas.microsoft.com/office/word/2023/wordml/word16du" xmlns:w16sdtdh="http://schemas.microsoft.com/office/word/2020/wordml/sdtdatahash" xmlns:w16sdtfl="http://schemas.microsoft.com/office/word/2024/wordml/sdtformatlock" xmlns:w16se="http://schemas.microsoft.com/office/word/2015/wordml/symex" xmlns:wpg="http://schemas.microsoft.com/office/word/2010/wordprocessingGroup" xmlns:wpi="http://schemas.microsoft.com/office/word/2010/wordprocessingInk" xmlns:wne="http://schemas.microsoft.com/office/word/2006/wordml" xmlns:wps="http://schemas.microsoft.com/office/word/2010/wordprocessingShape" mc:Ignorable="w14 w15 w16se w16cid w16 w16cex w16sdtdh w16sdtfl w16du wp14">
+<w:ftr xmlns:wpc="http://schemas.microsoft.com/office/word/2010/wordprocessingCanvas" xmlns:cx="http://schemas.microsoft.com/office/drawing/2014/chartex" xmlns:cx1="http://schemas.microsoft.com/office/drawing/2015/9/8/chartex" xmlns:cx2="http://schemas.microsoft.com/office/drawing/2015/10/21/chartex" xmlns:cx3="http://schemas.microsoft.com/office/drawing/2016/5/9/chartex" xmlns:cx4="http://schemas.microsoft.com/office/drawing/2016/5/10/chartex" xmlns:cx5="http://schemas.microsoft.com/office/drawing/2016/5/11/chartex" xmlns:cx6="http://schemas.microsoft.com/office/drawing/2016/5/12/chartex" xmlns:cx7="http://schemas.microsoft.com/office/drawing/2016/5/13/chartex" xmlns:cx8="http://schemas.microsoft.com/office/drawing/2016/5/14/chartex" xmlns:mc="http://schemas.openxmlformats.org/markup-compatibility/2006" xmlns:aink="http://schemas.microsoft.com/office/drawing/2016/ink" xmlns:am3d="http://schemas.microsoft.com/office/drawing/2017/model3d" xmlns:o="urn:schemas-microsoft-com:office:office" xmlns:r="http://schemas.openxmlformats.org/officeDocument/2006/relationships" xmlns:m="http://schemas.openxmlformats.org/officeDocument/2006/math" xmlns:v="urn:schemas-microsoft-com:vml" xmlns:wp14="http://schemas.microsoft.com/office/word/2010/wordprocessingDrawing" xmlns:wp="http://schemas.openxmlformats.org/drawingml/2006/wordprocessingDrawing" xmlns:w10="urn:schemas-microsoft-com:office:word" xmlns:w="http://schemas.openxmlformats.org/wordprocessingml/2006/main" xmlns:w14="http://schemas.microsoft.com/office/word/2010/wordml" xmlns:w15="http://schemas.microsoft.com/office/word/2012/wordml" xmlns:w16cid="http://schemas.microsoft.com/office/word/2016/wordml/cid" xmlns:w16se="http://schemas.microsoft.com/office/word/2015/wordml/symex" xmlns:wpg="http://schemas.microsoft.com/office/word/2010/wordprocessingGroup" xmlns:wpi="http://schemas.microsoft.com/office/word/2010/wordprocessingInk" xmlns:wne="http://schemas.microsoft.com/office/word/2006/wordml" xmlns:wps="http://schemas.microsoft.com/office/word/2010/wordprocessingShape" mc:Ignorable="w14 w15 w16se w16cid wp14">
   <w:p>
     <w:pPr>
       <w:spacing w:after="160" w:line="259" w:lineRule="auto"/>
@@ -25030,7 +25830,7 @@
 </file>
 
 <file path=word/footnotes.xml><?xml version="1.0" encoding="utf-8"?>
-<w:footnotes xmlns:wpc="http://schemas.microsoft.com/office/word/2010/wordprocessingCanvas" xmlns:cx="http://schemas.microsoft.com/office/drawing/2014/chartex" xmlns:cx1="http://schemas.microsoft.com/office/drawing/2015/9/8/chartex" xmlns:cx2="http://schemas.microsoft.com/office/drawing/2015/10/21/chartex" xmlns:cx3="http://schemas.microsoft.com/office/drawing/2016/5/9/chartex" xmlns:cx4="http://schemas.microsoft.com/office/drawing/2016/5/10/chartex" xmlns:cx5="http://schemas.microsoft.com/office/drawing/2016/5/11/chartex" xmlns:cx6="http://schemas.microsoft.com/office/drawing/2016/5/12/chartex" xmlns:cx7="http://schemas.microsoft.com/office/drawing/2016/5/13/chartex" xmlns:cx8="http://schemas.microsoft.com/office/drawing/2016/5/14/chartex" xmlns:mc="http://schemas.openxmlformats.org/markup-compatibility/2006" xmlns:aink="http://schemas.microsoft.com/office/drawing/2016/ink" xmlns:am3d="http://schemas.microsoft.com/office/drawing/2017/model3d" xmlns:o="urn:schemas-microsoft-com:office:office" xmlns:oel="http://schemas.microsoft.com/office/2019/extlst" xmlns:r="http://schemas.openxmlformats.org/officeDocument/2006/relationships" xmlns:m="http://schemas.openxmlformats.org/officeDocument/2006/math" xmlns:v="urn:schemas-microsoft-com:vml" xmlns:wp14="http://schemas.microsoft.com/office/word/2010/wordprocessingDrawing" xmlns:wp="http://schemas.openxmlformats.org/drawingml/2006/wordprocessingDrawing" xmlns:w10="urn:schemas-microsoft-com:office:word" xmlns:w="http://schemas.openxmlformats.org/wordprocessingml/2006/main" xmlns:w14="http://schemas.microsoft.com/office/word/2010/wordml" xmlns:w15="http://schemas.microsoft.com/office/word/2012/wordml" xmlns:w16cex="http://schemas.microsoft.com/office/word/2018/wordml/cex" xmlns:w16cid="http://schemas.microsoft.com/office/word/2016/wordml/cid" xmlns:w16="http://schemas.microsoft.com/office/word/2018/wordml" xmlns:w16du="http://schemas.microsoft.com/office/word/2023/wordml/word16du" xmlns:w16sdtdh="http://schemas.microsoft.com/office/word/2020/wordml/sdtdatahash" xmlns:w16sdtfl="http://schemas.microsoft.com/office/word/2024/wordml/sdtformatlock" xmlns:w16se="http://schemas.microsoft.com/office/word/2015/wordml/symex" xmlns:wpg="http://schemas.microsoft.com/office/word/2010/wordprocessingGroup" xmlns:wpi="http://schemas.microsoft.com/office/word/2010/wordprocessingInk" xmlns:wne="http://schemas.microsoft.com/office/word/2006/wordml" xmlns:wps="http://schemas.microsoft.com/office/word/2010/wordprocessingShape" mc:Ignorable="w14 w15 w16se w16cid w16 w16cex w16sdtdh w16sdtfl w16du wp14">
+<w:footnotes xmlns:wpc="http://schemas.microsoft.com/office/word/2010/wordprocessingCanvas" xmlns:cx="http://schemas.microsoft.com/office/drawing/2014/chartex" xmlns:cx1="http://schemas.microsoft.com/office/drawing/2015/9/8/chartex" xmlns:cx2="http://schemas.microsoft.com/office/drawing/2015/10/21/chartex" xmlns:cx3="http://schemas.microsoft.com/office/drawing/2016/5/9/chartex" xmlns:cx4="http://schemas.microsoft.com/office/drawing/2016/5/10/chartex" xmlns:cx5="http://schemas.microsoft.com/office/drawing/2016/5/11/chartex" xmlns:cx6="http://schemas.microsoft.com/office/drawing/2016/5/12/chartex" xmlns:cx7="http://schemas.microsoft.com/office/drawing/2016/5/13/chartex" xmlns:cx8="http://schemas.microsoft.com/office/drawing/2016/5/14/chartex" xmlns:mc="http://schemas.openxmlformats.org/markup-compatibility/2006" xmlns:aink="http://schemas.microsoft.com/office/drawing/2016/ink" xmlns:am3d="http://schemas.microsoft.com/office/drawing/2017/model3d" xmlns:o="urn:schemas-microsoft-com:office:office" xmlns:r="http://schemas.openxmlformats.org/officeDocument/2006/relationships" xmlns:m="http://schemas.openxmlformats.org/officeDocument/2006/math" xmlns:v="urn:schemas-microsoft-com:vml" xmlns:wp14="http://schemas.microsoft.com/office/word/2010/wordprocessingDrawing" xmlns:wp="http://schemas.openxmlformats.org/drawingml/2006/wordprocessingDrawing" xmlns:w10="urn:schemas-microsoft-com:office:word" xmlns:w="http://schemas.openxmlformats.org/wordprocessingml/2006/main" xmlns:w14="http://schemas.microsoft.com/office/word/2010/wordml" xmlns:w15="http://schemas.microsoft.com/office/word/2012/wordml" xmlns:w16cid="http://schemas.microsoft.com/office/word/2016/wordml/cid" xmlns:w16se="http://schemas.microsoft.com/office/word/2015/wordml/symex" xmlns:wpg="http://schemas.microsoft.com/office/word/2010/wordprocessingGroup" xmlns:wpi="http://schemas.microsoft.com/office/word/2010/wordprocessingInk" xmlns:wne="http://schemas.microsoft.com/office/word/2006/wordml" xmlns:wps="http://schemas.microsoft.com/office/word/2010/wordprocessingShape" mc:Ignorable="w14 w15 w16se w16cid wp14">
   <w:footnote w:type="separator" w:id="-1">
     <w:p>
       <w:pPr>
@@ -25055,7 +25855,7 @@
 </file>
 
 <file path=word/numbering.xml><?xml version="1.0" encoding="utf-8"?>
-<w:numbering xmlns:wpc="http://schemas.microsoft.com/office/word/2010/wordprocessingCanvas" xmlns:cx="http://schemas.microsoft.com/office/drawing/2014/chartex" xmlns:cx1="http://schemas.microsoft.com/office/drawing/2015/9/8/chartex" xmlns:cx2="http://schemas.microsoft.com/office/drawing/2015/10/21/chartex" xmlns:cx3="http://schemas.microsoft.com/office/drawing/2016/5/9/chartex" xmlns:cx4="http://schemas.microsoft.com/office/drawing/2016/5/10/chartex" xmlns:cx5="http://schemas.microsoft.com/office/drawing/2016/5/11/chartex" xmlns:cx6="http://schemas.microsoft.com/office/drawing/2016/5/12/chartex" xmlns:cx7="http://schemas.microsoft.com/office/drawing/2016/5/13/chartex" xmlns:cx8="http://schemas.microsoft.com/office/drawing/2016/5/14/chartex" xmlns:mc="http://schemas.openxmlformats.org/markup-compatibility/2006" xmlns:aink="http://schemas.microsoft.com/office/drawing/2016/ink" xmlns:am3d="http://schemas.microsoft.com/office/drawing/2017/model3d" xmlns:o="urn:schemas-microsoft-com:office:office" xmlns:oel="http://schemas.microsoft.com/office/2019/extlst" xmlns:r="http://schemas.openxmlformats.org/officeDocument/2006/relationships" xmlns:m="http://schemas.openxmlformats.org/officeDocument/2006/math" xmlns:v="urn:schemas-microsoft-com:vml" xmlns:wp14="http://schemas.microsoft.com/office/word/2010/wordprocessingDrawing" xmlns:wp="http://schemas.openxmlformats.org/drawingml/2006/wordprocessingDrawing" xmlns:w10="urn:schemas-microsoft-com:office:word" xmlns:w="http://schemas.openxmlformats.org/wordprocessingml/2006/main" xmlns:w14="http://schemas.microsoft.com/office/word/2010/wordml" xmlns:w15="http://schemas.microsoft.com/office/word/2012/wordml" xmlns:w16cex="http://schemas.microsoft.com/office/word/2018/wordml/cex" xmlns:w16cid="http://schemas.microsoft.com/office/word/2016/wordml/cid" xmlns:w16="http://schemas.microsoft.com/office/word/2018/wordml" xmlns:w16du="http://schemas.microsoft.com/office/word/2023/wordml/word16du" xmlns:w16sdtdh="http://schemas.microsoft.com/office/word/2020/wordml/sdtdatahash" xmlns:w16sdtfl="http://schemas.microsoft.com/office/word/2024/wordml/sdtformatlock" xmlns:w16se="http://schemas.microsoft.com/office/word/2015/wordml/symex" xmlns:wpg="http://schemas.microsoft.com/office/word/2010/wordprocessingGroup" xmlns:wpi="http://schemas.microsoft.com/office/word/2010/wordprocessingInk" xmlns:wne="http://schemas.microsoft.com/office/word/2006/wordml" xmlns:wps="http://schemas.microsoft.com/office/word/2010/wordprocessingShape" mc:Ignorable="w14 w15 w16se w16cid w16 w16cex w16sdtdh w16sdtfl w16du wp14">
+<w:numbering xmlns:wpc="http://schemas.microsoft.com/office/word/2010/wordprocessingCanvas" xmlns:cx="http://schemas.microsoft.com/office/drawing/2014/chartex" xmlns:cx1="http://schemas.microsoft.com/office/drawing/2015/9/8/chartex" xmlns:cx2="http://schemas.microsoft.com/office/drawing/2015/10/21/chartex" xmlns:cx3="http://schemas.microsoft.com/office/drawing/2016/5/9/chartex" xmlns:cx4="http://schemas.microsoft.com/office/drawing/2016/5/10/chartex" xmlns:cx5="http://schemas.microsoft.com/office/drawing/2016/5/11/chartex" xmlns:cx6="http://schemas.microsoft.com/office/drawing/2016/5/12/chartex" xmlns:cx7="http://schemas.microsoft.com/office/drawing/2016/5/13/chartex" xmlns:cx8="http://schemas.microsoft.com/office/drawing/2016/5/14/chartex" xmlns:mc="http://schemas.openxmlformats.org/markup-compatibility/2006" xmlns:aink="http://schemas.microsoft.com/office/drawing/2016/ink" xmlns:am3d="http://schemas.microsoft.com/office/drawing/2017/model3d" xmlns:o="urn:schemas-microsoft-com:office:office" xmlns:r="http://schemas.openxmlformats.org/officeDocument/2006/relationships" xmlns:m="http://schemas.openxmlformats.org/officeDocument/2006/math" xmlns:v="urn:schemas-microsoft-com:vml" xmlns:wp14="http://schemas.microsoft.com/office/word/2010/wordprocessingDrawing" xmlns:wp="http://schemas.openxmlformats.org/drawingml/2006/wordprocessingDrawing" xmlns:w10="urn:schemas-microsoft-com:office:word" xmlns:w="http://schemas.openxmlformats.org/wordprocessingml/2006/main" xmlns:w14="http://schemas.microsoft.com/office/word/2010/wordml" xmlns:w15="http://schemas.microsoft.com/office/word/2012/wordml" xmlns:w16cid="http://schemas.microsoft.com/office/word/2016/wordml/cid" xmlns:w16se="http://schemas.microsoft.com/office/word/2015/wordml/symex" xmlns:wpg="http://schemas.microsoft.com/office/word/2010/wordprocessingGroup" xmlns:wpi="http://schemas.microsoft.com/office/word/2010/wordprocessingInk" xmlns:wne="http://schemas.microsoft.com/office/word/2006/wordml" xmlns:wps="http://schemas.microsoft.com/office/word/2010/wordprocessingShape" mc:Ignorable="w14 w15 w16se w16cid wp14">
   <w:abstractNum w:abstractNumId="0" w15:restartNumberingAfterBreak="0">
     <w:nsid w:val="025A5BC7"/>
     <w:multiLevelType w:val="hybridMultilevel"/>
@@ -27041,47 +27841,47 @@
       </w:rPr>
     </w:lvl>
   </w:abstractNum>
-  <w:num w:numId="1" w16cid:durableId="719937874">
+  <w:num w:numId="1">
     <w:abstractNumId w:val="7"/>
   </w:num>
-  <w:num w:numId="2" w16cid:durableId="2004626582">
+  <w:num w:numId="2">
     <w:abstractNumId w:val="3"/>
   </w:num>
-  <w:num w:numId="3" w16cid:durableId="580988839">
+  <w:num w:numId="3">
     <w:abstractNumId w:val="10"/>
   </w:num>
-  <w:num w:numId="4" w16cid:durableId="673218076">
+  <w:num w:numId="4">
     <w:abstractNumId w:val="2"/>
   </w:num>
-  <w:num w:numId="5" w16cid:durableId="1184322390">
+  <w:num w:numId="5">
     <w:abstractNumId w:val="6"/>
   </w:num>
-  <w:num w:numId="6" w16cid:durableId="1623226656">
+  <w:num w:numId="6">
     <w:abstractNumId w:val="9"/>
   </w:num>
-  <w:num w:numId="7" w16cid:durableId="1560827905">
+  <w:num w:numId="7">
     <w:abstractNumId w:val="8"/>
   </w:num>
-  <w:num w:numId="8" w16cid:durableId="512453708">
+  <w:num w:numId="8">
     <w:abstractNumId w:val="0"/>
   </w:num>
-  <w:num w:numId="9" w16cid:durableId="1966690624">
+  <w:num w:numId="9">
     <w:abstractNumId w:val="4"/>
   </w:num>
-  <w:num w:numId="10" w16cid:durableId="858422964">
+  <w:num w:numId="10">
     <w:abstractNumId w:val="1"/>
   </w:num>
-  <w:num w:numId="11" w16cid:durableId="857695051">
+  <w:num w:numId="11">
     <w:abstractNumId w:val="11"/>
   </w:num>
-  <w:num w:numId="12" w16cid:durableId="1901206857">
+  <w:num w:numId="12">
     <w:abstractNumId w:val="5"/>
   </w:num>
 </w:numbering>
 </file>
 
 <file path=word/styles.xml><?xml version="1.0" encoding="utf-8"?>
-<w:styles xmlns:mc="http://schemas.openxmlformats.org/markup-compatibility/2006" xmlns:r="http://schemas.openxmlformats.org/officeDocument/2006/relationships" xmlns:w="http://schemas.openxmlformats.org/wordprocessingml/2006/main" xmlns:w14="http://schemas.microsoft.com/office/word/2010/wordml" xmlns:w15="http://schemas.microsoft.com/office/word/2012/wordml" xmlns:w16cex="http://schemas.microsoft.com/office/word/2018/wordml/cex" xmlns:w16cid="http://schemas.microsoft.com/office/word/2016/wordml/cid" xmlns:w16="http://schemas.microsoft.com/office/word/2018/wordml" xmlns:w16du="http://schemas.microsoft.com/office/word/2023/wordml/word16du" xmlns:w16sdtdh="http://schemas.microsoft.com/office/word/2020/wordml/sdtdatahash" xmlns:w16sdtfl="http://schemas.microsoft.com/office/word/2024/wordml/sdtformatlock" xmlns:w16se="http://schemas.microsoft.com/office/word/2015/wordml/symex" mc:Ignorable="w14 w15 w16se w16cid w16 w16cex w16sdtdh w16sdtfl w16du">
+<w:styles xmlns:mc="http://schemas.openxmlformats.org/markup-compatibility/2006" xmlns:r="http://schemas.openxmlformats.org/officeDocument/2006/relationships" xmlns:w="http://schemas.openxmlformats.org/wordprocessingml/2006/main" xmlns:w14="http://schemas.microsoft.com/office/word/2010/wordml" xmlns:w15="http://schemas.microsoft.com/office/word/2012/wordml" xmlns:w16cid="http://schemas.microsoft.com/office/word/2016/wordml/cid" xmlns:w16se="http://schemas.microsoft.com/office/word/2015/wordml/symex" mc:Ignorable="w14 w15 w16se w16cid">
   <w:docDefaults>
     <w:rPrDefault>
       <w:rPr>
@@ -27099,7 +27899,7 @@
       </w:pPr>
     </w:pPrDefault>
   </w:docDefaults>
-  <w:latentStyles w:defLockedState="0" w:defUIPriority="99" w:defSemiHidden="0" w:defUnhideWhenUsed="0" w:defQFormat="0" w:count="376">
+  <w:latentStyles w:defLockedState="0" w:defUIPriority="99" w:defSemiHidden="0" w:defUnhideWhenUsed="0" w:defQFormat="0" w:count="375">
     <w:lsdException w:name="Normal" w:uiPriority="0" w:qFormat="1"/>
     <w:lsdException w:name="heading 1" w:uiPriority="9" w:qFormat="1"/>
     <w:lsdException w:name="heading 2" w:semiHidden="1" w:uiPriority="9" w:unhideWhenUsed="1" w:qFormat="1"/>
@@ -27475,7 +28275,6 @@
     <w:lsdException w:name="Smart Hyperlink" w:semiHidden="1" w:unhideWhenUsed="1"/>
     <w:lsdException w:name="Hashtag" w:semiHidden="1" w:unhideWhenUsed="1"/>
     <w:lsdException w:name="Unresolved Mention" w:semiHidden="1" w:unhideWhenUsed="1"/>
-    <w:lsdException w:name="Smart Link" w:semiHidden="1" w:unhideWhenUsed="1"/>
   </w:latentStyles>
   <w:style w:type="paragraph" w:default="1" w:styleId="Normal">
     <w:name w:val="Normal"/>
@@ -27545,6 +28344,7 @@
     <w:uiPriority w:val="9"/>
     <w:unhideWhenUsed/>
     <w:qFormat/>
+    <w:rsid w:val="00B02868"/>
     <w:pPr>
       <w:keepNext/>
       <w:keepLines/>
@@ -27552,8 +28352,8 @@
         <w:ilvl w:val="2"/>
         <w:numId w:val="5"/>
       </w:numPr>
-      <w:spacing w:after="89" w:line="259" w:lineRule="auto"/>
-      <w:ind w:left="10" w:hanging="10"/>
+      <w:spacing w:after="0" w:line="259" w:lineRule="auto"/>
+      <w:ind w:left="680"/>
       <w:outlineLvl w:val="2"/>
     </w:pPr>
     <w:rPr>
@@ -27592,11 +28392,12 @@
   <w:style w:type="character" w:customStyle="1" w:styleId="Heading3Char">
     <w:name w:val="Heading 3 Char"/>
     <w:link w:val="Heading3"/>
+    <w:uiPriority w:val="9"/>
+    <w:rsid w:val="00B02868"/>
     <w:rPr>
       <w:rFonts w:ascii="Times New Roman" w:eastAsia="Times New Roman" w:hAnsi="Times New Roman" w:cs="Times New Roman"/>
       <w:b/>
       <w:color w:val="000000"/>
-      <w:sz w:val="24"/>
     </w:rPr>
   </w:style>
   <w:style w:type="character" w:customStyle="1" w:styleId="Heading2Char">
@@ -27725,6 +28526,28 @@
       <w:ind w:left="720"/>
       <w:contextualSpacing/>
     </w:pPr>
+  </w:style>
+  <w:style w:type="character" w:styleId="Emphasis">
+    <w:name w:val="Emphasis"/>
+    <w:basedOn w:val="DefaultParagraphFont"/>
+    <w:uiPriority w:val="20"/>
+    <w:qFormat/>
+    <w:rsid w:val="007E204B"/>
+    <w:rPr>
+      <w:i/>
+      <w:iCs/>
+    </w:rPr>
+  </w:style>
+  <w:style w:type="character" w:styleId="Strong">
+    <w:name w:val="Strong"/>
+    <w:basedOn w:val="DefaultParagraphFont"/>
+    <w:uiPriority w:val="22"/>
+    <w:qFormat/>
+    <w:rsid w:val="00721A12"/>
+    <w:rPr>
+      <w:b/>
+      <w:bCs/>
+    </w:rPr>
   </w:style>
 </w:styles>
 </file>
@@ -28029,7 +28852,7 @@
 </file>
 
 <file path=customXml/itemProps1.xml><?xml version="1.0" encoding="utf-8"?>
-<ds:datastoreItem xmlns:ds="http://schemas.openxmlformats.org/officeDocument/2006/customXml" ds:itemID="{FDA62CE9-AAFD-4FE1-BA5C-22D6B7252362}">
+<ds:datastoreItem xmlns:ds="http://schemas.openxmlformats.org/officeDocument/2006/customXml" ds:itemID="{4C5B61D6-4197-4609-AD3B-9A8276551CF1}">
   <ds:schemaRefs>
     <ds:schemaRef ds:uri="http://schemas.openxmlformats.org/officeDocument/2006/bibliography"/>
   </ds:schemaRefs>

</xml_diff>

<commit_message>
Gramaticke i tipografske ispravke i prevod slika na srpski
</commit_message>
<xml_diff>
--- a/diplomski_rad.docx
+++ b/diplomski_rad.docx
@@ -15380,7 +15380,14 @@
           <w:rFonts w:ascii="Arial" w:eastAsia="Arial" w:hAnsi="Arial" w:cs="Arial"/>
           <w:sz w:val="32"/>
         </w:rPr>
-        <w:t>Нови Сад, 2025</w:t>
+        <w:t>Нови Сад, 202</w:t>
+      </w:r>
+      <w:r>
+        <w:rPr>
+          <w:rFonts w:ascii="Arial" w:eastAsia="Arial" w:hAnsi="Arial" w:cs="Arial"/>
+          <w:sz w:val="32"/>
+        </w:rPr>
+        <w:t>6</w:t>
       </w:r>
     </w:p>
     <w:p>
@@ -16381,7 +16388,23 @@
                 <w:sz w:val="18"/>
                 <w:lang w:val="bs-Cyrl-BA"/>
               </w:rPr>
-              <w:t>Евалуација језичких модела на српском језику: тачност, халуцинације и конзистентност</w:t>
+              <w:t>Евалуација језичких модела н</w:t>
+            </w:r>
+            <w:r>
+              <w:rPr>
+                <w:rFonts w:ascii="Arial" w:hAnsi="Arial"/>
+                <w:sz w:val="18"/>
+                <w:lang w:val="en-US"/>
+              </w:rPr>
+              <w:t>a</w:t>
+            </w:r>
+            <w:r>
+              <w:rPr>
+                <w:rFonts w:ascii="Arial" w:hAnsi="Arial"/>
+                <w:sz w:val="18"/>
+                <w:lang w:val="bs-Cyrl-BA"/>
+              </w:rPr>
+              <w:t xml:space="preserve"> српском језику: тачност, халуцинације и конзистентност</w:t>
             </w:r>
           </w:p>
           <w:p>
@@ -17127,7 +17150,7 @@
                 <w:sz w:val="18"/>
                 <w:lang w:val="bs-Latn-BA"/>
               </w:rPr>
-              <w:t>7</w:t>
+              <w:t>8</w:t>
             </w:r>
             <w:r>
               <w:rPr>
@@ -19181,16 +19204,34 @@
               <w:rPr>
                 <w:rFonts w:ascii="Arial" w:hAnsi="Arial"/>
                 <w:sz w:val="18"/>
-                <w:lang w:val="bs-Cyrl-BA"/>
+                <w:lang w:val="bs-Latn-BA"/>
               </w:rPr>
             </w:pPr>
             <w:r>
               <w:rPr>
                 <w:rFonts w:ascii="Arial" w:hAnsi="Arial"/>
                 <w:sz w:val="18"/>
-                <w:lang w:val="bs-Cyrl-BA"/>
-              </w:rPr>
-              <w:t>Филип Глишић</w:t>
+                <w:lang w:val="en-US"/>
+              </w:rPr>
+              <w:t xml:space="preserve">Filip </w:t>
+            </w:r>
+            <w:proofErr w:type="spellStart"/>
+            <w:r>
+              <w:rPr>
+                <w:rFonts w:ascii="Arial" w:hAnsi="Arial"/>
+                <w:sz w:val="18"/>
+                <w:lang w:val="en-US"/>
+              </w:rPr>
+              <w:t>Gli</w:t>
+            </w:r>
+            <w:proofErr w:type="spellEnd"/>
+            <w:r>
+              <w:rPr>
+                <w:rFonts w:ascii="Arial" w:hAnsi="Arial"/>
+                <w:sz w:val="18"/>
+                <w:lang w:val="bs-Latn-BA"/>
+              </w:rPr>
+              <w:t>šić</w:t>
             </w:r>
           </w:p>
         </w:tc>
@@ -19273,16 +19314,16 @@
               <w:rPr>
                 <w:rFonts w:ascii="Arial" w:hAnsi="Arial"/>
                 <w:sz w:val="18"/>
-                <w:lang w:val="bs-Cyrl-BA"/>
+                <w:lang w:val="bs-Latn-BA"/>
               </w:rPr>
             </w:pPr>
             <w:r>
               <w:rPr>
                 <w:rFonts w:ascii="Arial" w:hAnsi="Arial"/>
                 <w:sz w:val="18"/>
-                <w:lang w:val="bs-Cyrl-BA"/>
-              </w:rPr>
-              <w:t>Проф. др. Александар Селаков</w:t>
+                <w:lang w:val="bs-Latn-BA"/>
+              </w:rPr>
+              <w:t>Prof. Dr. Aleksandar Selakov</w:t>
             </w:r>
           </w:p>
         </w:tc>
@@ -20032,7 +20073,7 @@
                 <w:sz w:val="18"/>
                 <w:lang w:val="en"/>
               </w:rPr>
-              <w:t>7</w:t>
+              <w:t>8</w:t>
             </w:r>
             <w:r>
               <w:rPr>
@@ -21003,7 +21044,7 @@
                 <w:rFonts w:ascii="Arial" w:hAnsi="Arial"/>
                 <w:sz w:val="18"/>
               </w:rPr>
-              <w:t>Menthor's sign</w:t>
+              <w:t>Mentor's sign</w:t>
             </w:r>
           </w:p>
         </w:tc>
@@ -21061,7 +21102,24 @@
                 <w:spacing w:val="-4"/>
                 <w:sz w:val="18"/>
               </w:rPr>
-              <w:t>Member,Mentor:</w:t>
+              <w:t>Member,</w:t>
+            </w:r>
+            <w:r>
+              <w:rPr>
+                <w:rFonts w:ascii="Arial" w:hAnsi="Arial"/>
+                <w:spacing w:val="-4"/>
+                <w:sz w:val="18"/>
+                <w:lang w:val="bs-Cyrl-BA"/>
+              </w:rPr>
+              <w:t xml:space="preserve"> </w:t>
+            </w:r>
+            <w:r>
+              <w:rPr>
+                <w:rFonts w:ascii="Arial" w:hAnsi="Arial"/>
+                <w:spacing w:val="-4"/>
+                <w:sz w:val="18"/>
+              </w:rPr>
+              <w:t>Mentor:</w:t>
             </w:r>
           </w:p>
         </w:tc>
@@ -21859,7 +21917,25 @@
                 <w:sz w:val="26"/>
                 <w:lang w:val="sr-Cyrl-CS"/>
               </w:rPr>
-              <w:t>Примењено софтверско инжињерство</w:t>
+              <w:t>Примењено софтверско инж</w:t>
+            </w:r>
+            <w:r>
+              <w:rPr>
+                <w:rFonts w:ascii="Arial" w:hAnsi="Arial"/>
+                <w:spacing w:val="-4"/>
+                <w:sz w:val="26"/>
+                <w:lang w:val="sr-Cyrl-CS"/>
+              </w:rPr>
+              <w:t>е</w:t>
+            </w:r>
+            <w:r>
+              <w:rPr>
+                <w:rFonts w:ascii="Arial" w:hAnsi="Arial"/>
+                <w:spacing w:val="-4"/>
+                <w:sz w:val="26"/>
+                <w:lang w:val="sr-Cyrl-CS"/>
+              </w:rPr>
+              <w:t>њерство</w:t>
             </w:r>
           </w:p>
         </w:tc>
@@ -26791,7 +26867,7 @@
         <w:rPr>
           <w:lang w:val="bs-Cyrl-BA"/>
         </w:rPr>
-        <w:t xml:space="preserve"> сведоци смо велике </w:t>
+        <w:t xml:space="preserve"> сведоци смо велике</w:t>
       </w:r>
       <w:r>
         <w:rPr>
@@ -26849,45 +26925,63 @@
       </w:r>
       <w:r>
         <w:rPr>
+          <w:lang w:val="bs-Latn-BA"/>
+        </w:rPr>
+        <w:t xml:space="preserve">. </w:t>
+      </w:r>
+      <w:r>
+        <w:rPr>
+          <w:lang w:val="bs-Cyrl-BA"/>
+        </w:rPr>
+        <w:t>Р</w:t>
+      </w:r>
+      <w:r>
+        <w:rPr>
+          <w:lang w:val="bs-Cyrl-BA"/>
+        </w:rPr>
+        <w:t xml:space="preserve">азвој великих језичких модела </w:t>
+      </w:r>
+      <w:r>
+        <w:t xml:space="preserve">(енгл. </w:t>
+      </w:r>
+      <w:r>
+        <w:rPr>
+          <w:rStyle w:val="Emphasis"/>
+        </w:rPr>
+        <w:t>Large Language Models, LLM</w:t>
+      </w:r>
+      <w:r>
+        <w:t>)</w:t>
+      </w:r>
+      <w:r>
+        <w:rPr>
+          <w:lang w:val="bs-Cyrl-BA"/>
+        </w:rPr>
+        <w:t xml:space="preserve"> долази до великог напретка у области вештачке интелигенције. А</w:t>
+      </w:r>
+      <w:r>
+        <w:rPr>
           <w:lang w:val="en-US"/>
         </w:rPr>
-        <w:t xml:space="preserve"> </w:t>
-      </w:r>
-      <w:r>
-        <w:rPr>
-          <w:lang w:val="bs-Cyrl-BA"/>
-        </w:rPr>
-        <w:t xml:space="preserve">развој великих језичких модела </w:t>
-      </w:r>
-      <w:r>
-        <w:t xml:space="preserve">(енгл. </w:t>
-      </w:r>
-      <w:r>
-        <w:rPr>
-          <w:rStyle w:val="Emphasis"/>
-        </w:rPr>
-        <w:t>Large Language Models, LLM</w:t>
-      </w:r>
-      <w:r>
-        <w:t>)</w:t>
-      </w:r>
-      <w:r>
-        <w:rPr>
-          <w:lang w:val="bs-Cyrl-BA"/>
-        </w:rPr>
-        <w:t xml:space="preserve"> долази до великог напретка у области вештачке интелигенције. А</w:t>
-      </w:r>
-      <w:r>
-        <w:rPr>
-          <w:lang w:val="en-US"/>
-        </w:rPr>
         <w:t>I</w:t>
       </w:r>
       <w:r>
         <w:rPr>
           <w:lang w:val="bs-Cyrl-BA"/>
         </w:rPr>
-        <w:t xml:space="preserve"> алати су изузетно способни у разумевању и генерисању природног језика  омогућавајући аутоматско одговарање на питања, превод и сажимање текста, до помоћи у софтверском инжињерингу, образовању и општем животу људи.</w:t>
+        <w:t xml:space="preserve"> алати су изузетно способни у разумевању и генерисању природног језика  омогућавајући аутоматско одговарање на питања, превод и сажимање текста, до помоћи у софтверском инж</w:t>
+      </w:r>
+      <w:r>
+        <w:rPr>
+          <w:lang w:val="bs-Cyrl-BA"/>
+        </w:rPr>
+        <w:t>е</w:t>
+      </w:r>
+      <w:r>
+        <w:rPr>
+          <w:lang w:val="bs-Cyrl-BA"/>
+        </w:rPr>
+        <w:t>њерингу, образовању и општем животу људи.</w:t>
       </w:r>
     </w:p>
     <w:p>
@@ -26911,7 +27005,19 @@
         <w:rPr>
           <w:lang w:val="bs-Cyrl-BA"/>
         </w:rPr>
-        <w:t>Енглески језик, као најраспрострањенији језик света, има велику заступљеност у тренинг скуповима података и доступности алата за евалуацију. За разлику од енглеског, српски језик који припада категорији нискоресурсних језика</w:t>
+        <w:t>Енглески језик, као најраспрострањенији језик света, има велику заступљеност у тренинг скуповима података и доступности алата за евалуацију. За разлику од енглеског, српски језик</w:t>
+      </w:r>
+      <w:r>
+        <w:rPr>
+          <w:lang w:val="bs-Cyrl-BA"/>
+        </w:rPr>
+        <w:t>,</w:t>
+      </w:r>
+      <w:r>
+        <w:rPr>
+          <w:lang w:val="bs-Cyrl-BA"/>
+        </w:rPr>
+        <w:t xml:space="preserve"> који припада категорији нискоресурсних језика</w:t>
       </w:r>
       <w:r>
         <w:rPr>
@@ -26953,7 +27059,19 @@
         <w:rPr>
           <w:lang w:val="bs-Cyrl-BA"/>
         </w:rPr>
-        <w:t>еликих језичких модела на српском језику кроз 3 кљ</w:t>
+        <w:t xml:space="preserve">еликих језичких модела на српском језику кроз </w:t>
+      </w:r>
+      <w:r>
+        <w:rPr>
+          <w:lang w:val="bs-Cyrl-BA"/>
+        </w:rPr>
+        <w:t>три</w:t>
+      </w:r>
+      <w:r>
+        <w:rPr>
+          <w:lang w:val="bs-Cyrl-BA"/>
+        </w:rPr>
+        <w:t xml:space="preserve"> кљ</w:t>
       </w:r>
       <w:r>
         <w:rPr>
@@ -27249,7 +27367,31 @@
         <w:rPr>
           <w:lang w:val="bs-Cyrl-BA"/>
         </w:rPr>
-        <w:t>представљају класу модела вештачке интелигенције које имају способност да разумеју и генеришу људски језик. Они се тренирају на огромним скуповима података (милијардама страница са интернета, књига и научних радова) и садрже велики број параметара. Захваљујући томе, они су способни да воде разговор, разумеју</w:t>
+        <w:t xml:space="preserve">представљају класу модела вештачке интелигенције које </w:t>
+      </w:r>
+      <w:r>
+        <w:rPr>
+          <w:lang w:val="bs-Cyrl-BA"/>
+        </w:rPr>
+        <w:t>су</w:t>
+      </w:r>
+      <w:r>
+        <w:rPr>
+          <w:lang w:val="bs-Cyrl-BA"/>
+        </w:rPr>
+        <w:t xml:space="preserve"> способн</w:t>
+      </w:r>
+      <w:r>
+        <w:rPr>
+          <w:lang w:val="bs-Cyrl-BA"/>
+        </w:rPr>
+        <w:t>е</w:t>
+      </w:r>
+      <w:r>
+        <w:rPr>
+          <w:lang w:val="bs-Cyrl-BA"/>
+        </w:rPr>
+        <w:t xml:space="preserve"> да разумеју и генеришу људски језик. Они се тренирају на огромним скуповима података (милијардама страница са интернета, књига и научних радова) и садрже велики број параметара. Захваљујући томе, они су способни да воде разговор, разумеју</w:t>
       </w:r>
       <w:r>
         <w:rPr>
@@ -27432,7 +27574,13 @@
         <w:t xml:space="preserve"> на архитектури трансформера, који су представљени 2017. године у раду </w:t>
       </w:r>
       <w:r>
-        <w:t>"Attention Is All You Need"</w:t>
+        <w:rPr>
+          <w:lang w:val="bs-Cyrl-BA"/>
+        </w:rPr>
+        <w:t>„</w:t>
+      </w:r>
+      <w:r>
+        <w:t>Attention Is All You Need"</w:t>
       </w:r>
       <w:r>
         <w:t xml:space="preserve"> [1]</w:t>
@@ -27571,10 +27719,10 @@
         </w:rPr>
         <w:lastRenderedPageBreak/>
         <w:drawing>
-          <wp:inline distT="0" distB="0" distL="0" distR="0" wp14:anchorId="70423575" wp14:editId="5854B251">
-            <wp:extent cx="3859618" cy="3474322"/>
-            <wp:effectExtent l="0" t="0" r="7620" b="0"/>
-            <wp:docPr id="1" name="Picture 1"/>
+          <wp:inline distT="0" distB="0" distL="0" distR="0" wp14:anchorId="0387B603" wp14:editId="05AC78BE">
+            <wp:extent cx="5751799" cy="6400800"/>
+            <wp:effectExtent l="0" t="0" r="1905" b="0"/>
+            <wp:docPr id="1499728829" name="Picture 108"/>
             <wp:cNvGraphicFramePr>
               <a:graphicFrameLocks xmlns:a="http://schemas.openxmlformats.org/drawingml/2006/main" noChangeAspect="1"/>
             </wp:cNvGraphicFramePr>
@@ -27582,7 +27730,7 @@
               <a:graphicData uri="http://schemas.openxmlformats.org/drawingml/2006/picture">
                 <pic:pic xmlns:pic="http://schemas.openxmlformats.org/drawingml/2006/picture">
                   <pic:nvPicPr>
-                    <pic:cNvPr id="0" name="Picture 1"/>
+                    <pic:cNvPr id="0" name="Picture 5"/>
                     <pic:cNvPicPr>
                       <a:picLocks noChangeAspect="1" noChangeArrowheads="1"/>
                     </pic:cNvPicPr>
@@ -27603,7 +27751,7 @@
                   <pic:spPr bwMode="auto">
                     <a:xfrm>
                       <a:off x="0" y="0"/>
-                      <a:ext cx="3881440" cy="3493965"/>
+                      <a:ext cx="5788475" cy="6441614"/>
                     </a:xfrm>
                     <a:prstGeom prst="rect">
                       <a:avLst/>
@@ -27644,7 +27792,39 @@
           <w:sz w:val="22"/>
           <w:lang w:val="bs-Cyrl-BA"/>
         </w:rPr>
-        <w:t>, лева сдео представља енкодер, док је десна декодер</w:t>
+        <w:t>, лев</w:t>
+      </w:r>
+      <w:r>
+        <w:rPr>
+          <w:i/>
+          <w:sz w:val="22"/>
+          <w:lang w:val="bs-Cyrl-BA"/>
+        </w:rPr>
+        <w:t>и</w:t>
+      </w:r>
+      <w:r>
+        <w:rPr>
+          <w:i/>
+          <w:sz w:val="22"/>
+          <w:lang w:val="bs-Cyrl-BA"/>
+        </w:rPr>
+        <w:t xml:space="preserve"> део представља енкодер, док је десн</w:t>
+      </w:r>
+      <w:r>
+        <w:rPr>
+          <w:i/>
+          <w:sz w:val="22"/>
+          <w:lang w:val="bs-Cyrl-BA"/>
+        </w:rPr>
+        <w:t>и</w:t>
+      </w:r>
+      <w:r>
+        <w:rPr>
+          <w:i/>
+          <w:sz w:val="22"/>
+          <w:lang w:val="bs-Cyrl-BA"/>
+        </w:rPr>
+        <w:t xml:space="preserve"> декодер</w:t>
       </w:r>
     </w:p>
     <w:p>
@@ -27694,7 +27874,43 @@
         <w:rPr>
           <w:lang w:val="bs-Cyrl-BA"/>
         </w:rPr>
-        <w:t>На основу трансформаторске архитектуре развијена је нова генерација великих језичких модела, који су већ утренирани на огромним количинама података и способни да генеришу разумљив текст, одговарајући на питања, превод и писање кода.</w:t>
+        <w:t>На основу трансформ</w:t>
+      </w:r>
+      <w:r>
+        <w:rPr>
+          <w:lang w:val="bs-Cyrl-BA"/>
+        </w:rPr>
+        <w:t>е</w:t>
+      </w:r>
+      <w:r>
+        <w:rPr>
+          <w:lang w:val="bs-Cyrl-BA"/>
+        </w:rPr>
+        <w:t>рске архитектуре развијена је нова генерација великих језичких модела, који су већ утренирани на огромним количинама података и способни да генеришу разумљив текст, одговарајући на питања, превод</w:t>
+      </w:r>
+      <w:r>
+        <w:rPr>
+          <w:lang w:val="bs-Cyrl-BA"/>
+        </w:rPr>
+        <w:t>ећи</w:t>
+      </w:r>
+      <w:r>
+        <w:rPr>
+          <w:lang w:val="bs-Cyrl-BA"/>
+        </w:rPr>
+        <w:t xml:space="preserve"> и пи</w:t>
+      </w:r>
+      <w:r>
+        <w:rPr>
+          <w:lang w:val="bs-Cyrl-BA"/>
+        </w:rPr>
+        <w:t>шући</w:t>
+      </w:r>
+      <w:r>
+        <w:rPr>
+          <w:lang w:val="bs-Cyrl-BA"/>
+        </w:rPr>
+        <w:t xml:space="preserve"> кода.</w:t>
       </w:r>
     </w:p>
     <w:p>
@@ -27725,7 +27941,20 @@
         <w:t xml:space="preserve"> </w:t>
       </w:r>
       <w:r>
-        <w:t>Тренiran је на вишејезичном корпусу и представља један од најмоћнијих јавно доступних модела. Приступ је омогућен путем API-ја, а карактерише га висок ниво разумевања контекста и способност дугих разговора</w:t>
+        <w:t>Трен</w:t>
+      </w:r>
+      <w:r>
+        <w:rPr>
+          <w:lang w:val="bs-Cyrl-BA"/>
+        </w:rPr>
+        <w:t>иран</w:t>
+      </w:r>
+      <w:r>
+        <w:t xml:space="preserve"> је на вишејезичном корпусу и представља један од најмоћнијих јавно доступних модела. Приступ је </w:t>
+      </w:r>
+      <w:r>
+        <w:lastRenderedPageBreak/>
+        <w:t>омогућен путем API-ја, а карактерише га висок ниво разумевања контекста и способност дугих разговора</w:t>
       </w:r>
       <w:r>
         <w:rPr>
@@ -27825,7 +28054,6 @@
           <w:b/>
           <w:lang w:val="bs-Cyrl-BA"/>
         </w:rPr>
-        <w:lastRenderedPageBreak/>
         <w:t>Mistral Small</w:t>
       </w:r>
       <w:r>
@@ -27961,7 +28189,19 @@
         <w:rPr>
           <w:lang w:val="bs-Cyrl-BA"/>
         </w:rPr>
-        <w:t xml:space="preserve"> тога јесте да модели могу да показују мању тачност на питања специфичним за српску историју, културу и књижевност, такође су ск</w:t>
+        <w:t xml:space="preserve"> тога јесте да модели могу да показују мању тачност на питања специфичн</w:t>
+      </w:r>
+      <w:r>
+        <w:rPr>
+          <w:lang w:val="bs-Cyrl-BA"/>
+        </w:rPr>
+        <w:t>а</w:t>
+      </w:r>
+      <w:r>
+        <w:rPr>
+          <w:lang w:val="bs-Cyrl-BA"/>
+        </w:rPr>
+        <w:t xml:space="preserve"> за српску историју, културу и књижевност, такође су ск</w:t>
       </w:r>
       <w:r>
         <w:rPr>
@@ -28016,7 +28256,16 @@
         <w:t>mT5</w:t>
       </w:r>
       <w:r>
-        <w:t>[10]</w:t>
+        <w:t xml:space="preserve"> </w:t>
+      </w:r>
+      <w:r>
+        <w:t>[</w:t>
+      </w:r>
+      <w:r>
+        <w:t>3</w:t>
+      </w:r>
+      <w:r>
+        <w:t>]</w:t>
       </w:r>
       <w:r>
         <w:t xml:space="preserve"> бенчмаркова</w:t>
@@ -28034,7 +28283,13 @@
         <w:t xml:space="preserve"> </w:t>
       </w:r>
       <w:r>
-        <w:t>Истраживачи су такође упозорили на етичке ризике великих модела тренираних на неуравнотеженим подацима [11].</w:t>
+        <w:t>Истраживачи су такође упозорили на етичке ризике великих модела тренираних на неуравнотеженим подацима [</w:t>
+      </w:r>
+      <w:r>
+        <w:t>4</w:t>
+      </w:r>
+      <w:r>
+        <w:t>].</w:t>
       </w:r>
       <w:r>
         <w:t xml:space="preserve"> </w:t>
@@ -28060,11 +28315,12 @@
         <w:rPr>
           <w:noProof/>
         </w:rPr>
+        <w:lastRenderedPageBreak/>
         <w:drawing>
-          <wp:inline distT="0" distB="0" distL="0" distR="0" wp14:anchorId="302B5EE0" wp14:editId="2D6C6084">
-            <wp:extent cx="3168650" cy="2073275"/>
-            <wp:effectExtent l="0" t="0" r="0" b="3175"/>
-            <wp:docPr id="516850978" name="Picture 106"/>
+          <wp:inline distT="0" distB="0" distL="0" distR="0" wp14:anchorId="629576E4" wp14:editId="03C412B5">
+            <wp:extent cx="5069563" cy="3087584"/>
+            <wp:effectExtent l="0" t="0" r="0" b="0"/>
+            <wp:docPr id="38222570" name="Picture 109"/>
             <wp:cNvGraphicFramePr>
               <a:graphicFrameLocks xmlns:a="http://schemas.openxmlformats.org/drawingml/2006/main" noChangeAspect="1"/>
             </wp:cNvGraphicFramePr>
@@ -28072,13 +28328,13 @@
               <a:graphicData uri="http://schemas.openxmlformats.org/drawingml/2006/picture">
                 <pic:pic xmlns:pic="http://schemas.openxmlformats.org/drawingml/2006/picture">
                   <pic:nvPicPr>
-                    <pic:cNvPr id="0" name="Picture 1"/>
+                    <pic:cNvPr id="0" name="Picture 7"/>
                     <pic:cNvPicPr>
                       <a:picLocks noChangeAspect="1" noChangeArrowheads="1"/>
                     </pic:cNvPicPr>
                   </pic:nvPicPr>
                   <pic:blipFill>
-                    <a:blip r:embed="rId16">
+                    <a:blip r:embed="rId16" cstate="print">
                       <a:extLst>
                         <a:ext uri="{28A0092B-C50C-407E-A947-70E740481C1C}">
                           <a14:useLocalDpi xmlns:a14="http://schemas.microsoft.com/office/drawing/2010/main" val="0"/>
@@ -28093,7 +28349,7 @@
                   <pic:spPr bwMode="auto">
                     <a:xfrm>
                       <a:off x="0" y="0"/>
-                      <a:ext cx="3168650" cy="2073275"/>
+                      <a:ext cx="5098735" cy="3105351"/>
                     </a:xfrm>
                     <a:prstGeom prst="rect">
                       <a:avLst/>
@@ -28160,14 +28416,31 @@
         </w:rPr>
       </w:pPr>
       <w:r>
-        <w:lastRenderedPageBreak/>
-        <w:t>Подаци из Common Crawl скупа података, који представља основу тренинга већине савремених LLM-ова, јасно илуструју овај јаз. Енглески језик чини око 41% свих података, dok српски језик заузима свега 0.26%, što ga сврстава међу најмање заступљене језике у тренинг скуповима [</w:t>
-      </w:r>
-      <w:r>
-        <w:t>16</w:t>
-      </w:r>
-      <w:r>
-        <w:t>]. Овај однос од преко 150:1 директно утиче на квалитет одговора модела на српском језику.</w:t>
+        <w:t xml:space="preserve">Подаци из Common Crawl скупа података, који представља основу тренинга већине савремених LLM-ова, јасно илуструју овај јаз. Енглески језик чини око 41% свих података, </w:t>
+      </w:r>
+      <w:r>
+        <w:rPr>
+          <w:lang w:val="bs-Cyrl-BA"/>
+        </w:rPr>
+        <w:t>док</w:t>
+      </w:r>
+      <w:r>
+        <w:t xml:space="preserve"> српски језик заузима свега 0.26%, </w:t>
+      </w:r>
+      <w:r>
+        <w:rPr>
+          <w:lang w:val="bs-Cyrl-BA"/>
+        </w:rPr>
+        <w:t>што га</w:t>
+      </w:r>
+      <w:r>
+        <w:t xml:space="preserve"> сврстава међу најмање заступљене језике у тренинг скуповима [</w:t>
+      </w:r>
+      <w:r>
+        <w:t>5]</w:t>
+      </w:r>
+      <w:r>
+        <w:t>. Овај однос од преко 150:1 директно утиче на квалитет одговора модела на српском језику.</w:t>
       </w:r>
     </w:p>
     <w:p>
@@ -28299,7 +28572,19 @@
         <w:rPr>
           <w:lang w:val="bs-Cyrl-BA"/>
         </w:rPr>
-        <w:t>Евалуације је спроведена кроз три димензије које представљају неке од битних карактеристике језичких модела.</w:t>
+        <w:t>Евалуациј</w:t>
+      </w:r>
+      <w:r>
+        <w:rPr>
+          <w:lang w:val="bs-Cyrl-BA"/>
+        </w:rPr>
+        <w:t>а</w:t>
+      </w:r>
+      <w:r>
+        <w:rPr>
+          <w:lang w:val="bs-Cyrl-BA"/>
+        </w:rPr>
+        <w:t xml:space="preserve"> је спроведена кроз три димензије које представљају неке од битних карактеристике језичких модела.</w:t>
       </w:r>
     </w:p>
     <w:p>
@@ -28358,6 +28643,7 @@
         <w:rPr>
           <w:i/>
         </w:rPr>
+        <w:lastRenderedPageBreak/>
         <w:t>Тачност = (број тачних одговора / укупан број питања) × 100%</w:t>
       </w:r>
     </w:p>
@@ -28409,7 +28695,19 @@
         <w:rPr>
           <w:lang w:val="bs-Cyrl-BA"/>
         </w:rPr>
-        <w:t xml:space="preserve"> обухватају разне начине замки на основу којих модел генерише одговоре које су наизглед тачно, а заправо представљају нетачне или потпуно измишљене информације. Типови замки могу бити разноврсни:</w:t>
+        <w:t xml:space="preserve"> обухватају разне начине замки на основу којих модел генерише одговоре које су наизглед тачн</w:t>
+      </w:r>
+      <w:r>
+        <w:rPr>
+          <w:lang w:val="bs-Cyrl-BA"/>
+        </w:rPr>
+        <w:t>и</w:t>
+      </w:r>
+      <w:r>
+        <w:rPr>
+          <w:lang w:val="bs-Cyrl-BA"/>
+        </w:rPr>
+        <w:t>, а заправо представљају нетачне или потпуно измишљене информације. Типови замки могу бити разноврсни:</w:t>
       </w:r>
       <w:r>
         <w:rPr>
@@ -28453,14 +28751,25 @@
           <w:b/>
           <w:lang w:val="bs-Cyrl-BA"/>
         </w:rPr>
-        <w:lastRenderedPageBreak/>
         <w:t>Конзистентност</w:t>
       </w:r>
       <w:r>
         <w:rPr>
           <w:lang w:val="bs-Cyrl-BA"/>
         </w:rPr>
-        <w:t xml:space="preserve"> мери да ли модел даје исти одговор на иста питања али формулисана на различите начине. У случају да модел даје различите одговоре, указује на то да суштину питања неразуме, већ одговара насумично.</w:t>
+        <w:t xml:space="preserve"> мери да ли модел даје исти одговор на иста питања али формулисана на различите начине. У случају да модел даје различите одговоре, указује на то да суштину питања не</w:t>
+      </w:r>
+      <w:r>
+        <w:rPr>
+          <w:lang w:val="bs-Cyrl-BA"/>
+        </w:rPr>
+        <w:t xml:space="preserve"> </w:t>
+      </w:r>
+      <w:r>
+        <w:rPr>
+          <w:lang w:val="bs-Cyrl-BA"/>
+        </w:rPr>
+        <w:t>разуме, већ одговара насумично.</w:t>
       </w:r>
     </w:p>
     <w:p>
@@ -28560,44 +28869,7 @@
           <w:b w:val="0"/>
           <w:bCs w:val="0"/>
         </w:rPr>
-        <w:t>[7]</w:t>
-      </w:r>
-      <w:r>
-        <w:t xml:space="preserve"> (Massive Multitask Language Understanding)</w:t>
-      </w:r>
-      <w:r>
-        <w:rPr>
-          <w:lang w:val="bs-Cyrl-BA"/>
-        </w:rPr>
-        <w:t xml:space="preserve"> је бенчмарк који обухвата велики број академских области, од математике и физике до спорта и медицине, које служе за мерење знања модела вештачке интелигенције.</w:t>
-      </w:r>
-    </w:p>
-    <w:p>
-      <w:pPr>
-        <w:ind w:left="624" w:right="0"/>
-        <w:rPr>
-          <w:lang w:val="bs-Cyrl-BA"/>
-        </w:rPr>
-      </w:pPr>
-    </w:p>
-    <w:p>
-      <w:pPr>
-        <w:ind w:left="624" w:right="0"/>
-        <w:rPr>
-          <w:lang w:val="bs-Cyrl-BA"/>
-        </w:rPr>
-      </w:pPr>
-      <w:r>
-        <w:rPr>
-          <w:rStyle w:val="Strong"/>
-        </w:rPr>
-        <w:t>TruthfulQA</w:t>
-      </w:r>
-      <w:r>
-        <w:rPr>
-          <w:rStyle w:val="Strong"/>
-        </w:rPr>
-        <w:t xml:space="preserve"> </w:t>
+        <w:t>[</w:t>
       </w:r>
       <w:r>
         <w:rPr>
@@ -28605,44 +28877,7 @@
           <w:b w:val="0"/>
           <w:bCs w:val="0"/>
         </w:rPr>
-        <w:t>[6]</w:t>
-      </w:r>
-      <w:r>
-        <w:t xml:space="preserve"> је бенчмарк специјално</w:t>
-      </w:r>
-      <w:r>
-        <w:rPr>
-          <w:lang w:val="bs-Cyrl-BA"/>
-        </w:rPr>
-        <w:t xml:space="preserve"> дизајниран за мерење истинитости одговара. Састоји се од 817 питања из свих бранши, који су смишљени тако да провоцирају модел да лаже или смишља неке теорије завере.</w:t>
-      </w:r>
-    </w:p>
-    <w:p>
-      <w:pPr>
-        <w:ind w:left="624" w:right="0"/>
-        <w:rPr>
-          <w:lang w:val="bs-Cyrl-BA"/>
-        </w:rPr>
-      </w:pPr>
-    </w:p>
-    <w:p>
-      <w:pPr>
-        <w:ind w:left="624" w:right="0"/>
-        <w:rPr>
-          <w:lang w:val="bs-Cyrl-BA"/>
-        </w:rPr>
-      </w:pPr>
-      <w:r>
-        <w:rPr>
-          <w:rStyle w:val="Strong"/>
-        </w:rPr>
-        <w:t>BIG-Bench</w:t>
-      </w:r>
-      <w:r>
-        <w:rPr>
-          <w:rStyle w:val="Strong"/>
-        </w:rPr>
-        <w:t xml:space="preserve"> </w:t>
+        <w:t>6</w:t>
       </w:r>
       <w:r>
         <w:rPr>
@@ -28650,6 +28885,112 @@
           <w:b w:val="0"/>
           <w:bCs w:val="0"/>
         </w:rPr>
+        <w:t>]</w:t>
+      </w:r>
+      <w:r>
+        <w:t xml:space="preserve"> (Massive Multitask Language Understanding)</w:t>
+      </w:r>
+      <w:r>
+        <w:rPr>
+          <w:lang w:val="bs-Cyrl-BA"/>
+        </w:rPr>
+        <w:t xml:space="preserve"> је бенчмарк који обухвата велики број академских области, од математике и физике до спорта и медицине, које служе за мерење знања модела вештачке интелигенције.</w:t>
+      </w:r>
+    </w:p>
+    <w:p>
+      <w:pPr>
+        <w:ind w:left="624" w:right="0"/>
+        <w:rPr>
+          <w:lang w:val="bs-Cyrl-BA"/>
+        </w:rPr>
+      </w:pPr>
+    </w:p>
+    <w:p>
+      <w:pPr>
+        <w:ind w:left="624" w:right="0"/>
+        <w:rPr>
+          <w:lang w:val="bs-Cyrl-BA"/>
+        </w:rPr>
+      </w:pPr>
+      <w:r>
+        <w:rPr>
+          <w:rStyle w:val="Strong"/>
+        </w:rPr>
+        <w:t>TruthfulQA</w:t>
+      </w:r>
+      <w:r>
+        <w:rPr>
+          <w:rStyle w:val="Strong"/>
+        </w:rPr>
+        <w:t xml:space="preserve"> </w:t>
+      </w:r>
+      <w:r>
+        <w:rPr>
+          <w:rStyle w:val="Strong"/>
+          <w:b w:val="0"/>
+          <w:bCs w:val="0"/>
+        </w:rPr>
+        <w:t>[</w:t>
+      </w:r>
+      <w:r>
+        <w:rPr>
+          <w:rStyle w:val="Strong"/>
+          <w:b w:val="0"/>
+          <w:bCs w:val="0"/>
+        </w:rPr>
+        <w:t>7</w:t>
+      </w:r>
+      <w:r>
+        <w:rPr>
+          <w:rStyle w:val="Strong"/>
+          <w:b w:val="0"/>
+          <w:bCs w:val="0"/>
+        </w:rPr>
+        <w:t>]</w:t>
+      </w:r>
+      <w:r>
+        <w:t xml:space="preserve"> је бенчмарк специјално</w:t>
+      </w:r>
+      <w:r>
+        <w:rPr>
+          <w:lang w:val="bs-Cyrl-BA"/>
+        </w:rPr>
+        <w:t xml:space="preserve"> дизајниран за мерење истинитости одговара. Састоји се од 817 питања из свих бранши, који су смишљени тако да провоцирају модел да лаже или смишља неке теорије завере.</w:t>
+      </w:r>
+    </w:p>
+    <w:p>
+      <w:pPr>
+        <w:ind w:left="624" w:right="0"/>
+        <w:rPr>
+          <w:lang w:val="bs-Cyrl-BA"/>
+        </w:rPr>
+      </w:pPr>
+    </w:p>
+    <w:p>
+      <w:pPr>
+        <w:ind w:left="624" w:right="0"/>
+        <w:rPr>
+          <w:lang w:val="bs-Cyrl-BA"/>
+        </w:rPr>
+      </w:pPr>
+      <w:r>
+        <w:rPr>
+          <w:rStyle w:val="Strong"/>
+        </w:rPr>
+        <w:t>BIG-Bench</w:t>
+      </w:r>
+      <w:r>
+        <w:rPr>
+          <w:rStyle w:val="Strong"/>
+        </w:rPr>
+        <w:t xml:space="preserve"> </w:t>
+      </w:r>
+      <w:r>
+        <w:rPr>
+          <w:rStyle w:val="Strong"/>
+          <w:b w:val="0"/>
+          <w:bCs w:val="0"/>
+        </w:rPr>
         <w:t>[8]</w:t>
       </w:r>
       <w:r>
@@ -28665,7 +29006,31 @@
         <w:rPr>
           <w:lang w:val="bs-Cyrl-BA"/>
         </w:rPr>
-        <w:t xml:space="preserve"> је колаборативни пројекат који се састоји од великог скупа комплексних задатака креиран од стране инжињера, тестирајући способности модела и логичко закљичивање.</w:t>
+        <w:t xml:space="preserve"> је колаборативни пројекат који се састоји од великог скупа комплексних задатака креиран од стране инж</w:t>
+      </w:r>
+      <w:r>
+        <w:rPr>
+          <w:lang w:val="bs-Cyrl-BA"/>
+        </w:rPr>
+        <w:t>е</w:t>
+      </w:r>
+      <w:r>
+        <w:rPr>
+          <w:lang w:val="bs-Cyrl-BA"/>
+        </w:rPr>
+        <w:t>њера, тестирајући способности модела и логичко закљ</w:t>
+      </w:r>
+      <w:r>
+        <w:rPr>
+          <w:lang w:val="bs-Cyrl-BA"/>
+        </w:rPr>
+        <w:t>у</w:t>
+      </w:r>
+      <w:r>
+        <w:rPr>
+          <w:lang w:val="bs-Cyrl-BA"/>
+        </w:rPr>
+        <w:t>чивање.</w:t>
       </w:r>
     </w:p>
     <w:p>
@@ -28794,14 +29159,7 @@
         <w:rPr>
           <w:lang w:val="bs-Cyrl-BA"/>
         </w:rPr>
-        <w:t xml:space="preserve">српског језика доводи до </w:t>
-      </w:r>
-      <w:r>
-        <w:rPr>
-          <w:lang w:val="bs-Cyrl-BA"/>
-        </w:rPr>
-        <w:lastRenderedPageBreak/>
-        <w:t>лошег квалитета разумевања јер токенизатори су тренирани већином на енглеском а не на српском језику.</w:t>
+        <w:t>српског језика доводи до лошег квалитета разумевања јер токенизатори су тренирани већином на енглеском а не на српском језику.</w:t>
       </w:r>
     </w:p>
     <w:p>
@@ -28901,7 +29259,19 @@
         <w:rPr>
           <w:lang w:val="bs-Cyrl-BA"/>
         </w:rPr>
-        <w:t xml:space="preserve">су једне од највећих изазова у развоју </w:t>
+        <w:t>су јед</w:t>
+      </w:r>
+      <w:r>
+        <w:rPr>
+          <w:lang w:val="bs-Cyrl-BA"/>
+        </w:rPr>
+        <w:t>ан</w:t>
+      </w:r>
+      <w:r>
+        <w:rPr>
+          <w:lang w:val="bs-Cyrl-BA"/>
+        </w:rPr>
+        <w:t xml:space="preserve"> од највећих изазова у развоју </w:t>
       </w:r>
       <w:r>
         <w:rPr>
@@ -29007,7 +29377,7 @@
       <w:tblPr>
         <w:tblStyle w:val="TableGrid0"/>
         <w:tblpPr w:leftFromText="180" w:rightFromText="180" w:vertAnchor="text" w:horzAnchor="margin" w:tblpXSpec="right" w:tblpY="99"/>
-        <w:tblW w:w="8849" w:type="dxa"/>
+        <w:tblW w:w="8991" w:type="dxa"/>
         <w:tblBorders>
           <w:left w:val="none" w:sz="0" w:space="0" w:color="auto"/>
           <w:right w:val="none" w:sz="0" w:space="0" w:color="auto"/>
@@ -29016,8 +29386,8 @@
         <w:tblLook w:val="04A0" w:firstRow="1" w:lastRow="0" w:firstColumn="1" w:lastColumn="0" w:noHBand="0" w:noVBand="1"/>
       </w:tblPr>
       <w:tblGrid>
-        <w:gridCol w:w="2332"/>
-        <w:gridCol w:w="4057"/>
+        <w:gridCol w:w="2552"/>
+        <w:gridCol w:w="3979"/>
         <w:gridCol w:w="2460"/>
       </w:tblGrid>
       <w:tr>
@@ -29026,11 +29396,11 @@
         </w:trPr>
         <w:tc>
           <w:tcPr>
-            <w:tcW w:w="2268" w:type="dxa"/>
+            <w:tcW w:w="2552" w:type="dxa"/>
           </w:tcPr>
           <w:p>
             <w:pPr>
-              <w:ind w:left="624" w:right="0" w:firstLine="0"/>
+              <w:ind w:left="0" w:right="0" w:firstLine="0"/>
               <w:rPr>
                 <w:b/>
                 <w:lang w:val="bs-Cyrl-BA"/>
@@ -29041,17 +29411,18 @@
                 <w:b/>
                 <w:lang w:val="bs-Cyrl-BA"/>
               </w:rPr>
-              <w:t xml:space="preserve">Тип халуцинације </w:t>
+              <w:lastRenderedPageBreak/>
+              <w:t>Тип халуцинације</w:t>
             </w:r>
           </w:p>
         </w:tc>
         <w:tc>
           <w:tcPr>
-            <w:tcW w:w="4111" w:type="dxa"/>
+            <w:tcW w:w="3979" w:type="dxa"/>
           </w:tcPr>
           <w:p>
             <w:pPr>
-              <w:ind w:left="624" w:right="0" w:firstLine="0"/>
+              <w:ind w:left="57" w:right="0" w:firstLine="0"/>
               <w:rPr>
                 <w:b/>
                 <w:lang w:val="bs-Cyrl-BA"/>
@@ -29068,11 +29439,11 @@
         </w:tc>
         <w:tc>
           <w:tcPr>
-            <w:tcW w:w="2470" w:type="dxa"/>
+            <w:tcW w:w="2460" w:type="dxa"/>
           </w:tcPr>
           <w:p>
             <w:pPr>
-              <w:ind w:left="624" w:right="0" w:firstLine="0"/>
+              <w:ind w:left="57" w:right="0" w:firstLine="0"/>
               <w:rPr>
                 <w:b/>
                 <w:lang w:val="bs-Cyrl-BA"/>
@@ -29094,12 +29465,13 @@
         </w:trPr>
         <w:tc>
           <w:tcPr>
-            <w:tcW w:w="2268" w:type="dxa"/>
+            <w:tcW w:w="2552" w:type="dxa"/>
           </w:tcPr>
           <w:p>
             <w:pPr>
-              <w:ind w:left="624" w:right="0" w:firstLine="0"/>
-              <w:rPr>
+              <w:ind w:left="0" w:right="0" w:firstLine="0"/>
+              <w:rPr>
+                <w:sz w:val="22"/>
                 <w:lang w:val="bs-Cyrl-BA"/>
               </w:rPr>
             </w:pPr>
@@ -29114,11 +29486,11 @@
         </w:tc>
         <w:tc>
           <w:tcPr>
-            <w:tcW w:w="4111" w:type="dxa"/>
+            <w:tcW w:w="3979" w:type="dxa"/>
           </w:tcPr>
           <w:p>
             <w:pPr>
-              <w:ind w:left="624" w:right="0" w:firstLine="0"/>
+              <w:ind w:left="57" w:right="0" w:firstLine="0"/>
               <w:rPr>
                 <w:sz w:val="22"/>
                 <w:lang w:val="en-US"/>
@@ -29127,9 +29499,9 @@
             <w:r>
               <w:rPr>
                 <w:sz w:val="22"/>
-                <w:lang w:val="en-US"/>
-              </w:rPr>
-              <w:t>”</w:t>
+                <w:lang w:val="bs-Cyrl-BA"/>
+              </w:rPr>
+              <w:t>„</w:t>
             </w:r>
             <w:r>
               <w:rPr>
@@ -29149,11 +29521,11 @@
         </w:tc>
         <w:tc>
           <w:tcPr>
-            <w:tcW w:w="2470" w:type="dxa"/>
+            <w:tcW w:w="2460" w:type="dxa"/>
           </w:tcPr>
           <w:p>
             <w:pPr>
-              <w:ind w:left="624" w:right="0" w:firstLine="0"/>
+              <w:ind w:left="57" w:right="0" w:firstLine="0"/>
               <w:rPr>
                 <w:sz w:val="22"/>
                 <w:lang w:val="bs-Cyrl-BA"/>
@@ -29164,7 +29536,21 @@
                 <w:sz w:val="22"/>
                 <w:lang w:val="bs-Cyrl-BA"/>
               </w:rPr>
-              <w:t>Одбијење</w:t>
+              <w:t>Одбиј</w:t>
+            </w:r>
+            <w:r>
+              <w:rPr>
+                <w:sz w:val="22"/>
+                <w:lang w:val="bs-Cyrl-BA"/>
+              </w:rPr>
+              <w:t>а</w:t>
+            </w:r>
+            <w:r>
+              <w:rPr>
+                <w:sz w:val="22"/>
+                <w:lang w:val="bs-Cyrl-BA"/>
+              </w:rPr>
+              <w:t>ње</w:t>
             </w:r>
           </w:p>
         </w:tc>
@@ -29175,12 +29561,13 @@
         </w:trPr>
         <w:tc>
           <w:tcPr>
-            <w:tcW w:w="2268" w:type="dxa"/>
+            <w:tcW w:w="2552" w:type="dxa"/>
           </w:tcPr>
           <w:p>
             <w:pPr>
-              <w:ind w:left="624" w:right="0" w:firstLine="0"/>
-              <w:rPr>
+              <w:ind w:left="0" w:right="0" w:firstLine="0"/>
+              <w:rPr>
+                <w:sz w:val="22"/>
                 <w:lang w:val="bs-Cyrl-BA"/>
               </w:rPr>
             </w:pPr>
@@ -29195,20 +29582,22 @@
         </w:tc>
         <w:tc>
           <w:tcPr>
-            <w:tcW w:w="4111" w:type="dxa"/>
+            <w:tcW w:w="3979" w:type="dxa"/>
           </w:tcPr>
           <w:p>
             <w:pPr>
-              <w:ind w:left="624" w:right="0" w:firstLine="0"/>
-              <w:rPr>
+              <w:ind w:left="57" w:right="0" w:firstLine="0"/>
+              <w:rPr>
+                <w:sz w:val="22"/>
                 <w:lang w:val="en-US"/>
               </w:rPr>
             </w:pPr>
             <w:r>
               <w:rPr>
-                <w:lang w:val="en-US"/>
-              </w:rPr>
-              <w:t>“</w:t>
+                <w:sz w:val="22"/>
+                <w:lang w:val="bs-Cyrl-BA"/>
+              </w:rPr>
+              <w:t>„</w:t>
             </w:r>
             <w:r>
               <w:rPr>
@@ -29228,17 +29617,19 @@
         </w:tc>
         <w:tc>
           <w:tcPr>
-            <w:tcW w:w="2470" w:type="dxa"/>
+            <w:tcW w:w="2460" w:type="dxa"/>
           </w:tcPr>
           <w:p>
             <w:pPr>
-              <w:ind w:left="624" w:right="0" w:firstLine="0"/>
-              <w:rPr>
+              <w:ind w:left="57" w:right="0" w:firstLine="0"/>
+              <w:rPr>
+                <w:sz w:val="22"/>
                 <w:lang w:val="bs-Cyrl-BA"/>
               </w:rPr>
             </w:pPr>
             <w:r>
               <w:rPr>
+                <w:sz w:val="22"/>
                 <w:lang w:val="bs-Cyrl-BA"/>
               </w:rPr>
               <w:t>Упозорење</w:t>
@@ -29252,11 +29643,11 @@
         </w:trPr>
         <w:tc>
           <w:tcPr>
-            <w:tcW w:w="2268" w:type="dxa"/>
+            <w:tcW w:w="2552" w:type="dxa"/>
           </w:tcPr>
           <w:p>
             <w:pPr>
-              <w:ind w:left="624" w:right="0" w:firstLine="0"/>
+              <w:ind w:left="0" w:right="0" w:firstLine="0"/>
               <w:rPr>
                 <w:sz w:val="22"/>
                 <w:lang w:val="bs-Cyrl-BA"/>
@@ -29273,11 +29664,11 @@
         </w:tc>
         <w:tc>
           <w:tcPr>
-            <w:tcW w:w="4111" w:type="dxa"/>
+            <w:tcW w:w="3979" w:type="dxa"/>
           </w:tcPr>
           <w:p>
             <w:pPr>
-              <w:ind w:left="624" w:right="0" w:firstLine="0"/>
+              <w:ind w:left="57" w:right="0" w:firstLine="0"/>
               <w:rPr>
                 <w:sz w:val="22"/>
                 <w:lang w:val="en-US"/>
@@ -29286,9 +29677,9 @@
             <w:r>
               <w:rPr>
                 <w:sz w:val="22"/>
-                <w:lang w:val="en-US"/>
-              </w:rPr>
-              <w:t>“</w:t>
+                <w:lang w:val="bs-Cyrl-BA"/>
+              </w:rPr>
+              <w:t>„</w:t>
             </w:r>
             <w:r>
               <w:rPr>
@@ -29308,12 +29699,13 @@
         </w:tc>
         <w:tc>
           <w:tcPr>
-            <w:tcW w:w="2470" w:type="dxa"/>
+            <w:tcW w:w="2460" w:type="dxa"/>
           </w:tcPr>
           <w:p>
             <w:pPr>
-              <w:ind w:left="624" w:right="0" w:firstLine="0"/>
-              <w:rPr>
+              <w:ind w:left="57" w:right="0" w:firstLine="0"/>
+              <w:rPr>
+                <w:sz w:val="22"/>
                 <w:lang w:val="bs-Cyrl-BA"/>
               </w:rPr>
             </w:pPr>
@@ -29333,12 +29725,13 @@
         </w:trPr>
         <w:tc>
           <w:tcPr>
-            <w:tcW w:w="2268" w:type="dxa"/>
+            <w:tcW w:w="2552" w:type="dxa"/>
           </w:tcPr>
           <w:p>
             <w:pPr>
-              <w:ind w:left="624" w:right="0" w:firstLine="0"/>
-              <w:rPr>
+              <w:ind w:left="0" w:right="0" w:firstLine="0"/>
+              <w:rPr>
+                <w:sz w:val="22"/>
                 <w:lang w:val="bs-Cyrl-BA"/>
               </w:rPr>
             </w:pPr>
@@ -29353,29 +29746,33 @@
         </w:tc>
         <w:tc>
           <w:tcPr>
-            <w:tcW w:w="4111" w:type="dxa"/>
+            <w:tcW w:w="3979" w:type="dxa"/>
           </w:tcPr>
           <w:p>
             <w:pPr>
-              <w:ind w:left="624" w:right="0" w:firstLine="0"/>
-              <w:rPr>
+              <w:ind w:left="57" w:right="0" w:firstLine="0"/>
+              <w:rPr>
+                <w:sz w:val="22"/>
                 <w:lang w:val="en-US"/>
               </w:rPr>
             </w:pPr>
             <w:r>
               <w:rPr>
-                <w:lang w:val="en-US"/>
-              </w:rPr>
-              <w:t>“</w:t>
-            </w:r>
-            <w:r>
-              <w:rPr>
+                <w:sz w:val="22"/>
                 <w:lang w:val="bs-Cyrl-BA"/>
               </w:rPr>
+              <w:t>„</w:t>
+            </w:r>
+            <w:r>
+              <w:rPr>
+                <w:sz w:val="22"/>
+                <w:lang w:val="bs-Cyrl-BA"/>
+              </w:rPr>
               <w:t xml:space="preserve">Број становника Ниша 15.4.1902 </w:t>
             </w:r>
             <w:r>
               <w:rPr>
+                <w:sz w:val="22"/>
                 <w:lang w:val="en-US"/>
               </w:rPr>
               <w:t>”</w:t>
@@ -29384,17 +29781,19 @@
         </w:tc>
         <w:tc>
           <w:tcPr>
-            <w:tcW w:w="2470" w:type="dxa"/>
+            <w:tcW w:w="2460" w:type="dxa"/>
           </w:tcPr>
           <w:p>
             <w:pPr>
-              <w:ind w:left="624" w:right="0" w:firstLine="0"/>
-              <w:rPr>
+              <w:ind w:left="57" w:right="0" w:firstLine="0"/>
+              <w:rPr>
+                <w:sz w:val="22"/>
                 <w:lang w:val="bs-Cyrl-BA"/>
               </w:rPr>
             </w:pPr>
             <w:r>
               <w:rPr>
+                <w:sz w:val="22"/>
                 <w:lang w:val="bs-Cyrl-BA"/>
               </w:rPr>
               <w:t>Несигурност</w:t>
@@ -29477,8 +29876,37 @@
         <w:rPr>
           <w:lang w:val="bs-Cyrl-BA"/>
         </w:rPr>
-        <w:lastRenderedPageBreak/>
-        <w:t>Ручна евалуација подразумева да људски оцењивач пореди одговор модела са верификованим извором и одлучује да ли је одговор тачан. Ово је најпоузданија метода, али је временски захтевна и не скалира добро на велике скупове података. У овом раду коришћена је ручна евалуација за свих 100 питања из категорије халуцинација.</w:t>
+        <w:t xml:space="preserve">Ручна евалуација подразумева да људски оцењивач пореди одговор модела са верификованим извором и одлучује да ли је одговор тачан. Ово је најпоузданија метода, али је временски захтевна и не скалира добро на велике скупове података. У овом раду коришћена је ручна евалуација за свих </w:t>
+      </w:r>
+      <w:r>
+        <w:rPr>
+          <w:lang w:val="bs-Cyrl-BA"/>
+        </w:rPr>
+        <w:t>2</w:t>
+      </w:r>
+      <w:r>
+        <w:rPr>
+          <w:lang w:val="bs-Cyrl-BA"/>
+        </w:rPr>
+        <w:t>0</w:t>
+      </w:r>
+      <w:r>
+        <w:rPr>
+          <w:lang w:val="bs-Cyrl-BA"/>
+        </w:rPr>
+        <w:t xml:space="preserve"> питања из категорије</w:t>
+      </w:r>
+      <w:r>
+        <w:rPr>
+          <w:lang w:val="bs-Cyrl-BA"/>
+        </w:rPr>
+        <w:t xml:space="preserve"> халуцинације</w:t>
+      </w:r>
+      <w:r>
+        <w:rPr>
+          <w:lang w:val="bs-Cyrl-BA"/>
+        </w:rPr>
+        <w:t>.</w:t>
       </w:r>
     </w:p>
     <w:p>
@@ -29656,6 +30084,7 @@
       </w:pPr>
       <w:bookmarkStart w:id="14" w:name="_Toc230456505"/>
       <w:r>
+        <w:lastRenderedPageBreak/>
         <w:t>Дефиниција и мерење конзистентности</w:t>
       </w:r>
       <w:bookmarkEnd w:id="14"/>
@@ -29717,7 +30146,6 @@
         <w:rPr>
           <w:lang w:val="bs-Cyrl-BA"/>
         </w:rPr>
-        <w:lastRenderedPageBreak/>
         <w:t>Утицај формулације питања на одговор</w:t>
       </w:r>
       <w:bookmarkEnd w:id="15"/>
@@ -29862,22 +30290,32 @@
         <w:t xml:space="preserve">формација – </w:t>
       </w:r>
       <w:r>
-        <w:t>питање "Да ли је Иво Андрић добио Нобелову награду 1961. године?" може да добије другачији одговор него "Које године је Иво Андрић добио Нобелову награду?" иако се ради о истој чињеници. Модел у првом случају може да потврди нетачан датум наведен у питању.</w:t>
-      </w:r>
-    </w:p>
-    <w:p>
-      <w:pPr>
-        <w:ind w:left="624" w:right="0"/>
-        <w:rPr>
-          <w:lang w:val="bs-Cyrl-BA"/>
-        </w:rPr>
-      </w:pPr>
-    </w:p>
-    <w:p>
-      <w:pPr>
-        <w:ind w:left="624" w:right="0"/>
-        <w:rPr>
-          <w:lang w:val="bs-Cyrl-BA"/>
+        <w:t xml:space="preserve">питање </w:t>
+      </w:r>
+      <w:r>
+        <w:rPr>
+          <w:lang w:val="bs-Cyrl-BA"/>
+        </w:rPr>
+        <w:t>„</w:t>
+      </w:r>
+      <w:r>
+        <w:t>Да ли је Иво Андрић добио Нобелову награду 1961. године?</w:t>
+      </w:r>
+      <w:r>
+        <w:rPr>
+          <w:lang w:val="bs-Cyrl-BA"/>
+        </w:rPr>
+        <w:t>“</w:t>
+      </w:r>
+      <w:r>
+        <w:t xml:space="preserve"> може да добије другачији одговор него "Које године је Иво Андрић добио Нобелову награду?" иако се ради о истој чињеници. Модел у првом случају може да потврди нетачан датум наведен у питању.</w:t>
+      </w:r>
+    </w:p>
+    <w:p>
+      <w:pPr>
+        <w:ind w:left="0" w:right="0" w:firstLine="0"/>
+        <w:rPr>
+          <w:lang w:val="en-US"/>
         </w:rPr>
       </w:pPr>
     </w:p>
@@ -29901,6 +30339,7 @@
     </w:p>
     <w:p>
       <w:pPr>
+        <w:ind w:left="0" w:firstLine="0"/>
         <w:rPr>
           <w:lang w:val="en-US"/>
         </w:rPr>
@@ -29908,17 +30347,14 @@
     </w:p>
     <w:p>
       <w:pPr>
-        <w:rPr>
-          <w:lang w:val="en-US"/>
-        </w:rPr>
-      </w:pPr>
-    </w:p>
-    <w:p>
-      <w:pPr>
-        <w:ind w:left="624" w:right="0"/>
-      </w:pPr>
-      <w:r>
-        <w:t>Методологија овог истраживања обухвата четири кључне фазе: креирање скупа података, одабир модела и конфигурацију, процес прикупљања одговора и метрике евалуације. Циљ методологије је да обезбеди поновљивост експеримента и упоредивост резултата између различитих модела.</w:t>
+        <w:ind w:right="0"/>
+      </w:pPr>
+      <w:r>
+        <w:t xml:space="preserve">Методологија овог истраживања обухвата четири кључне фазе: креирање скупа података, одабир модела и конфигурацију, процес прикупљања одговора и метрике </w:t>
+      </w:r>
+      <w:r>
+        <w:lastRenderedPageBreak/>
+        <w:t>евалуације. Циљ методологије је да обезбеди поновљивост експеримента и упоредивост резултата између различитих модела.</w:t>
       </w:r>
     </w:p>
     <w:p>
@@ -30031,9 +30467,9 @@
         <w:tblLook w:val="04A0" w:firstRow="1" w:lastRow="0" w:firstColumn="1" w:lastColumn="0" w:noHBand="0" w:noVBand="1"/>
       </w:tblPr>
       <w:tblGrid>
-        <w:gridCol w:w="2477"/>
-        <w:gridCol w:w="2698"/>
-        <w:gridCol w:w="3652"/>
+        <w:gridCol w:w="2137"/>
+        <w:gridCol w:w="2820"/>
+        <w:gridCol w:w="3860"/>
       </w:tblGrid>
       <w:tr>
         <w:tc>
@@ -30042,7 +30478,7 @@
           </w:tcPr>
           <w:p>
             <w:pPr>
-              <w:ind w:left="624" w:right="0" w:firstLine="0"/>
+              <w:ind w:left="57" w:right="0" w:firstLine="0"/>
               <w:rPr>
                 <w:b/>
                 <w:lang w:val="bs-Cyrl-BA"/>
@@ -30053,7 +30489,6 @@
                 <w:b/>
                 <w:lang w:val="bs-Cyrl-BA"/>
               </w:rPr>
-              <w:lastRenderedPageBreak/>
               <w:t>Категорија</w:t>
             </w:r>
           </w:p>
@@ -30064,7 +30499,7 @@
           </w:tcPr>
           <w:p>
             <w:pPr>
-              <w:ind w:left="624" w:right="0" w:firstLine="0"/>
+              <w:ind w:left="57" w:right="0" w:firstLine="0"/>
               <w:rPr>
                 <w:b/>
                 <w:lang w:val="bs-Cyrl-BA"/>
@@ -30085,7 +30520,7 @@
           </w:tcPr>
           <w:p>
             <w:pPr>
-              <w:ind w:left="624" w:right="0" w:firstLine="0"/>
+              <w:ind w:left="57" w:right="0" w:firstLine="0"/>
               <w:rPr>
                 <w:b/>
                 <w:lang w:val="bs-Cyrl-BA"/>
@@ -30108,7 +30543,7 @@
           </w:tcPr>
           <w:p>
             <w:pPr>
-              <w:ind w:left="624" w:right="0" w:firstLine="0"/>
+              <w:ind w:left="57" w:right="0" w:firstLine="0"/>
               <w:rPr>
                 <w:lang w:val="bs-Cyrl-BA"/>
               </w:rPr>
@@ -30127,7 +30562,7 @@
           </w:tcPr>
           <w:p>
             <w:pPr>
-              <w:ind w:left="624" w:right="0" w:firstLine="0"/>
+              <w:ind w:left="57" w:right="0" w:firstLine="0"/>
               <w:rPr>
                 <w:lang w:val="bs-Cyrl-BA"/>
               </w:rPr>
@@ -30146,7 +30581,7 @@
           </w:tcPr>
           <w:p>
             <w:pPr>
-              <w:ind w:left="624" w:right="0" w:firstLine="0"/>
+              <w:ind w:left="57" w:right="0" w:firstLine="0"/>
               <w:rPr>
                 <w:lang w:val="bs-Cyrl-BA"/>
               </w:rPr>
@@ -30167,7 +30602,7 @@
           </w:tcPr>
           <w:p>
             <w:pPr>
-              <w:ind w:left="624" w:right="0" w:firstLine="0"/>
+              <w:ind w:left="57" w:right="0" w:firstLine="0"/>
               <w:rPr>
                 <w:lang w:val="bs-Cyrl-BA"/>
               </w:rPr>
@@ -30186,7 +30621,7 @@
           </w:tcPr>
           <w:p>
             <w:pPr>
-              <w:ind w:left="624" w:right="0" w:firstLine="0"/>
+              <w:ind w:left="57" w:right="0" w:firstLine="0"/>
               <w:rPr>
                 <w:lang w:val="bs-Cyrl-BA"/>
               </w:rPr>
@@ -30205,7 +30640,7 @@
           </w:tcPr>
           <w:p>
             <w:pPr>
-              <w:ind w:left="624" w:right="0" w:firstLine="0"/>
+              <w:ind w:left="57" w:right="0" w:firstLine="0"/>
               <w:rPr>
                 <w:lang w:val="bs-Cyrl-BA"/>
               </w:rPr>
@@ -30226,7 +30661,7 @@
           </w:tcPr>
           <w:p>
             <w:pPr>
-              <w:ind w:left="624" w:right="0" w:firstLine="0"/>
+              <w:ind w:left="57" w:right="0" w:firstLine="0"/>
               <w:rPr>
                 <w:lang w:val="bs-Cyrl-BA"/>
               </w:rPr>
@@ -30245,7 +30680,7 @@
           </w:tcPr>
           <w:p>
             <w:pPr>
-              <w:ind w:left="624" w:right="0" w:firstLine="0"/>
+              <w:ind w:left="57" w:right="0" w:firstLine="0"/>
               <w:rPr>
                 <w:lang w:val="bs-Cyrl-BA"/>
               </w:rPr>
@@ -30276,7 +30711,7 @@
           </w:tcPr>
           <w:p>
             <w:pPr>
-              <w:ind w:left="624" w:right="0" w:firstLine="0"/>
+              <w:ind w:left="57" w:right="0" w:firstLine="0"/>
               <w:rPr>
                 <w:lang w:val="bs-Cyrl-BA"/>
               </w:rPr>
@@ -30544,9 +30979,9 @@
         <w:tblLook w:val="04A0" w:firstRow="1" w:lastRow="0" w:firstColumn="1" w:lastColumn="0" w:noHBand="0" w:noVBand="1"/>
       </w:tblPr>
       <w:tblGrid>
-        <w:gridCol w:w="1614"/>
-        <w:gridCol w:w="4530"/>
-        <w:gridCol w:w="2683"/>
+        <w:gridCol w:w="1459"/>
+        <w:gridCol w:w="4654"/>
+        <w:gridCol w:w="2714"/>
       </w:tblGrid>
       <w:tr>
         <w:tc>
@@ -30555,7 +30990,7 @@
           </w:tcPr>
           <w:p>
             <w:pPr>
-              <w:ind w:left="624" w:right="0" w:firstLine="0"/>
+              <w:ind w:left="57" w:right="0" w:firstLine="0"/>
               <w:rPr>
                 <w:lang w:val="bs-Cyrl-BA"/>
               </w:rPr>
@@ -30574,7 +31009,7 @@
           </w:tcPr>
           <w:p>
             <w:pPr>
-              <w:ind w:left="624" w:right="0" w:firstLine="0"/>
+              <w:ind w:left="57" w:right="0" w:firstLine="0"/>
               <w:rPr>
                 <w:lang w:val="bs-Cyrl-BA"/>
               </w:rPr>
@@ -30593,7 +31028,7 @@
           </w:tcPr>
           <w:p>
             <w:pPr>
-              <w:ind w:left="624" w:right="0" w:firstLine="0"/>
+              <w:ind w:left="57" w:right="0" w:firstLine="0"/>
               <w:rPr>
                 <w:lang w:val="bs-Cyrl-BA"/>
               </w:rPr>
@@ -30614,7 +31049,7 @@
           </w:tcPr>
           <w:p>
             <w:pPr>
-              <w:ind w:left="624" w:right="0" w:firstLine="0"/>
+              <w:ind w:left="57" w:right="0" w:firstLine="0"/>
               <w:rPr>
                 <w:lang w:val="bs-Cyrl-BA"/>
               </w:rPr>
@@ -30633,7 +31068,7 @@
           </w:tcPr>
           <w:p>
             <w:pPr>
-              <w:ind w:left="624" w:right="0" w:firstLine="0"/>
+              <w:ind w:left="57" w:right="0" w:firstLine="0"/>
               <w:rPr>
                 <w:lang w:val="bs-Cyrl-BA"/>
               </w:rPr>
@@ -30643,6 +31078,12 @@
                 <w:lang w:val="bs-Cyrl-BA"/>
               </w:rPr>
               <w:t>Који је главни град Србије</w:t>
+            </w:r>
+            <w:r>
+              <w:rPr>
+                <w:lang w:val="bs-Cyrl-BA"/>
+              </w:rPr>
+              <w:t>?</w:t>
             </w:r>
           </w:p>
         </w:tc>
@@ -30652,7 +31093,7 @@
           </w:tcPr>
           <w:p>
             <w:pPr>
-              <w:ind w:left="624" w:right="0" w:firstLine="0"/>
+              <w:ind w:left="57" w:right="0" w:firstLine="0"/>
               <w:rPr>
                 <w:lang w:val="bs-Cyrl-BA"/>
               </w:rPr>
@@ -30673,7 +31114,7 @@
           </w:tcPr>
           <w:p>
             <w:pPr>
-              <w:ind w:left="624" w:right="0" w:firstLine="0"/>
+              <w:ind w:left="57" w:right="0" w:firstLine="0"/>
               <w:rPr>
                 <w:lang w:val="bs-Cyrl-BA"/>
               </w:rPr>
@@ -30692,7 +31133,7 @@
           </w:tcPr>
           <w:p>
             <w:pPr>
-              <w:ind w:left="624" w:right="0" w:firstLine="0"/>
+              <w:ind w:left="57" w:right="0" w:firstLine="0"/>
               <w:rPr>
                 <w:lang w:val="bs-Cyrl-BA"/>
               </w:rPr>
@@ -30702,6 +31143,12 @@
                 <w:lang w:val="bs-Cyrl-BA"/>
               </w:rPr>
               <w:t>Које је боје црна кутија у авиону</w:t>
+            </w:r>
+            <w:r>
+              <w:rPr>
+                <w:lang w:val="bs-Cyrl-BA"/>
+              </w:rPr>
+              <w:t>?</w:t>
             </w:r>
           </w:p>
         </w:tc>
@@ -30711,7 +31158,7 @@
           </w:tcPr>
           <w:p>
             <w:pPr>
-              <w:ind w:left="624" w:right="0" w:firstLine="0"/>
+              <w:ind w:left="57" w:right="0" w:firstLine="0"/>
               <w:rPr>
                 <w:lang w:val="bs-Cyrl-BA"/>
               </w:rPr>
@@ -30735,7 +31182,7 @@
           </w:tcPr>
           <w:p>
             <w:pPr>
-              <w:ind w:left="624" w:right="0" w:firstLine="0"/>
+              <w:ind w:left="57" w:right="0" w:firstLine="0"/>
               <w:rPr>
                 <w:lang w:val="bs-Cyrl-BA"/>
               </w:rPr>
@@ -30754,7 +31201,7 @@
           </w:tcPr>
           <w:p>
             <w:pPr>
-              <w:ind w:left="624" w:right="0" w:firstLine="0"/>
+              <w:ind w:left="57" w:right="0" w:firstLine="0"/>
               <w:rPr>
                 <w:lang w:val="bs-Cyrl-BA"/>
               </w:rPr>
@@ -30764,6 +31211,12 @@
                 <w:lang w:val="bs-Cyrl-BA"/>
               </w:rPr>
               <w:t>Која је надморска висина Фрушке горе</w:t>
+            </w:r>
+            <w:r>
+              <w:rPr>
+                <w:lang w:val="bs-Cyrl-BA"/>
+              </w:rPr>
+              <w:t>?</w:t>
             </w:r>
           </w:p>
         </w:tc>
@@ -30773,7 +31226,7 @@
           </w:tcPr>
           <w:p>
             <w:pPr>
-              <w:ind w:left="624" w:right="0" w:firstLine="0"/>
+              <w:ind w:left="57" w:right="0" w:firstLine="0"/>
               <w:rPr>
                 <w:lang w:val="en-US"/>
               </w:rPr>
@@ -30816,6 +31269,7 @@
         <w:rPr>
           <w:lang w:val="bs-Cyrl-BA"/>
         </w:rPr>
+        <w:lastRenderedPageBreak/>
         <w:tab/>
       </w:r>
       <w:bookmarkStart w:id="19" w:name="_Toc230456510"/>
@@ -30937,7 +31391,6 @@
         <w:rPr>
           <w:lang w:val="bs-Cyrl-BA"/>
         </w:rPr>
-        <w:lastRenderedPageBreak/>
         <w:t>За свако питање, дефинише се очекивано понашање модела (одбијање, упозоравање, исправка)</w:t>
       </w:r>
       <w:r>
@@ -31021,7 +31474,13 @@
         </w:rPr>
       </w:pPr>
       <w:r>
-        <w:t>За тестирање конзистентности узето је 60 базних питања из скупа за тачност. За свако питање креиране су 3 до 5 варијанти различите формулације, тако да свака група представља исто питање постављено на другачији начин.</w:t>
+        <w:t xml:space="preserve">За тестирање конзистентности узето је </w:t>
+      </w:r>
+      <w:r>
+        <w:t>6</w:t>
+      </w:r>
+      <w:r>
+        <w:t xml:space="preserve"> базних питања из скупа за тачност. За свако питање креиране су 3 до 5 варијанти различите формулације, тако да свака група представља исто питање постављено на другачији начин.</w:t>
       </w:r>
     </w:p>
     <w:p>
@@ -31054,7 +31513,7 @@
           </w:tcPr>
           <w:p>
             <w:pPr>
-              <w:ind w:left="624" w:right="0" w:firstLine="0"/>
+              <w:ind w:left="57" w:right="0" w:firstLine="0"/>
               <w:rPr>
                 <w:lang w:val="bs-Cyrl-BA"/>
               </w:rPr>
@@ -31073,7 +31532,7 @@
           </w:tcPr>
           <w:p>
             <w:pPr>
-              <w:ind w:left="624" w:right="0" w:firstLine="0"/>
+              <w:ind w:left="57" w:right="0" w:firstLine="0"/>
               <w:rPr>
                 <w:lang w:val="bs-Cyrl-BA"/>
               </w:rPr>
@@ -31094,7 +31553,7 @@
           </w:tcPr>
           <w:p>
             <w:pPr>
-              <w:ind w:left="624" w:right="0" w:firstLine="0"/>
+              <w:ind w:left="57" w:right="0" w:firstLine="0"/>
               <w:rPr>
                 <w:lang w:val="bs-Cyrl-BA"/>
               </w:rPr>
@@ -31113,7 +31572,7 @@
           </w:tcPr>
           <w:p>
             <w:pPr>
-              <w:ind w:left="624" w:right="0" w:firstLine="0"/>
+              <w:ind w:left="57" w:right="0" w:firstLine="0"/>
               <w:rPr>
                 <w:lang w:val="bs-Cyrl-BA"/>
               </w:rPr>
@@ -31134,7 +31593,7 @@
           </w:tcPr>
           <w:p>
             <w:pPr>
-              <w:ind w:left="624" w:right="0" w:firstLine="0"/>
+              <w:ind w:left="57" w:right="0" w:firstLine="0"/>
               <w:rPr>
                 <w:lang w:val="bs-Cyrl-BA"/>
               </w:rPr>
@@ -31153,7 +31612,7 @@
           </w:tcPr>
           <w:p>
             <w:pPr>
-              <w:ind w:left="624" w:right="0" w:firstLine="0"/>
+              <w:ind w:left="57" w:right="0" w:firstLine="0"/>
               <w:rPr>
                 <w:lang w:val="bs-Cyrl-BA"/>
               </w:rPr>
@@ -31162,7 +31621,19 @@
               <w:rPr>
                 <w:lang w:val="bs-Cyrl-BA"/>
               </w:rPr>
-              <w:t>Које је године почео са радом Београдски Универзитет?</w:t>
+              <w:t xml:space="preserve">Које </w:t>
+            </w:r>
+            <w:r>
+              <w:rPr>
+                <w:lang w:val="bs-Cyrl-BA"/>
+              </w:rPr>
+              <w:t xml:space="preserve">године је почео </w:t>
+            </w:r>
+            <w:r>
+              <w:rPr>
+                <w:lang w:val="bs-Cyrl-BA"/>
+              </w:rPr>
+              <w:t>са радом Београдски Универзитет?</w:t>
             </w:r>
           </w:p>
         </w:tc>
@@ -31174,7 +31645,7 @@
           </w:tcPr>
           <w:p>
             <w:pPr>
-              <w:ind w:left="624" w:right="0" w:firstLine="0"/>
+              <w:ind w:left="57" w:right="0" w:firstLine="0"/>
               <w:rPr>
                 <w:lang w:val="bs-Cyrl-BA"/>
               </w:rPr>
@@ -31193,7 +31664,7 @@
           </w:tcPr>
           <w:p>
             <w:pPr>
-              <w:ind w:left="624" w:right="0" w:firstLine="0"/>
+              <w:ind w:left="57" w:right="0" w:firstLine="0"/>
               <w:rPr>
                 <w:lang w:val="bs-Cyrl-BA"/>
               </w:rPr>
@@ -31214,7 +31685,7 @@
           </w:tcPr>
           <w:p>
             <w:pPr>
-              <w:ind w:left="624" w:right="0" w:firstLine="0"/>
+              <w:ind w:left="57" w:right="0" w:firstLine="0"/>
               <w:rPr>
                 <w:lang w:val="bs-Cyrl-BA"/>
               </w:rPr>
@@ -31233,7 +31704,7 @@
           </w:tcPr>
           <w:p>
             <w:pPr>
-              <w:ind w:left="624" w:right="0" w:firstLine="0"/>
+              <w:ind w:left="57" w:right="0" w:firstLine="0"/>
               <w:rPr>
                 <w:lang w:val="en-US"/>
               </w:rPr>
@@ -31362,7 +31833,6 @@
       </w:pPr>
       <w:bookmarkStart w:id="22" w:name="_Toc230456513"/>
       <w:r>
-        <w:lastRenderedPageBreak/>
         <w:t>GPT-4</w:t>
       </w:r>
       <w:bookmarkEnd w:id="22"/>
@@ -31383,10 +31853,25 @@
         <w:t>GPT-4 је велики језички модел компаније OpenAI, објављен у марту 2023. године</w:t>
       </w:r>
       <w:r>
-        <w:t xml:space="preserve"> [3]</w:t>
-      </w:r>
-      <w:r>
-        <w:t>. Представља четврту генерацију GPT серије и тренутно је један од најшире коришћених модела у истраживачкој и пословној заједници. Тренiran је на вишејезичном корпусу текстова са интернета, књига и других извора, са нагласком на енглески језик.</w:t>
+        <w:t xml:space="preserve"> [</w:t>
+      </w:r>
+      <w:r>
+        <w:t>10</w:t>
+      </w:r>
+      <w:r>
+        <w:t>]</w:t>
+      </w:r>
+      <w:r>
+        <w:t>. Представља четврту генерацију GPT серије и тренутно је један од најшире коришћених модела у истраживачкој и пословној заједници. Трен</w:t>
+      </w:r>
+      <w:r>
+        <w:rPr>
+          <w:lang w:val="bs-Cyrl-BA"/>
+        </w:rPr>
+        <w:t>иран</w:t>
+      </w:r>
+      <w:r>
+        <w:t xml:space="preserve"> је на вишејезичном корпусу текстова са интернета, књига и других извора, са нагласком на енглески језик.</w:t>
       </w:r>
     </w:p>
     <w:p>
@@ -31467,7 +31952,13 @@
         <w:t xml:space="preserve"> јер представља индустријски стандард са којим се пореде остали модели. За потребе овог истраживања приступ GPT-4 моделу омогућен је путем OpenAI API-ја уз претплату од 5 USD, што представља минималан износ неопходан за коришћење сервиса</w:t>
       </w:r>
       <w:r>
-        <w:t xml:space="preserve"> [13]</w:t>
+        <w:t xml:space="preserve"> [1</w:t>
+      </w:r>
+      <w:r>
+        <w:t>1</w:t>
+      </w:r>
+      <w:r>
+        <w:t>]</w:t>
       </w:r>
       <w:r>
         <w:t>.</w:t>
@@ -31541,13 +32032,19 @@
         <w:t xml:space="preserve">познат као Constitutional AI, у ком </w:t>
       </w:r>
       <w:r>
-        <w:t xml:space="preserve">[4] </w:t>
+        <w:t xml:space="preserve"> </w:t>
       </w:r>
       <w:r>
         <w:t>модел учи да поштује скуп принципа и да отворено признаје своја ограничења уместо да измишља одговоре</w:t>
       </w:r>
       <w:r>
-        <w:t xml:space="preserve"> [4]</w:t>
+        <w:t xml:space="preserve"> [</w:t>
+      </w:r>
+      <w:r>
+        <w:t>12</w:t>
+      </w:r>
+      <w:r>
+        <w:t>]</w:t>
       </w:r>
       <w:r>
         <w:t>.</w:t>
@@ -31610,6 +32107,7 @@
         <w:ind w:right="0"/>
       </w:pPr>
       <w:r>
+        <w:lastRenderedPageBreak/>
         <w:t>Системска порука: иста за све моделе</w:t>
       </w:r>
     </w:p>
@@ -31621,7 +32119,13 @@
         <w:t>Claude Sonnet је одабран јер је посебно интересантан за евалуацију халуцинација — Constitutional AI приступ теоретски би требало да резултује нижом стопом халуцинација у поређењу са другим моделима. Приступ Claude Sonnet моделу омогућен је путем Anthropic API-ја уз претплату од 5 USD неопходну за активацију сервиса</w:t>
       </w:r>
       <w:r>
-        <w:t xml:space="preserve"> [14]</w:t>
+        <w:t xml:space="preserve"> [1</w:t>
+      </w:r>
+      <w:r>
+        <w:t>3</w:t>
+      </w:r>
+      <w:r>
+        <w:t>]</w:t>
       </w:r>
       <w:r>
         <w:t>.</w:t>
@@ -31647,12 +32151,11 @@
         <w:rPr>
           <w:noProof/>
         </w:rPr>
-        <w:lastRenderedPageBreak/>
         <w:drawing>
-          <wp:inline distT="0" distB="0" distL="0" distR="0" wp14:anchorId="3574686E" wp14:editId="5A72FA9A">
-            <wp:extent cx="4922875" cy="5403215"/>
-            <wp:effectExtent l="0" t="0" r="0" b="6985"/>
-            <wp:docPr id="2004849172" name="Picture 106"/>
+          <wp:inline distT="0" distB="0" distL="0" distR="0" wp14:anchorId="7DE03F12" wp14:editId="7DE6D31C">
+            <wp:extent cx="5913755" cy="5997039"/>
+            <wp:effectExtent l="0" t="0" r="0" b="3810"/>
+            <wp:docPr id="5833801" name="Picture 106"/>
             <wp:cNvGraphicFramePr>
               <a:graphicFrameLocks xmlns:a="http://schemas.openxmlformats.org/drawingml/2006/main" noChangeAspect="1"/>
             </wp:cNvGraphicFramePr>
@@ -31681,7 +32184,7 @@
                   <pic:spPr bwMode="auto">
                     <a:xfrm>
                       <a:off x="0" y="0"/>
-                      <a:ext cx="4928172" cy="5409029"/>
+                      <a:ext cx="5931375" cy="6014907"/>
                     </a:xfrm>
                     <a:prstGeom prst="rect">
                       <a:avLst/>
@@ -31788,10 +32291,23 @@
         <w:t>Mistral Small је модел француске компаније Mistral AI, развијен као ефикасна алтернатива великим затвореним моделима</w:t>
       </w:r>
       <w:r>
-        <w:t xml:space="preserve"> [5]</w:t>
-      </w:r>
-      <w:r>
-        <w:t>. За разлику од GPT-4 и Claude-а, Mistral је отвореног кода, мањих димензија и доступан бесплатно за истраживачке сврхе, што га чини атрактивним за академска истраживања са ограниченим буџетом.</w:t>
+        <w:t xml:space="preserve"> [</w:t>
+      </w:r>
+      <w:r>
+        <w:t>1</w:t>
+      </w:r>
+      <w:r>
+        <w:t>4</w:t>
+      </w:r>
+      <w:r>
+        <w:t>]</w:t>
+      </w:r>
+      <w:r>
+        <w:t xml:space="preserve">. За разлику од GPT-4 и Claude-а, Mistral </w:t>
+      </w:r>
+      <w:r>
+        <w:lastRenderedPageBreak/>
+        <w:t>је отвореног кода, мањих димензија и доступан бесплатно за истраживачке сврхе, што га чини атрактивним за академска истраживања са ограниченим буџетом.</w:t>
       </w:r>
     </w:p>
     <w:p>
@@ -31859,7 +32375,6 @@
         <w:ind w:left="624" w:right="0"/>
       </w:pPr>
       <w:r>
-        <w:lastRenderedPageBreak/>
         <w:t xml:space="preserve">Mistral Small је одабран као представник </w:t>
       </w:r>
       <w:r>
@@ -31884,7 +32399,22 @@
         <w:t>За разлику од претходна два модела, Mistral Small је коришћен путем бесплатног нивоа Mistral API-ја, без додатних трошкова</w:t>
       </w:r>
       <w:r>
-        <w:t>[15]</w:t>
+        <w:rPr>
+          <w:lang w:val="bs-Cyrl-BA"/>
+        </w:rPr>
+        <w:t xml:space="preserve"> </w:t>
+      </w:r>
+      <w:r>
+        <w:t>[1</w:t>
+      </w:r>
+      <w:r>
+        <w:rPr>
+          <w:lang w:val="en-US"/>
+        </w:rPr>
+        <w:t>5</w:t>
+      </w:r>
+      <w:r>
+        <w:t>]</w:t>
       </w:r>
       <w:r>
         <w:t>.</w:t>
@@ -32170,6 +32700,7 @@
         <w:ind w:left="624" w:right="0"/>
       </w:pPr>
       <w:r>
+        <w:lastRenderedPageBreak/>
         <w:t xml:space="preserve">        ]</w:t>
       </w:r>
     </w:p>
@@ -32234,7 +32765,6 @@
       </w:pPr>
       <w:bookmarkStart w:id="27" w:name="_Toc230456518"/>
       <w:r>
-        <w:lastRenderedPageBreak/>
         <w:t>Подешавања (температура, макс. токени)</w:t>
       </w:r>
       <w:bookmarkEnd w:id="27"/>
@@ -32393,7 +32923,19 @@
         <w:rPr>
           <w:lang w:val="bs-Cyrl-BA"/>
         </w:rPr>
-        <w:t xml:space="preserve">Сваки одговор је бинаран –  Да (тачан) или НЕ (нетачан) у одговарајућу колону за сваки модел посебно у </w:t>
+        <w:t>Сваки одговор је бинаран –  Д</w:t>
+      </w:r>
+      <w:r>
+        <w:rPr>
+          <w:lang w:val="bs-Cyrl-BA"/>
+        </w:rPr>
+        <w:t>А</w:t>
+      </w:r>
+      <w:r>
+        <w:rPr>
+          <w:lang w:val="bs-Cyrl-BA"/>
+        </w:rPr>
+        <w:t xml:space="preserve"> (тачан) или НЕ (нетачан) у одговарајућу колону за сваки модел посебно у </w:t>
       </w:r>
       <w:r>
         <w:t>Excel фајл</w:t>
@@ -32497,7 +33039,61 @@
         </w:rPr>
       </w:pPr>
       <w:r>
-        <w:t xml:space="preserve">На пример, за питање "У којој години је Србија добила независност на Берлинском конгресу?" — одговор "1878. године" и одговор "Србија је добила независност 1878. на Берлинском конгресу" оба добијају </w:t>
+        <w:t xml:space="preserve">На пример, за питање </w:t>
+      </w:r>
+      <w:r>
+        <w:rPr>
+          <w:lang w:val="bs-Cyrl-BA"/>
+        </w:rPr>
+        <w:t>„</w:t>
+      </w:r>
+      <w:r>
+        <w:t>У којој години је Србија добила независност на Берлинском конгресу?</w:t>
+      </w:r>
+      <w:r>
+        <w:rPr>
+          <w:lang w:val="bs-Cyrl-BA"/>
+        </w:rPr>
+        <w:t>“</w:t>
+      </w:r>
+      <w:r>
+        <w:t xml:space="preserve"> — одговор </w:t>
+      </w:r>
+      <w:r>
+        <w:rPr>
+          <w:lang w:val="bs-Cyrl-BA"/>
+        </w:rPr>
+        <w:t>„</w:t>
+      </w:r>
+      <w:r>
+        <w:t>1878. године</w:t>
+      </w:r>
+      <w:r>
+        <w:rPr>
+          <w:lang w:val="bs-Cyrl-BA"/>
+        </w:rPr>
+        <w:t>“</w:t>
+      </w:r>
+      <w:r>
+        <w:t xml:space="preserve"> и одговор </w:t>
+      </w:r>
+      <w:r>
+        <w:rPr>
+          <w:lang w:val="bs-Cyrl-BA"/>
+        </w:rPr>
+        <w:t>„</w:t>
+      </w:r>
+      <w:r>
+        <w:t>Србија је добила независност 1878. на Берлинском конгресу</w:t>
+      </w:r>
+      <w:r>
+        <w:rPr>
+          <w:lang w:val="bs-Cyrl-BA"/>
+        </w:rPr>
+        <w:t>“</w:t>
+      </w:r>
+      <w:r>
+        <w:t xml:space="preserve"> оба добијају </w:t>
       </w:r>
       <w:r>
         <w:rPr>
@@ -32507,7 +33103,25 @@
         <w:t>ДА</w:t>
       </w:r>
       <w:r>
-        <w:t xml:space="preserve">, док одговор "1876. године" добија </w:t>
+        <w:t xml:space="preserve">, док одговор </w:t>
+      </w:r>
+      <w:r>
+        <w:rPr>
+          <w:lang w:val="bs-Cyrl-BA"/>
+        </w:rPr>
+        <w:t>„</w:t>
+      </w:r>
+      <w:r>
+        <w:t>1876. године</w:t>
+      </w:r>
+      <w:r>
+        <w:rPr>
+          <w:lang w:val="bs-Cyrl-BA"/>
+        </w:rPr>
+        <w:t>“</w:t>
+      </w:r>
+      <w:r>
+        <w:t xml:space="preserve"> добија </w:t>
       </w:r>
       <w:r>
         <w:rPr>
@@ -32560,7 +33174,6 @@
       </w:pPr>
       <w:bookmarkStart w:id="30" w:name="_Toc230456521"/>
       <w:r>
-        <w:lastRenderedPageBreak/>
         <w:t>Стопа халуцинација</w:t>
       </w:r>
       <w:bookmarkEnd w:id="30"/>
@@ -32851,6 +33464,14 @@
     </w:p>
     <w:p>
       <w:pPr>
+        <w:ind w:left="624" w:right="0"/>
+        <w:rPr>
+          <w:lang w:val="bs-Latn-BA"/>
+        </w:rPr>
+      </w:pPr>
+    </w:p>
+    <w:p>
+      <w:pPr>
         <w:pStyle w:val="Heading1"/>
         <w:ind w:left="624" w:right="0"/>
         <w:rPr>
@@ -32862,6 +33483,7 @@
         <w:rPr>
           <w:lang w:val="bs-Cyrl-BA"/>
         </w:rPr>
+        <w:lastRenderedPageBreak/>
         <w:t>Резултати и анализа</w:t>
       </w:r>
       <w:bookmarkEnd w:id="32"/>
@@ -32932,7 +33554,6 @@
         <w:rPr>
           <w:lang w:val="bs-Cyrl-BA"/>
         </w:rPr>
-        <w:lastRenderedPageBreak/>
         <w:t>Резултати тачности</w:t>
       </w:r>
       <w:bookmarkEnd w:id="33"/>
@@ -33091,6 +33712,9 @@
         <w:t>.</w:t>
       </w:r>
       <w:r>
+        <w:t xml:space="preserve"> </w:t>
+      </w:r>
+      <w:r>
         <w:rPr>
           <w:lang w:val="bs-Cyrl-BA"/>
         </w:rPr>
@@ -33134,6 +33758,7 @@
         <w:rPr>
           <w:noProof/>
         </w:rPr>
+        <w:lastRenderedPageBreak/>
         <w:drawing>
           <wp:inline distT="0" distB="0" distL="0" distR="0" wp14:anchorId="0DD66C57" wp14:editId="574AA450">
             <wp:extent cx="5528930" cy="3423008"/>
@@ -33273,7 +33898,16 @@
         <w:t>92.3%</w:t>
       </w:r>
       <w:r>
-        <w:t xml:space="preserve">, dok Mistral Small значајно заостаје са </w:t>
+        <w:t xml:space="preserve">, </w:t>
+      </w:r>
+      <w:r>
+        <w:rPr>
+          <w:lang w:val="bs-Cyrl-BA"/>
+        </w:rPr>
+        <w:t>док</w:t>
+      </w:r>
+      <w:r>
+        <w:t xml:space="preserve"> Mistral Small значајно заостаје са </w:t>
       </w:r>
       <w:r>
         <w:rPr>
@@ -33293,7 +33927,13 @@
         <w:t xml:space="preserve"> </w:t>
       </w:r>
       <w:r>
-        <w:t>Kultura је категорија са највећим распоном резултата.</w:t>
+        <w:rPr>
+          <w:lang w:val="bs-Cyrl-BA"/>
+        </w:rPr>
+        <w:t>Култура</w:t>
+      </w:r>
+      <w:r>
+        <w:t xml:space="preserve"> је категорија са највећим распоном резултата.</w:t>
       </w:r>
       <w:r>
         <w:rPr>
@@ -33317,7 +33957,19 @@
         <w:rPr>
           <w:lang w:val="bs-Cyrl-BA"/>
         </w:rPr>
-        <w:t xml:space="preserve"> забиљежио најслабије резултате од свих категорија и модела. </w:t>
+        <w:t xml:space="preserve"> заб</w:t>
+      </w:r>
+      <w:r>
+        <w:rPr>
+          <w:lang w:val="bs-Cyrl-BA"/>
+        </w:rPr>
+        <w:t>ел</w:t>
+      </w:r>
+      <w:r>
+        <w:rPr>
+          <w:lang w:val="bs-Cyrl-BA"/>
+        </w:rPr>
+        <w:t xml:space="preserve">ежио најслабије резултате од свих категорија и модела. </w:t>
       </w:r>
       <w:r>
         <w:rPr>
@@ -33334,14 +33986,31 @@
         </w:rPr>
       </w:pPr>
       <w:r>
-        <w:t>Кључни закључак анализе тачности је да сви модели показују значајно боље резултате на универзалним категоријама (географија, наука) него на категоријама специфичним за српску културу (књижевност, kultura).</w:t>
+        <w:t xml:space="preserve">Кључни закључак анализе тачности је да сви модели показују значајно боље резултате на универзалним категоријама (географија, наука) него на категоријама специфичним за српску културу (књижевност, </w:t>
+      </w:r>
+      <w:r>
+        <w:rPr>
+          <w:lang w:val="bs-Cyrl-BA"/>
+        </w:rPr>
+        <w:t>културу</w:t>
+      </w:r>
+      <w:r>
+        <w:t>).</w:t>
       </w:r>
     </w:p>
     <w:p>
       <w:pPr>
         <w:ind w:left="624" w:right="0" w:firstLine="0"/>
         <w:rPr>
-          <w:lang w:val="bs-Cyrl-BA"/>
+          <w:lang w:val="bs-Latn-BA"/>
+        </w:rPr>
+      </w:pPr>
+    </w:p>
+    <w:p>
+      <w:pPr>
+        <w:ind w:left="624" w:right="0" w:firstLine="0"/>
+        <w:rPr>
+          <w:lang w:val="bs-Latn-BA"/>
         </w:rPr>
       </w:pPr>
     </w:p>
@@ -33367,6 +34036,7 @@
           <w:iCs/>
           <w:lang w:val="bs-Cyrl-BA"/>
         </w:rPr>
+        <w:lastRenderedPageBreak/>
         <w:t>Компаративна анализа халуцинација</w:t>
       </w:r>
       <w:bookmarkEnd w:id="34"/>
@@ -33484,6 +34154,12 @@
         <w:t>4.2.1</w:t>
       </w:r>
       <w:r>
+        <w:rPr>
+          <w:lang w:val="bs-Cyrl-BA"/>
+        </w:rPr>
+        <w:t>.</w:t>
+      </w:r>
+      <w:r>
         <w:t xml:space="preserve"> GPT-4 је остварио најнижу стопу халуцинација од </w:t>
       </w:r>
       <w:r>
@@ -33525,7 +34201,6 @@
         </w:rPr>
       </w:pPr>
       <w:r>
-        <w:lastRenderedPageBreak/>
         <w:t xml:space="preserve">Ови резултати су посебно значајни јер се директно косе са резултатима тачности. Claude Sonnet је у тачности био веома близу GPT-4 (82.7% наспрам 84.7%), али у категорији халуцинација заостаје за чак </w:t>
       </w:r>
       <w:r>
@@ -33571,89 +34246,120 @@
     <w:p>
       <w:pPr>
         <w:ind w:left="624" w:right="0"/>
+        <w:rPr>
+          <w:lang w:val="bs-Cyrl-BA"/>
+        </w:rPr>
       </w:pPr>
       <w:r>
         <w:rPr>
           <w:lang w:val="bs-Cyrl-BA"/>
         </w:rPr>
         <w:br/>
-        <w:t>Занимљивост: Сви модели су погрешно одговорили на питање „</w:t>
-      </w:r>
-      <w:r>
-        <w:rPr>
-          <w:i/>
-          <w:iCs/>
-          <w:lang w:val="bs-Cyrl-BA"/>
-        </w:rPr>
-        <w:t>Dopuni rečenicu: Kroz Beograd protiču 3 reke: Dunav, Sava i ______</w:t>
-      </w:r>
-      <w:r>
-        <w:rPr>
-          <w:i/>
-          <w:iCs/>
-          <w:lang w:val="bs-Cyrl-BA"/>
-        </w:rPr>
-        <w:t>“</w:t>
-      </w:r>
-      <w:r>
-        <w:rPr>
-          <w:i/>
-          <w:iCs/>
-          <w:lang w:val="bs-Cyrl-BA"/>
-        </w:rPr>
-        <w:t>.</w:t>
-      </w:r>
-      <w:r>
-        <w:rPr>
-          <w:i/>
-          <w:iCs/>
+      </w:r>
+      <w:r>
+        <w:rPr>
+          <w:lang w:val="bs-Cyrl-BA"/>
+        </w:rPr>
+        <w:t>Занимљивост: Сви модели су погрешно одговорили на питање „Допуни реченицу: Кро</w:t>
+      </w:r>
+      <w:r>
+        <w:rPr>
+          <w:lang w:val="bs-Cyrl-BA"/>
+        </w:rPr>
+        <w:t xml:space="preserve">з </w:t>
+      </w:r>
+      <w:r>
+        <w:rPr>
+          <w:lang w:val="bs-Cyrl-BA"/>
+        </w:rPr>
+        <w:t xml:space="preserve">Београд протичу 3 реке: Дунав, Сава и ______“. </w:t>
+      </w:r>
+      <w:r>
+        <w:rPr>
+          <w:lang w:val="bs-Cyrl-BA"/>
+        </w:rPr>
+        <w:t>GPT</w:t>
+      </w:r>
+      <w:r>
+        <w:rPr>
+          <w:lang w:val="bs-Cyrl-BA"/>
+        </w:rPr>
+        <w:t>-4  је одговорио Колубара,</w:t>
+      </w:r>
+    </w:p>
+    <w:p>
+      <w:pPr>
+        <w:ind w:left="624" w:right="0"/>
+        <w:rPr>
+          <w:lang w:val="bs-Cyrl-BA"/>
+        </w:rPr>
+      </w:pPr>
+      <w:r>
+        <w:rPr>
+          <w:lang w:val="bs-Cyrl-BA"/>
+        </w:rPr>
+        <w:t xml:space="preserve">Топчидерац је одговор </w:t>
+      </w:r>
+      <w:r>
+        <w:rPr>
+          <w:lang w:val="bs-Cyrl-BA"/>
+        </w:rPr>
+        <w:t>Claude Sonnet</w:t>
+      </w:r>
+      <w:r>
+        <w:rPr>
+          <w:lang w:val="bs-Cyrl-BA"/>
+        </w:rPr>
+        <w:t xml:space="preserve">, а </w:t>
+      </w:r>
+      <w:r>
+        <w:rPr>
+          <w:lang w:val="bs-Cyrl-BA"/>
+        </w:rPr>
+        <w:t>Mistral Small</w:t>
+      </w:r>
+      <w:r>
+        <w:rPr>
+          <w:lang w:val="bs-Cyrl-BA"/>
+        </w:rPr>
+        <w:t xml:space="preserve"> </w:t>
+      </w:r>
+      <w:r>
+        <w:rPr>
+          <w:lang w:val="bs-Cyrl-BA"/>
+        </w:rPr>
+        <w:t>Тиса.</w:t>
+      </w:r>
+    </w:p>
+    <w:p>
+      <w:pPr>
+        <w:ind w:left="624" w:right="0" w:firstLine="0"/>
+        <w:rPr>
           <w:lang w:val="bs-Latn-BA"/>
         </w:rPr>
-        <w:t xml:space="preserve"> </w:t>
-      </w:r>
-      <w:r>
-        <w:rPr>
-          <w:i/>
-          <w:iCs/>
-        </w:rPr>
-        <w:t>GPT-4</w:t>
-      </w:r>
-      <w:r>
-        <w:rPr>
-          <w:i/>
-          <w:iCs/>
-        </w:rPr>
-        <w:t xml:space="preserve"> </w:t>
-      </w:r>
-      <w:r>
-        <w:t xml:space="preserve"> je odgovorio Kolubara,</w:t>
-      </w:r>
-    </w:p>
-    <w:p>
-      <w:pPr>
-        <w:ind w:left="624" w:right="0"/>
-      </w:pPr>
-      <w:r>
-        <w:t xml:space="preserve">Topčiderac je odgovor </w:t>
-      </w:r>
-      <w:r>
-        <w:t>Claude Sonnet</w:t>
-      </w:r>
-      <w:r>
-        <w:t xml:space="preserve">, a </w:t>
-      </w:r>
-      <w:r>
-        <w:t>Mistral Small</w:t>
-      </w:r>
-      <w:r>
-        <w:t xml:space="preserve"> Tisa.</w:t>
-      </w:r>
-    </w:p>
-    <w:p>
-      <w:pPr>
-        <w:ind w:left="624" w:right="0"/>
-        <w:rPr>
-          <w:lang w:val="bs-Cyrl-BA"/>
+      </w:pPr>
+    </w:p>
+    <w:p>
+      <w:pPr>
+        <w:ind w:left="624" w:right="0" w:firstLine="0"/>
+        <w:rPr>
+          <w:lang w:val="bs-Latn-BA"/>
+        </w:rPr>
+      </w:pPr>
+    </w:p>
+    <w:p>
+      <w:pPr>
+        <w:ind w:left="624" w:right="0" w:firstLine="0"/>
+        <w:rPr>
+          <w:lang w:val="bs-Latn-BA"/>
+        </w:rPr>
+      </w:pPr>
+    </w:p>
+    <w:p>
+      <w:pPr>
+        <w:ind w:left="624" w:right="0" w:firstLine="0"/>
+        <w:rPr>
+          <w:lang w:val="bs-Latn-BA"/>
         </w:rPr>
       </w:pPr>
     </w:p>
@@ -33678,6 +34384,7 @@
         <w:rPr>
           <w:lang w:val="bs-Cyrl-BA"/>
         </w:rPr>
+        <w:lastRenderedPageBreak/>
         <w:t>Конзистентност модела</w:t>
       </w:r>
       <w:bookmarkEnd w:id="35"/>
@@ -33821,11 +34528,7 @@
         <w:t>.</w:t>
       </w:r>
       <w:r>
-        <w:t xml:space="preserve"> Укупно гледано, стопа </w:t>
-      </w:r>
-      <w:r>
-        <w:lastRenderedPageBreak/>
-        <w:t>конзистентности од 73-87% за све моделе указује на то да су модели релативно стабилни, али да и даље постоји значајан простор за побољшање</w:t>
+        <w:t xml:space="preserve"> Укупно гледано, стопа конзистентности од 73-87% за све моделе указује на то да су модели релативно стабилни, али да и даље постоји значајан простор за побољшање</w:t>
       </w:r>
       <w:r>
         <w:t xml:space="preserve">. </w:t>
@@ -33886,6 +34589,7 @@
         <w:rPr>
           <w:noProof/>
         </w:rPr>
+        <w:lastRenderedPageBreak/>
         <w:drawing>
           <wp:inline distT="0" distB="0" distL="0" distR="0" wp14:anchorId="38648964" wp14:editId="6771EDCD">
             <wp:extent cx="5912087" cy="3540642"/>
@@ -33967,7 +34671,14 @@
           <w:sz w:val="22"/>
           <w:szCs w:val="22"/>
         </w:rPr>
-        <w:t>Dashboard резултата евалуације</w:t>
+        <w:t>Tabla</w:t>
+      </w:r>
+      <w:r>
+        <w:rPr>
+          <w:sz w:val="22"/>
+          <w:szCs w:val="22"/>
+        </w:rPr>
+        <w:t xml:space="preserve"> резултата евалуације</w:t>
       </w:r>
     </w:p>
     <w:p>
@@ -34041,7 +34752,6 @@
         <w:ind w:left="624" w:right="0"/>
       </w:pPr>
       <w:r>
-        <w:lastRenderedPageBreak/>
         <w:t xml:space="preserve">Claude Sonnet показује </w:t>
       </w:r>
       <w:r>
@@ -34068,7 +34778,7 @@
         <w:pStyle w:val="Heading2"/>
         <w:ind w:left="624" w:right="0"/>
         <w:rPr>
-          <w:lang w:val="bs-Cyrl-BA"/>
+          <w:lang w:val="en-US"/>
         </w:rPr>
       </w:pPr>
       <w:bookmarkStart w:id="37" w:name="_Toc230456528"/>
@@ -34079,6 +34789,13 @@
         <w:t>Препорука</w:t>
       </w:r>
       <w:bookmarkEnd w:id="37"/>
+    </w:p>
+    <w:p>
+      <w:pPr>
+        <w:rPr>
+          <w:lang w:val="en-US"/>
+        </w:rPr>
+      </w:pPr>
     </w:p>
     <w:p>
       <w:pPr>
@@ -34130,7 +34847,7 @@
         <w:rPr>
           <w:lang w:val="bs-Cyrl-BA"/>
         </w:rPr>
-        <w:t>је препоручен модел за коришћење на српском језику по свим параметрима, јер имам висок проценат тачности, ниске стопе халуцинације и високу конзистентност што га чини најпоузданијим избором.</w:t>
+        <w:t>је препоручен модел за коришћење на српском језику по свим параметрима, јер има висок проценат тачности, ниске стопе халуцинације и високу конзистентност што га чини најпоузданијим избором.</w:t>
       </w:r>
     </w:p>
     <w:p>
@@ -34289,8 +35006,48 @@
         <w:ind w:left="454"/>
       </w:pPr>
       <w:r>
+        <w:t>Резултати истраживања показују да GPT-4 представља најпоузданији модел за употребу на српском језику са укупним скором од 85.6%, захваљујући комбинацији високе тачности (84.7%), најниже стопе халуцинација (15%) и високе конзистентности (87%). Claude Sonnet остварио је конкурентну тачност (82.7%), али изненађујуће високу стопу халуцинација (35%) која га чини мање поузданим за фактографске задатке. Mistral Small, упркос бесплатном приступу и доброј конзистентности (87%), показао је значајне слабости у тачности (70.4%) и халуцинацијама (50%).</w:t>
+      </w:r>
+    </w:p>
+    <w:p>
+      <w:pPr>
+        <w:ind w:left="454"/>
+      </w:pPr>
+    </w:p>
+    <w:p>
+      <w:pPr>
+        <w:ind w:left="454"/>
+      </w:pPr>
+      <w:r>
         <w:lastRenderedPageBreak/>
-        <w:t>Резултати истраживања показују да GPT-4 представља најпоузданији модел за употребу на српском језику са укупним скором од 85.6%, захваљујући комбинацији високе тачности (84.7%), најниже стопе халуцинација (15%) и високе конзистентности (87%). Claude Sonnet остварио је конкурентну тачност (82.7%), али изненађујуће високу стопу халуцинација (35%) која га чини мање поузданим за фактографске задатке. Mistral Small, упркос бесплатном приступу и доброј конзистентности (87%), показао је значајне слабости у тачности (70.4%) и халуцинацијама (50%).</w:t>
+        <w:t xml:space="preserve">Кључни налаз истраживања је да сви модели показују значајно боље резултате на универзалним категоријама попут географије и науке, него на категоријама специфичним за српску културу попут књижевности и </w:t>
+      </w:r>
+      <w:r>
+        <w:rPr>
+          <w:lang w:val="bs-Cyrl-BA"/>
+        </w:rPr>
+        <w:t>културе</w:t>
+      </w:r>
+      <w:r>
+        <w:t xml:space="preserve">. Ово потврђује да недовољна заступљеност српског језика и </w:t>
+      </w:r>
+      <w:r>
+        <w:rPr>
+          <w:lang w:val="bs-Cyrl-BA"/>
+        </w:rPr>
+        <w:t>културе</w:t>
+      </w:r>
+      <w:r>
+        <w:t xml:space="preserve"> у</w:t>
+      </w:r>
+      <w:r>
+        <w:rPr>
+          <w:lang w:val="bs-Cyrl-BA"/>
+        </w:rPr>
+        <w:t xml:space="preserve"> тренинг</w:t>
+      </w:r>
+      <w:r>
+        <w:t xml:space="preserve"> подацима директно утиче на квалитет одговора.</w:t>
       </w:r>
     </w:p>
     <w:p>
@@ -34303,20 +35060,13 @@
         <w:ind w:left="454"/>
       </w:pPr>
       <w:r>
-        <w:t>Кључни налаз истраживања је да сви модели показују значајно боље резултате на универзалним категоријама попут географије и науке, него на категоријама специфичним за српску културу попут књижевности и kulturе. Ово потврђује да недовољна заступљеност српског језика и cultural у тренинг подацима директно утиче на квалитет одговора.</w:t>
-      </w:r>
-    </w:p>
-    <w:p>
-      <w:pPr>
-        <w:ind w:left="454"/>
-      </w:pPr>
-    </w:p>
-    <w:p>
-      <w:pPr>
-        <w:ind w:left="454"/>
-      </w:pPr>
-      <w:r>
-        <w:t>Ограничења овог истраживања укључују релативно мали скуп података од 300 питања, субјективност ручне евалуације и чињеницу да су тестирани само текстуални задаци. Будућа истраживања могла би да обухвате већи скуп питања, аутоматску евалуацију, тестирање на дијалекатским варијантама српског и поређење са моделима специјализованим за српски језик.</w:t>
+        <w:t xml:space="preserve">Ограничења овог истраживања укључују релативно мали скуп података од </w:t>
+      </w:r>
+      <w:r>
+        <w:t>143</w:t>
+      </w:r>
+      <w:r>
+        <w:t xml:space="preserve"> питања, субјективност ручне евалуације и чињеницу да су тестирани само текстуални задаци. Будућа истраживања могла би да обухвате већи скуп питања, аутоматску евалуацију, тестирање на дијалекатским варијантама српског и поређење са моделима специјализованим за српски језик.</w:t>
       </w:r>
     </w:p>
     <w:p>
@@ -34366,7 +35116,25 @@
     <w:p/>
     <w:p>
       <w:r>
-        <w:t xml:space="preserve">[1] A. Vaswani, N. Shazeer, N. Parmar, J. Uszkoreit, L. Jones, A. N. Gomez, Ł. Kaiser, and I. Polosukhin, "Attention is all you need," in </w:t>
+        <w:t xml:space="preserve">[1] A. Vaswani, N. Shazeer, N. Parmar, J. Uszkoreit, L. Jones, A. N. Gomez, Ł. Kaiser, and I. Polosukhin, </w:t>
+      </w:r>
+      <w:r>
+        <w:rPr>
+          <w:lang w:val="bs-Cyrl-BA"/>
+        </w:rPr>
+        <w:t>„</w:t>
+      </w:r>
+      <w:r>
+        <w:t>Attention is all you need,</w:t>
+      </w:r>
+      <w:r>
+        <w:rPr>
+          <w:lang w:val="bs-Cyrl-BA"/>
+        </w:rPr>
+        <w:t>“</w:t>
+      </w:r>
+      <w:r>
+        <w:t xml:space="preserve"> in </w:t>
       </w:r>
       <w:r>
         <w:rPr>
@@ -34395,13 +35163,17 @@
       </w:pPr>
     </w:p>
     <w:p>
-      <w:pPr>
-        <w:rPr>
-          <w:lang w:val="bs-Latn-BA"/>
-        </w:rPr>
-      </w:pPr>
-      <w:r>
-        <w:t xml:space="preserve">[2] T. Brown, B. Mann, N. Ryder, M. Subbiah, J. Kaplan, P. Dhariwal, et al., "Language models are few-shot learners," in </w:t>
+      <w:r>
+        <w:t xml:space="preserve">[2] T. Brown, B. Mann, N. Ryder, M. Subbiah, J. Kaplan, P. Dhariwal, et al., </w:t>
+      </w:r>
+      <w:r>
+        <w:rPr>
+          <w:lang w:val="bs-Cyrl-BA"/>
+        </w:rPr>
+        <w:t>„</w:t>
+      </w:r>
+      <w:r>
+        <w:t xml:space="preserve">Language models are few-shot learners," in </w:t>
       </w:r>
       <w:r>
         <w:rPr>
@@ -34430,15 +35202,54 @@
       </w:pPr>
     </w:p>
     <w:p>
-      <w:r>
-        <w:t xml:space="preserve">[3] OpenAI, "GPT-4 Technical Report," 2023. Доступно на: </w:t>
+      <w:pPr>
+        <w:rPr>
+          <w:lang w:val="bs-Latn-BA"/>
+        </w:rPr>
+      </w:pPr>
+      <w:r>
+        <w:t>[</w:t>
+      </w:r>
+      <w:r>
+        <w:t>3</w:t>
+      </w:r>
+      <w:r>
+        <w:t xml:space="preserve">] A. Conneau, K. Khandelwal, N. Goyal, V. Chaudhary, G. Wenzek, F. Guzmán, et al., </w:t>
+      </w:r>
+      <w:r>
+        <w:rPr>
+          <w:lang w:val="bs-Cyrl-BA"/>
+        </w:rPr>
+        <w:t>„</w:t>
+      </w:r>
+      <w:r>
+        <w:t>Unsupervised cross-lingual representation learning at scale,</w:t>
+      </w:r>
+      <w:r>
+        <w:rPr>
+          <w:lang w:val="bs-Cyrl-BA"/>
+        </w:rPr>
+        <w:t>“</w:t>
+      </w:r>
+      <w:r>
+        <w:t xml:space="preserve"> in </w:t>
+      </w:r>
+      <w:r>
+        <w:rPr>
+          <w:i/>
+          <w:iCs/>
+        </w:rPr>
+        <w:t>Proceedings of the 58th Annual Meeting of the Association for Computational Linguistics</w:t>
+      </w:r>
+      <w:r>
+        <w:t xml:space="preserve">, pp. 8440–8451, 2020. Доступно на: </w:t>
       </w:r>
       <w:hyperlink r:id="rId25" w:history="1">
         <w:r>
           <w:rPr>
             <w:rStyle w:val="Hyperlink"/>
           </w:rPr>
-          <w:t>https://cdn.openai.com/papers/gpt-4.pdf</w:t>
+          <w:t>https://arxiv.org/abs/1911.02116</w:t>
         </w:r>
       </w:hyperlink>
     </w:p>
@@ -34450,20 +35261,58 @@
       </w:pPr>
     </w:p>
     <w:p>
-      <w:pPr>
-        <w:rPr>
-          <w:lang w:val="bs-Latn-BA"/>
-        </w:rPr>
-      </w:pPr>
-      <w:r>
-        <w:t xml:space="preserve">[4] Anthropic, "Claude's Model Card," 2024. Доступно на: </w:t>
+      <w:r>
+        <w:t>[</w:t>
+      </w:r>
+      <w:r>
+        <w:t>4</w:t>
+      </w:r>
+      <w:r>
+        <w:t xml:space="preserve">] E. M. Bender, T. Gebru, A. McMillan-Major, and S. Shmitchell, </w:t>
+      </w:r>
+      <w:r>
+        <w:rPr>
+          <w:lang w:val="bs-Cyrl-BA"/>
+        </w:rPr>
+        <w:t>„</w:t>
+      </w:r>
+      <w:r>
+        <w:t xml:space="preserve">On the dangers of </w:t>
+      </w:r>
+      <w:r>
+        <w:t xml:space="preserve"> </w:t>
+      </w:r>
+      <w:r>
+        <w:t>sto</w:t>
+      </w:r>
+      <w:r>
+        <w:t>chastic parrots: Can language models be too big?</w:t>
+      </w:r>
+      <w:r>
+        <w:rPr>
+          <w:lang w:val="bs-Cyrl-BA"/>
+        </w:rPr>
+        <w:t>“</w:t>
+      </w:r>
+      <w:r>
+        <w:t xml:space="preserve"> in </w:t>
+      </w:r>
+      <w:r>
+        <w:rPr>
+          <w:i/>
+          <w:iCs/>
+        </w:rPr>
+        <w:t>Proceedings of the 2021 ACM Conference on Fairness, Accountability, and Transparency</w:t>
+      </w:r>
+      <w:r>
+        <w:t xml:space="preserve">, pp. 610–623, 2021. Доступно на: </w:t>
       </w:r>
       <w:hyperlink r:id="rId26" w:history="1">
         <w:r>
           <w:rPr>
             <w:rStyle w:val="Hyperlink"/>
           </w:rPr>
-          <w:t>https://www.anthropic.com/model-card</w:t>
+          <w:t>https://dl.acm.org/doi/10.1145/3442188.3445922</w:t>
         </w:r>
       </w:hyperlink>
     </w:p>
@@ -34476,39 +35325,111 @@
     </w:p>
     <w:p>
       <w:r>
-        <w:t xml:space="preserve">[5] A. Q. Jiang, A. Sablayrolles, A. Mensch et al., "Mistral 7B," 2023. Доступно на: </w:t>
+        <w:t>[</w:t>
+      </w:r>
+      <w:r>
+        <w:t>5</w:t>
+      </w:r>
+      <w:r>
+        <w:t xml:space="preserve">] Common Crawl, „Statistics of Common Crawl Monthly Archives — Distribution of Languages," 2024. Доступно на: </w:t>
       </w:r>
       <w:hyperlink r:id="rId27" w:history="1">
         <w:r>
           <w:rPr>
             <w:rStyle w:val="Hyperlink"/>
           </w:rPr>
-          <w:t>https://mistral.ai/news/announcing-mistral-7b</w:t>
+          <w:t>https://commoncrawl.github.io/cc-crawl-statistics/plots/languages</w:t>
         </w:r>
       </w:hyperlink>
     </w:p>
-    <w:p>
-      <w:pPr>
-        <w:rPr>
-          <w:lang w:val="bs-Latn-BA"/>
-        </w:rPr>
-      </w:pPr>
-    </w:p>
-    <w:p>
-      <w:r>
-        <w:t xml:space="preserve">[6] S. Lin, J. Hilton, and O. Evans, "TruthfulQA: Measuring how models mimic human falsehoods," in </w:t>
+    <w:p/>
+    <w:p>
+      <w:r>
+        <w:t>[</w:t>
+      </w:r>
+      <w:r>
+        <w:t>6</w:t>
+      </w:r>
+      <w:r>
+        <w:t xml:space="preserve">] D. Hendrycks, C. Burns, S. Basart et al., </w:t>
+      </w:r>
+      <w:r>
+        <w:rPr>
+          <w:lang w:val="bs-Cyrl-BA"/>
+        </w:rPr>
+        <w:t>„</w:t>
+      </w:r>
+      <w:r>
+        <w:t>Measuring massive multitask language understanding,</w:t>
+      </w:r>
+      <w:r>
+        <w:rPr>
+          <w:lang w:val="bs-Cyrl-BA"/>
+        </w:rPr>
+        <w:t>“</w:t>
+      </w:r>
+      <w:r>
+        <w:t xml:space="preserve"> in </w:t>
       </w:r>
       <w:r>
         <w:rPr>
           <w:i/>
           <w:iCs/>
         </w:rPr>
+        <w:t>International Conference on Learning Representations</w:t>
+      </w:r>
+      <w:r>
+        <w:t xml:space="preserve">, 2021. Доступно на: </w:t>
+      </w:r>
+      <w:hyperlink r:id="rId28" w:history="1">
+        <w:r>
+          <w:rPr>
+            <w:rStyle w:val="Hyperlink"/>
+          </w:rPr>
+          <w:t>https://openreview.net/pdf?id=d7KBjmI3GmQ</w:t>
+        </w:r>
+      </w:hyperlink>
+    </w:p>
+    <w:p/>
+    <w:p>
+      <w:r>
+        <w:t>[</w:t>
+      </w:r>
+      <w:r>
+        <w:t>7</w:t>
+      </w:r>
+      <w:r>
+        <w:t xml:space="preserve">] S. Lin, J. Hilton, and O. Evans, </w:t>
+      </w:r>
+      <w:r>
+        <w:rPr>
+          <w:lang w:val="bs-Cyrl-BA"/>
+        </w:rPr>
+        <w:t>„</w:t>
+      </w:r>
+      <w:r>
+        <w:t>TruthfulQA: Measuring how models mimic human falsehoods,</w:t>
+      </w:r>
+      <w:r>
+        <w:rPr>
+          <w:lang w:val="bs-Cyrl-BA"/>
+        </w:rPr>
+        <w:t>“</w:t>
+      </w:r>
+      <w:r>
+        <w:t xml:space="preserve"> in </w:t>
+      </w:r>
+      <w:r>
+        <w:rPr>
+          <w:i/>
+          <w:iCs/>
+        </w:rPr>
         <w:t>Proceedings of the 60th Annual Meeting of the Association for Computational Linguistics</w:t>
       </w:r>
       <w:r>
         <w:t xml:space="preserve">, pp. 3214–3252, 2022. Доступно на: </w:t>
       </w:r>
-      <w:hyperlink r:id="rId28" w:history="1">
+      <w:hyperlink r:id="rId29" w:history="1">
         <w:r>
           <w:rPr>
             <w:rStyle w:val="Hyperlink"/>
@@ -34525,30 +35446,8 @@
       </w:pPr>
     </w:p>
     <w:p>
-      <w:r>
-        <w:t xml:space="preserve">[7] D. Hendrycks, C. Burns, S. Basart et al., "Measuring massive multitask language understanding," in </w:t>
-      </w:r>
-      <w:r>
-        <w:rPr>
-          <w:i/>
-          <w:iCs/>
-        </w:rPr>
-        <w:t>International Conference on Learning Representations</w:t>
-      </w:r>
-      <w:r>
-        <w:t xml:space="preserve">, 2021. Доступно на: </w:t>
-      </w:r>
-      <w:hyperlink r:id="rId29" w:history="1">
-        <w:r>
-          <w:rPr>
-            <w:rStyle w:val="Hyperlink"/>
-          </w:rPr>
-          <w:t>https://openreview.net/pdf?id=d7KBjmI3GmQ</w:t>
-        </w:r>
-      </w:hyperlink>
-    </w:p>
-    <w:p>
-      <w:pPr>
+      <w:pPr>
+        <w:ind w:left="0" w:firstLine="0"/>
         <w:rPr>
           <w:lang w:val="bs-Latn-BA"/>
         </w:rPr>
@@ -34556,7 +35455,25 @@
     </w:p>
     <w:p>
       <w:r>
-        <w:t xml:space="preserve">[8] A. Srivastava, A. Rastogi, A. Rao et al., "Beyond the imitation game: Quantifying and extrapolating the capabilities of language models," </w:t>
+        <w:t xml:space="preserve">[8] A. Srivastava, A. Rastogi, A. Rao et al., </w:t>
+      </w:r>
+      <w:r>
+        <w:rPr>
+          <w:lang w:val="bs-Cyrl-BA"/>
+        </w:rPr>
+        <w:t>„</w:t>
+      </w:r>
+      <w:r>
+        <w:t>Beyond the imitation game: Quantifying and extrapolating the capabilities of language models,</w:t>
+      </w:r>
+      <w:r>
+        <w:rPr>
+          <w:lang w:val="bs-Cyrl-BA"/>
+        </w:rPr>
+        <w:t>“</w:t>
+      </w:r>
+      <w:r>
+        <w:t xml:space="preserve"> </w:t>
       </w:r>
       <w:r>
         <w:rPr>
@@ -34579,14 +35496,26 @@
     </w:p>
     <w:p/>
     <w:p>
-      <w:pPr>
-        <w:rPr>
-          <w:lang w:val="bs-Latn-BA"/>
-        </w:rPr>
-      </w:pPr>
-      <w:r>
-        <w:lastRenderedPageBreak/>
-        <w:t xml:space="preserve">[9] Z. Ji, N. Lee, R. Frieske, T. Yu, D. Su, Y. Xu, et al., "Survey of hallucination in natural language generation," </w:t>
+      <w:r>
+        <w:t xml:space="preserve">[9] Z. Ji, N. Lee, R. Frieske, T. Yu, D. Su, Y. Xu, et al., </w:t>
+      </w:r>
+      <w:r>
+        <w:rPr>
+          <w:lang w:val="bs-Cyrl-BA"/>
+        </w:rPr>
+        <w:t>„</w:t>
+      </w:r>
+      <w:r>
+        <w:t>Survey of hallucination in natural language generation,</w:t>
+      </w:r>
+      <w:r>
+        <w:rPr>
+          <w:lang w:val="bs-Cyrl-BA"/>
+        </w:rPr>
+        <w:t>“</w:t>
+      </w:r>
+      <w:r>
+        <w:t xml:space="preserve"> </w:t>
       </w:r>
       <w:r>
         <w:rPr>
@@ -34609,126 +35538,89 @@
     </w:p>
     <w:p>
       <w:pPr>
+        <w:ind w:left="0" w:firstLine="0"/>
         <w:rPr>
           <w:lang w:val="bs-Latn-BA"/>
         </w:rPr>
       </w:pPr>
     </w:p>
     <w:p>
-      <w:pPr>
-        <w:rPr>
-          <w:lang w:val="bs-Latn-BA"/>
-        </w:rPr>
-      </w:pPr>
-      <w:r>
-        <w:t xml:space="preserve">[10] A. Conneau, K. Khandelwal, N. Goyal, V. Chaudhary, G. Wenzek, F. Guzmán, et al., "Unsupervised cross-lingual representation learning at scale," in </w:t>
-      </w:r>
-      <w:r>
-        <w:rPr>
-          <w:i/>
-          <w:iCs/>
-        </w:rPr>
-        <w:t>Proceedings of the 58th Annual Meeting of the Association for Computational Linguistics</w:t>
-      </w:r>
-      <w:r>
-        <w:t xml:space="preserve">, pp. 8440–8451, 2020. Доступно на: </w:t>
+      <w:r>
+        <w:t>[</w:t>
+      </w:r>
+      <w:r>
+        <w:t>1</w:t>
+      </w:r>
+      <w:r>
+        <w:t>0</w:t>
+      </w:r>
+      <w:r>
+        <w:t xml:space="preserve">] OpenAI, </w:t>
+      </w:r>
+      <w:r>
+        <w:rPr>
+          <w:lang w:val="bs-Cyrl-BA"/>
+        </w:rPr>
+        <w:t>„</w:t>
+      </w:r>
+      <w:r>
+        <w:t>GPT-4 Technical Report,</w:t>
+      </w:r>
+      <w:r>
+        <w:rPr>
+          <w:lang w:val="bs-Cyrl-BA"/>
+        </w:rPr>
+        <w:t>“</w:t>
+      </w:r>
+      <w:r>
+        <w:t xml:space="preserve"> 2023. Доступно на: </w:t>
       </w:r>
       <w:hyperlink r:id="rId32" w:history="1">
         <w:r>
           <w:rPr>
             <w:rStyle w:val="Hyperlink"/>
           </w:rPr>
-          <w:t>https://arxiv.org/abs/1911.02116</w:t>
+          <w:t>https://cdn.openai.com/papers/gpt-4.pdf</w:t>
         </w:r>
       </w:hyperlink>
     </w:p>
     <w:p>
       <w:pPr>
+        <w:ind w:left="0" w:firstLine="0"/>
         <w:rPr>
           <w:lang w:val="bs-Latn-BA"/>
         </w:rPr>
       </w:pPr>
     </w:p>
     <w:p>
-      <w:pPr>
-        <w:rPr>
-          <w:lang w:val="bs-Latn-BA"/>
-        </w:rPr>
-      </w:pPr>
-      <w:r>
-        <w:t xml:space="preserve">[11] E. M. Bender, T. Gebru, A. McMillan-Major, and S. Shmitchell, "On the dangers of stochastic parrots: Can language models be too big?" in </w:t>
-      </w:r>
-      <w:r>
-        <w:rPr>
-          <w:i/>
-          <w:iCs/>
-        </w:rPr>
-        <w:t>Proceedings of the 2021 ACM Conference on Fairness, Accountability, and Transparency</w:t>
-      </w:r>
-      <w:r>
-        <w:t xml:space="preserve">, pp. 610–623, 2021. Доступно на: </w:t>
+      <w:r>
+        <w:t>[1</w:t>
+      </w:r>
+      <w:r>
+        <w:t>1</w:t>
+      </w:r>
+      <w:r>
+        <w:t xml:space="preserve">] OpenAI, </w:t>
+      </w:r>
+      <w:r>
+        <w:rPr>
+          <w:lang w:val="bs-Cyrl-BA"/>
+        </w:rPr>
+        <w:t>„</w:t>
+      </w:r>
+      <w:r>
+        <w:t>OpenAI API Documentation,</w:t>
+      </w:r>
+      <w:r>
+        <w:rPr>
+          <w:lang w:val="bs-Cyrl-BA"/>
+        </w:rPr>
+        <w:t>“</w:t>
+      </w:r>
+      <w:r>
+        <w:t xml:space="preserve"> 2024. Доступно на: </w:t>
       </w:r>
       <w:hyperlink r:id="rId33" w:history="1">
-        <w:r>
-          <w:rPr>
-            <w:rStyle w:val="Hyperlink"/>
-          </w:rPr>
-          <w:t>https://dl.acm.org/doi/10.1145/3442188.3445922</w:t>
-        </w:r>
-      </w:hyperlink>
-    </w:p>
-    <w:p>
-      <w:pPr>
-        <w:rPr>
-          <w:lang w:val="bs-Latn-BA"/>
-        </w:rPr>
-      </w:pPr>
-    </w:p>
-    <w:p>
-      <w:pPr>
-        <w:rPr>
-          <w:lang w:val="bs-Latn-BA"/>
-        </w:rPr>
-      </w:pPr>
-      <w:r>
-        <w:t xml:space="preserve">[12] I. Goodfellow, Y. Bengio, and A. Courville, </w:t>
-      </w:r>
-      <w:r>
-        <w:rPr>
-          <w:i/>
-          <w:iCs/>
-        </w:rPr>
-        <w:t>Deep Learning</w:t>
-      </w:r>
-      <w:r>
-        <w:t xml:space="preserve">. MIT Press, 2016. Доступно на: </w:t>
-      </w:r>
-      <w:hyperlink r:id="rId34" w:history="1">
-        <w:r>
-          <w:rPr>
-            <w:rStyle w:val="Hyperlink"/>
-          </w:rPr>
-          <w:t>https://www.deeplearningbook.org/</w:t>
-        </w:r>
-      </w:hyperlink>
-    </w:p>
-    <w:p>
-      <w:pPr>
-        <w:rPr>
-          <w:lang w:val="bs-Latn-BA"/>
-        </w:rPr>
-      </w:pPr>
-    </w:p>
-    <w:p>
-      <w:pPr>
-        <w:rPr>
-          <w:lang w:val="bs-Latn-BA"/>
-        </w:rPr>
-      </w:pPr>
-      <w:r>
-        <w:t xml:space="preserve">[13] OpenAI, "OpenAI API Documentation," 2024. Доступно на: </w:t>
-      </w:r>
-      <w:hyperlink r:id="rId35" w:history="1">
         <w:r>
           <w:rPr>
             <w:rStyle w:val="Hyperlink"/>
@@ -34751,9 +35643,82 @@
         </w:rPr>
       </w:pPr>
       <w:r>
-        <w:t xml:space="preserve">[14] Anthropic, "Anthropic API Documentation," 2024. Доступно на: </w:t>
-      </w:r>
-      <w:hyperlink r:id="rId36" w:history="1">
+        <w:t>[</w:t>
+      </w:r>
+      <w:r>
+        <w:t>12</w:t>
+      </w:r>
+      <w:r>
+        <w:t xml:space="preserve">] Anthropic, </w:t>
+      </w:r>
+      <w:r>
+        <w:rPr>
+          <w:lang w:val="bs-Cyrl-BA"/>
+        </w:rPr>
+        <w:t>„</w:t>
+      </w:r>
+      <w:r>
+        <w:t>Claude's Model Card,</w:t>
+      </w:r>
+      <w:r>
+        <w:rPr>
+          <w:lang w:val="bs-Cyrl-BA"/>
+        </w:rPr>
+        <w:t>“</w:t>
+      </w:r>
+      <w:r>
+        <w:t xml:space="preserve"> 2024. Доступно на: </w:t>
+      </w:r>
+      <w:hyperlink r:id="rId34" w:history="1">
+        <w:r>
+          <w:rPr>
+            <w:rStyle w:val="Hyperlink"/>
+          </w:rPr>
+          <w:t>https://www.anthropic.com/model-card</w:t>
+        </w:r>
+      </w:hyperlink>
+    </w:p>
+    <w:p>
+      <w:pPr>
+        <w:rPr>
+          <w:lang w:val="bs-Latn-BA"/>
+        </w:rPr>
+      </w:pPr>
+    </w:p>
+    <w:p>
+      <w:pPr>
+        <w:rPr>
+          <w:lang w:val="bs-Latn-BA"/>
+        </w:rPr>
+      </w:pPr>
+      <w:r>
+        <w:t>[1</w:t>
+      </w:r>
+      <w:r>
+        <w:t>3</w:t>
+      </w:r>
+      <w:r>
+        <w:t xml:space="preserve">] Anthropic, </w:t>
+      </w:r>
+      <w:r>
+        <w:rPr>
+          <w:lang w:val="bs-Cyrl-BA"/>
+        </w:rPr>
+        <w:t>„</w:t>
+      </w:r>
+      <w:r>
+        <w:t>Anthropic API Documentation,</w:t>
+      </w:r>
+      <w:r>
+        <w:rPr>
+          <w:lang w:val="bs-Cyrl-BA"/>
+        </w:rPr>
+        <w:t>“</w:t>
+      </w:r>
+      <w:r>
+        <w:t xml:space="preserve"> 2024. Доступно на: </w:t>
+      </w:r>
+      <w:hyperlink r:id="rId35" w:history="1">
         <w:r>
           <w:rPr>
             <w:rStyle w:val="Hyperlink"/>
@@ -34771,9 +35736,42 @@
     </w:p>
     <w:p>
       <w:r>
-        <w:t xml:space="preserve">[15] Mistral AI, "Mistral API Documentation," 2024. Доступно на: </w:t>
-      </w:r>
-      <w:hyperlink r:id="rId37" w:history="1">
+        <w:t>[1</w:t>
+      </w:r>
+      <w:r>
+        <w:t>4</w:t>
+      </w:r>
+      <w:r>
+        <w:t>]</w:t>
+      </w:r>
+      <w:r>
+        <w:rPr>
+          <w:lang w:val="bs-Cyrl-BA"/>
+        </w:rPr>
+        <w:t xml:space="preserve">  </w:t>
+      </w:r>
+      <w:r>
+        <w:t xml:space="preserve">Mistral AI, </w:t>
+      </w:r>
+      <w:r>
+        <w:rPr>
+          <w:lang w:val="bs-Cyrl-BA"/>
+        </w:rPr>
+        <w:t>„</w:t>
+      </w:r>
+      <w:r>
+        <w:t>Mistral API Documentation,</w:t>
+      </w:r>
+      <w:r>
+        <w:rPr>
+          <w:lang w:val="bs-Cyrl-BA"/>
+        </w:rPr>
+        <w:t>“</w:t>
+      </w:r>
+      <w:r>
+        <w:t xml:space="preserve"> 2024. Доступно на: </w:t>
+      </w:r>
+      <w:hyperlink r:id="rId36" w:history="1">
         <w:r>
           <w:rPr>
             <w:rStyle w:val="Hyperlink"/>
@@ -34781,6 +35779,70 @@
           <w:t>https://docs.mistral.ai</w:t>
         </w:r>
       </w:hyperlink>
+    </w:p>
+    <w:p/>
+    <w:p>
+      <w:r>
+        <w:t>[</w:t>
+      </w:r>
+      <w:r>
+        <w:t>1</w:t>
+      </w:r>
+      <w:r>
+        <w:t xml:space="preserve">5] A. Q. Jiang, A. Sablayrolles, A. Mensch et al., </w:t>
+      </w:r>
+      <w:r>
+        <w:rPr>
+          <w:lang w:val="bs-Cyrl-BA"/>
+        </w:rPr>
+        <w:t>„</w:t>
+      </w:r>
+      <w:r>
+        <w:t>Mistral 7B,</w:t>
+      </w:r>
+      <w:r>
+        <w:rPr>
+          <w:lang w:val="bs-Cyrl-BA"/>
+        </w:rPr>
+        <w:t>“</w:t>
+      </w:r>
+      <w:r>
+        <w:t xml:space="preserve"> 2023. Доступно на: </w:t>
+      </w:r>
+      <w:hyperlink r:id="rId37" w:history="1">
+        <w:r>
+          <w:rPr>
+            <w:rStyle w:val="Hyperlink"/>
+          </w:rPr>
+          <w:t>https://mistral.ai/news/announci</w:t>
+        </w:r>
+        <w:r>
+          <w:rPr>
+            <w:rStyle w:val="Hyperlink"/>
+          </w:rPr>
+          <w:t>n</w:t>
+        </w:r>
+        <w:r>
+          <w:rPr>
+            <w:rStyle w:val="Hyperlink"/>
+          </w:rPr>
+          <w:t>g-mistral-7b</w:t>
+        </w:r>
+      </w:hyperlink>
+    </w:p>
+    <w:p>
+      <w:pPr>
+        <w:rPr>
+          <w:lang w:val="en-US"/>
+        </w:rPr>
+      </w:pPr>
+    </w:p>
+    <w:p>
+      <w:pPr>
+        <w:rPr>
+          <w:lang w:val="en-US"/>
+        </w:rPr>
+      </w:pPr>
     </w:p>
     <w:p>
       <w:pPr>
@@ -34889,8 +35951,6 @@
       </w:pPr>
       <w:r>
         <w:rPr>
-          <w:b/>
-          <w:bCs/>
           <w:iCs/>
           <w:szCs w:val="28"/>
         </w:rPr>
@@ -34901,7 +35961,22 @@
           <w:iCs/>
           <w:szCs w:val="28"/>
         </w:rPr>
-        <w:t xml:space="preserve"> — Заступљеност одабраних језика у Common Crawl скупу података (CC-MAIN-2026-17). Енглески језик доминира са уделом од 41%, dok српски језик заузима свега 0.26%, што га сврстава међу најмање заступљене европске језике у тренинг подацима великих језичких модела.</w:t>
+        <w:t xml:space="preserve"> — Заступљеност одабраних језика у Common Crawl скупу података (CC-MAIN-2026-17). Енглески језик доминира са уделом од 41%, </w:t>
+      </w:r>
+      <w:r>
+        <w:rPr>
+          <w:iCs/>
+          <w:szCs w:val="28"/>
+          <w:lang w:val="bs-Cyrl-BA"/>
+        </w:rPr>
+        <w:t>док</w:t>
+      </w:r>
+      <w:r>
+        <w:rPr>
+          <w:iCs/>
+          <w:szCs w:val="28"/>
+        </w:rPr>
+        <w:t xml:space="preserve"> српски језик заузима свега 0.26%, што га сврстава међу најмање заступљене европске језике у тренинг подацима великих језичких модела.</w:t>
       </w:r>
       <w:r>
         <w:rPr>
@@ -35019,7 +36094,21 @@
           <w:iCs/>
           <w:lang w:val="bs-Latn-BA"/>
         </w:rPr>
-        <w:t xml:space="preserve"> (autor)</w:t>
+        <w:t xml:space="preserve"> (</w:t>
+      </w:r>
+      <w:r>
+        <w:rPr>
+          <w:iCs/>
+          <w:lang w:val="bs-Cyrl-BA"/>
+        </w:rPr>
+        <w:t>аутор</w:t>
+      </w:r>
+      <w:r>
+        <w:rPr>
+          <w:iCs/>
+          <w:lang w:val="bs-Latn-BA"/>
+        </w:rPr>
+        <w:t>)</w:t>
       </w:r>
     </w:p>
     <w:p>
@@ -35043,7 +36132,21 @@
           <w:iCs/>
           <w:lang w:val="bs-Latn-BA"/>
         </w:rPr>
-        <w:t xml:space="preserve"> (autor)</w:t>
+        <w:t xml:space="preserve"> (</w:t>
+      </w:r>
+      <w:r>
+        <w:rPr>
+          <w:iCs/>
+          <w:lang w:val="bs-Cyrl-BA"/>
+        </w:rPr>
+        <w:t>аутор</w:t>
+      </w:r>
+      <w:r>
+        <w:rPr>
+          <w:iCs/>
+          <w:lang w:val="bs-Latn-BA"/>
+        </w:rPr>
+        <w:t>)</w:t>
       </w:r>
     </w:p>
     <w:p>
@@ -35067,7 +36170,21 @@
           <w:iCs/>
           <w:lang w:val="bs-Latn-BA"/>
         </w:rPr>
-        <w:t xml:space="preserve"> (autor)</w:t>
+        <w:t xml:space="preserve"> (</w:t>
+      </w:r>
+      <w:r>
+        <w:rPr>
+          <w:iCs/>
+          <w:lang w:val="bs-Cyrl-BA"/>
+        </w:rPr>
+        <w:t>аутор</w:t>
+      </w:r>
+      <w:r>
+        <w:rPr>
+          <w:iCs/>
+          <w:lang w:val="bs-Latn-BA"/>
+        </w:rPr>
+        <w:t>)</w:t>
       </w:r>
     </w:p>
     <w:p>
@@ -35092,7 +36209,21 @@
           <w:iCs/>
           <w:lang w:val="bs-Latn-BA"/>
         </w:rPr>
-        <w:t xml:space="preserve"> (autor)</w:t>
+        <w:t xml:space="preserve"> (</w:t>
+      </w:r>
+      <w:r>
+        <w:rPr>
+          <w:iCs/>
+          <w:lang w:val="bs-Cyrl-BA"/>
+        </w:rPr>
+        <w:t>аутор</w:t>
+      </w:r>
+      <w:r>
+        <w:rPr>
+          <w:iCs/>
+          <w:lang w:val="bs-Latn-BA"/>
+        </w:rPr>
+        <w:t>)</w:t>
       </w:r>
     </w:p>
     <w:p>
@@ -35117,10 +36248,22 @@
         <w:t xml:space="preserve">Слика 4.4.1 </w:t>
       </w:r>
       <w:r>
-        <w:t>Dashboard резултата евалуације</w:t>
-      </w:r>
-      <w:r>
-        <w:t xml:space="preserve"> (autor)</w:t>
+        <w:t>Tabla</w:t>
+      </w:r>
+      <w:r>
+        <w:t xml:space="preserve"> резултата евалуације</w:t>
+      </w:r>
+      <w:r>
+        <w:t xml:space="preserve"> (</w:t>
+      </w:r>
+      <w:r>
+        <w:rPr>
+          <w:lang w:val="bs-Cyrl-BA"/>
+        </w:rPr>
+        <w:t>аутор</w:t>
+      </w:r>
+      <w:r>
+        <w:t>)</w:t>
       </w:r>
     </w:p>
     <w:p>
@@ -35304,7 +36447,137 @@
         <w:ind w:left="0" w:firstLine="0"/>
         <w:jc w:val="left"/>
         <w:rPr>
-          <w:lang w:val="bs-Cyrl-BA"/>
+          <w:lang w:val="bs-Latn-BA"/>
+        </w:rPr>
+      </w:pPr>
+      <w:r>
+        <w:rPr>
+          <w:lang w:val="bs-Cyrl-BA"/>
+        </w:rPr>
+        <w:t>Филип Глишић рођен је  24. априла 2002. године у  Шапцу. Основно</w:t>
+      </w:r>
+      <w:r>
+        <w:rPr>
+          <w:lang w:val="en-US"/>
+        </w:rPr>
+        <w:t xml:space="preserve"> </w:t>
+      </w:r>
+      <w:r>
+        <w:rPr>
+          <w:lang w:val="bs-Cyrl-BA"/>
+        </w:rPr>
+        <w:t xml:space="preserve">образовање је завршио у основној школи „Иво Андрић“. Након завршене основне школе уписује </w:t>
+      </w:r>
+      <w:r>
+        <w:rPr>
+          <w:lang w:val="bs-Cyrl-BA"/>
+        </w:rPr>
+        <w:t>г</w:t>
+      </w:r>
+      <w:r>
+        <w:rPr>
+          <w:lang w:val="bs-Cyrl-BA"/>
+        </w:rPr>
+        <w:t xml:space="preserve">имназију у Бањалуци </w:t>
+      </w:r>
+      <w:r>
+        <w:rPr>
+          <w:lang w:val="bs-Cyrl-BA"/>
+        </w:rPr>
+        <w:t>, а потом 2021. године упис</w:t>
+      </w:r>
+      <w:r>
+        <w:rPr>
+          <w:lang w:val="bs-Cyrl-BA"/>
+        </w:rPr>
+        <w:t>ује</w:t>
+      </w:r>
+      <w:r>
+        <w:rPr>
+          <w:lang w:val="bs-Cyrl-BA"/>
+        </w:rPr>
+        <w:t xml:space="preserve"> основне  академске студије на Факултету </w:t>
+      </w:r>
+      <w:r>
+        <w:rPr>
+          <w:lang w:val="bs-Cyrl-BA"/>
+        </w:rPr>
+        <w:t>т</w:t>
+      </w:r>
+      <w:r>
+        <w:t>ехничких наука Универзитета у Новом Саду</w:t>
+      </w:r>
+      <w:r>
+        <w:rPr>
+          <w:lang w:val="bs-Cyrl-BA"/>
+        </w:rPr>
+        <w:t>, смер примењено соф</w:t>
+      </w:r>
+      <w:r>
+        <w:rPr>
+          <w:lang w:val="bs-Cyrl-BA"/>
+        </w:rPr>
+        <w:t>т</w:t>
+      </w:r>
+      <w:r>
+        <w:rPr>
+          <w:lang w:val="bs-Cyrl-BA"/>
+        </w:rPr>
+        <w:t>верско инжењерство</w:t>
+      </w:r>
+      <w:r>
+        <w:t>.</w:t>
+      </w:r>
+      <w:r>
+        <w:rPr>
+          <w:lang w:val="bs-Cyrl-BA"/>
+        </w:rPr>
+        <w:t xml:space="preserve"> Испунио је све обавезе и п</w:t>
+      </w:r>
+      <w:r>
+        <w:rPr>
+          <w:lang w:val="bs-Cyrl-BA"/>
+        </w:rPr>
+        <w:t>оложио је све испите предвиђене планом и програмом.</w:t>
+      </w:r>
+    </w:p>
+    <w:p>
+      <w:pPr>
+        <w:ind w:left="0" w:firstLine="0"/>
+        <w:jc w:val="left"/>
+        <w:rPr>
+          <w:lang w:val="bs-Latn-BA"/>
+        </w:rPr>
+      </w:pPr>
+    </w:p>
+    <w:p>
+      <w:pPr>
+        <w:ind w:left="0" w:firstLine="0"/>
+        <w:jc w:val="left"/>
+        <w:rPr>
+          <w:lang w:val="bs-Latn-BA"/>
+        </w:rPr>
+      </w:pPr>
+    </w:p>
+    <w:p>
+      <w:pPr>
+        <w:rPr>
+          <w:lang w:val="bs-Latn-BA"/>
+        </w:rPr>
+      </w:pPr>
+      <w:r>
+        <w:rPr>
+          <w:lang w:val="bs-Latn-BA"/>
+        </w:rPr>
+        <w:br w:type="page"/>
+      </w:r>
+    </w:p>
+    <w:p>
+      <w:pPr>
+        <w:ind w:left="0" w:firstLine="0"/>
+        <w:jc w:val="left"/>
+        <w:rPr>
+          <w:lang w:val="bs-Latn-BA"/>
         </w:rPr>
         <w:sectPr>
           <w:footerReference w:type="even" r:id="rId42"/>
@@ -35317,66 +36590,6 @@
           <w:titlePg/>
         </w:sectPr>
       </w:pPr>
-      <w:r>
-        <w:rPr>
-          <w:lang w:val="bs-Cyrl-BA"/>
-        </w:rPr>
-        <w:t>Филип Глишић рођен је  24. априла 2002. године у  Шапцу. Основно</w:t>
-      </w:r>
-      <w:r>
-        <w:rPr>
-          <w:lang w:val="en-US"/>
-        </w:rPr>
-        <w:t xml:space="preserve"> </w:t>
-      </w:r>
-      <w:r>
-        <w:rPr>
-          <w:lang w:val="bs-Cyrl-BA"/>
-        </w:rPr>
-        <w:t xml:space="preserve">образовање је завршио у основној школи „Иво Андрић“. Након завршене основне школе уписује Гимназију у Бањалуци </w:t>
-      </w:r>
-      <w:r>
-        <w:rPr>
-          <w:lang w:val="bs-Cyrl-BA"/>
-        </w:rPr>
-        <w:t>, а потом 2021. године упис</w:t>
-      </w:r>
-      <w:r>
-        <w:rPr>
-          <w:lang w:val="bs-Cyrl-BA"/>
-        </w:rPr>
-        <w:t>ује</w:t>
-      </w:r>
-      <w:r>
-        <w:rPr>
-          <w:lang w:val="bs-Cyrl-BA"/>
-        </w:rPr>
-        <w:t xml:space="preserve"> основне  академске студије на Факултету </w:t>
-      </w:r>
-      <w:r>
-        <w:t>Техничких наука Универзитета у Новом Саду</w:t>
-      </w:r>
-      <w:r>
-        <w:rPr>
-          <w:lang w:val="bs-Cyrl-BA"/>
-        </w:rPr>
-        <w:t>, смер примењено софрверско инжењерство</w:t>
-      </w:r>
-      <w:r>
-        <w:t>.</w:t>
-      </w:r>
-      <w:r>
-        <w:rPr>
-          <w:lang w:val="bs-Cyrl-BA"/>
-        </w:rPr>
-        <w:t xml:space="preserve"> Испунио је све обавезе и п</w:t>
-      </w:r>
-      <w:r>
-        <w:rPr>
-          <w:lang w:val="bs-Cyrl-BA"/>
-        </w:rPr>
-        <w:t>оложио је све испите предвиђене планом и програмом.</w:t>
-      </w:r>
     </w:p>
     <w:tbl>
       <w:tblPr>
@@ -35695,7 +36908,7 @@
           </mc:Choice>
           <mc:Fallback>
             <w:pict>
-              <v:group w14:anchorId="5CB97A4E" id="Group 138041" o:spid="_x0000_s1026" style="width:456.65pt;height:.7pt;mso-position-horizontal-relative:char;mso-position-vertical-relative:line" coordsize="57997,91" o:gfxdata="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">
+              <v:group w14:anchorId="2F3C90C9" id="Group 138041" o:spid="_x0000_s1026" style="width:456.65pt;height:.7pt;mso-position-horizontal-relative:char;mso-position-vertical-relative:line" coordsize="57997,91" o:gfxdata="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">
                 <v:shape id="Shape 179033" o:spid="_x0000_s1027" style="position:absolute;width:57997;height:91;visibility:visible;mso-wrap-style:square;v-text-anchor:top" coordsize="5799709,9144" o:gfxdata="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" path="m,l5799709,r,9144l,9144,,e" fillcolor="black" stroked="f" strokeweight="0">
                   <v:stroke miterlimit="83231f" joinstyle="miter"/>
                   <v:path arrowok="t" textboxrect="0,0,5799709,9144"/>
@@ -36830,16 +38043,16 @@
     </w:lvl>
   </w:abstractNum>
   <w:abstractNum w:abstractNumId="6" w15:restartNumberingAfterBreak="0">
-    <w:nsid w:val="0EC54405"/>
+    <w:nsid w:val="0C443A05"/>
     <w:multiLevelType w:val="hybridMultilevel"/>
-    <w:tmpl w:val="7332C240"/>
+    <w:tmpl w:val="18FAA324"/>
     <w:lvl w:ilvl="0" w:tplc="241A0001">
       <w:start w:val="1"/>
       <w:numFmt w:val="bullet"/>
       <w:lvlText w:val=""/>
       <w:lvlJc w:val="left"/>
       <w:pPr>
-        <w:ind w:left="1080" w:hanging="360"/>
+        <w:ind w:left="720" w:hanging="360"/>
       </w:pPr>
       <w:rPr>
         <w:rFonts w:ascii="Symbol" w:hAnsi="Symbol" w:hint="default"/>
@@ -36851,7 +38064,7 @@
       <w:lvlText w:val="o"/>
       <w:lvlJc w:val="left"/>
       <w:pPr>
-        <w:ind w:left="1800" w:hanging="360"/>
+        <w:ind w:left="1440" w:hanging="360"/>
       </w:pPr>
       <w:rPr>
         <w:rFonts w:ascii="Courier New" w:hAnsi="Courier New" w:cs="Courier New" w:hint="default"/>
@@ -36863,7 +38076,7 @@
       <w:lvlText w:val=""/>
       <w:lvlJc w:val="left"/>
       <w:pPr>
-        <w:ind w:left="2520" w:hanging="360"/>
+        <w:ind w:left="2160" w:hanging="360"/>
       </w:pPr>
       <w:rPr>
         <w:rFonts w:ascii="Wingdings" w:hAnsi="Wingdings" w:hint="default"/>
@@ -36875,7 +38088,7 @@
       <w:lvlText w:val=""/>
       <w:lvlJc w:val="left"/>
       <w:pPr>
-        <w:ind w:left="3240" w:hanging="360"/>
+        <w:ind w:left="2880" w:hanging="360"/>
       </w:pPr>
       <w:rPr>
         <w:rFonts w:ascii="Symbol" w:hAnsi="Symbol" w:hint="default"/>
@@ -36887,7 +38100,7 @@
       <w:lvlText w:val="o"/>
       <w:lvlJc w:val="left"/>
       <w:pPr>
-        <w:ind w:left="3960" w:hanging="360"/>
+        <w:ind w:left="3600" w:hanging="360"/>
       </w:pPr>
       <w:rPr>
         <w:rFonts w:ascii="Courier New" w:hAnsi="Courier New" w:cs="Courier New" w:hint="default"/>
@@ -36899,7 +38112,7 @@
       <w:lvlText w:val=""/>
       <w:lvlJc w:val="left"/>
       <w:pPr>
-        <w:ind w:left="4680" w:hanging="360"/>
+        <w:ind w:left="4320" w:hanging="360"/>
       </w:pPr>
       <w:rPr>
         <w:rFonts w:ascii="Wingdings" w:hAnsi="Wingdings" w:hint="default"/>
@@ -36911,7 +38124,7 @@
       <w:lvlText w:val=""/>
       <w:lvlJc w:val="left"/>
       <w:pPr>
-        <w:ind w:left="5400" w:hanging="360"/>
+        <w:ind w:left="5040" w:hanging="360"/>
       </w:pPr>
       <w:rPr>
         <w:rFonts w:ascii="Symbol" w:hAnsi="Symbol" w:hint="default"/>
@@ -36923,7 +38136,7 @@
       <w:lvlText w:val="o"/>
       <w:lvlJc w:val="left"/>
       <w:pPr>
-        <w:ind w:left="6120" w:hanging="360"/>
+        <w:ind w:left="5760" w:hanging="360"/>
       </w:pPr>
       <w:rPr>
         <w:rFonts w:ascii="Courier New" w:hAnsi="Courier New" w:cs="Courier New" w:hint="default"/>
@@ -36935,7 +38148,7 @@
       <w:lvlText w:val=""/>
       <w:lvlJc w:val="left"/>
       <w:pPr>
-        <w:ind w:left="6840" w:hanging="360"/>
+        <w:ind w:left="6480" w:hanging="360"/>
       </w:pPr>
       <w:rPr>
         <w:rFonts w:ascii="Wingdings" w:hAnsi="Wingdings" w:hint="default"/>
@@ -36943,16 +38156,16 @@
     </w:lvl>
   </w:abstractNum>
   <w:abstractNum w:abstractNumId="7" w15:restartNumberingAfterBreak="0">
-    <w:nsid w:val="1119125E"/>
+    <w:nsid w:val="0EC54405"/>
     <w:multiLevelType w:val="hybridMultilevel"/>
-    <w:tmpl w:val="AFDC0C68"/>
+    <w:tmpl w:val="7332C240"/>
     <w:lvl w:ilvl="0" w:tplc="241A0001">
       <w:start w:val="1"/>
       <w:numFmt w:val="bullet"/>
       <w:lvlText w:val=""/>
       <w:lvlJc w:val="left"/>
       <w:pPr>
-        <w:ind w:left="1400" w:hanging="360"/>
+        <w:ind w:left="1080" w:hanging="360"/>
       </w:pPr>
       <w:rPr>
         <w:rFonts w:ascii="Symbol" w:hAnsi="Symbol" w:hint="default"/>
@@ -36964,7 +38177,7 @@
       <w:lvlText w:val="o"/>
       <w:lvlJc w:val="left"/>
       <w:pPr>
-        <w:ind w:left="2120" w:hanging="360"/>
+        <w:ind w:left="1800" w:hanging="360"/>
       </w:pPr>
       <w:rPr>
         <w:rFonts w:ascii="Courier New" w:hAnsi="Courier New" w:cs="Courier New" w:hint="default"/>
@@ -36976,7 +38189,7 @@
       <w:lvlText w:val=""/>
       <w:lvlJc w:val="left"/>
       <w:pPr>
-        <w:ind w:left="2840" w:hanging="360"/>
+        <w:ind w:left="2520" w:hanging="360"/>
       </w:pPr>
       <w:rPr>
         <w:rFonts w:ascii="Wingdings" w:hAnsi="Wingdings" w:hint="default"/>
@@ -36988,7 +38201,7 @@
       <w:lvlText w:val=""/>
       <w:lvlJc w:val="left"/>
       <w:pPr>
-        <w:ind w:left="3560" w:hanging="360"/>
+        <w:ind w:left="3240" w:hanging="360"/>
       </w:pPr>
       <w:rPr>
         <w:rFonts w:ascii="Symbol" w:hAnsi="Symbol" w:hint="default"/>
@@ -37000,7 +38213,7 @@
       <w:lvlText w:val="o"/>
       <w:lvlJc w:val="left"/>
       <w:pPr>
-        <w:ind w:left="4280" w:hanging="360"/>
+        <w:ind w:left="3960" w:hanging="360"/>
       </w:pPr>
       <w:rPr>
         <w:rFonts w:ascii="Courier New" w:hAnsi="Courier New" w:cs="Courier New" w:hint="default"/>
@@ -37012,7 +38225,7 @@
       <w:lvlText w:val=""/>
       <w:lvlJc w:val="left"/>
       <w:pPr>
-        <w:ind w:left="5000" w:hanging="360"/>
+        <w:ind w:left="4680" w:hanging="360"/>
       </w:pPr>
       <w:rPr>
         <w:rFonts w:ascii="Wingdings" w:hAnsi="Wingdings" w:hint="default"/>
@@ -37024,7 +38237,7 @@
       <w:lvlText w:val=""/>
       <w:lvlJc w:val="left"/>
       <w:pPr>
-        <w:ind w:left="5720" w:hanging="360"/>
+        <w:ind w:left="5400" w:hanging="360"/>
       </w:pPr>
       <w:rPr>
         <w:rFonts w:ascii="Symbol" w:hAnsi="Symbol" w:hint="default"/>
@@ -37036,7 +38249,7 @@
       <w:lvlText w:val="o"/>
       <w:lvlJc w:val="left"/>
       <w:pPr>
-        <w:ind w:left="6440" w:hanging="360"/>
+        <w:ind w:left="6120" w:hanging="360"/>
       </w:pPr>
       <w:rPr>
         <w:rFonts w:ascii="Courier New" w:hAnsi="Courier New" w:cs="Courier New" w:hint="default"/>
@@ -37048,7 +38261,7 @@
       <w:lvlText w:val=""/>
       <w:lvlJc w:val="left"/>
       <w:pPr>
-        <w:ind w:left="7160" w:hanging="360"/>
+        <w:ind w:left="6840" w:hanging="360"/>
       </w:pPr>
       <w:rPr>
         <w:rFonts w:ascii="Wingdings" w:hAnsi="Wingdings" w:hint="default"/>
@@ -37056,16 +38269,16 @@
     </w:lvl>
   </w:abstractNum>
   <w:abstractNum w:abstractNumId="8" w15:restartNumberingAfterBreak="0">
-    <w:nsid w:val="13D0436B"/>
+    <w:nsid w:val="1119125E"/>
     <w:multiLevelType w:val="hybridMultilevel"/>
-    <w:tmpl w:val="690EA54C"/>
+    <w:tmpl w:val="AFDC0C68"/>
     <w:lvl w:ilvl="0" w:tplc="241A0001">
       <w:start w:val="1"/>
       <w:numFmt w:val="bullet"/>
       <w:lvlText w:val=""/>
       <w:lvlJc w:val="left"/>
       <w:pPr>
-        <w:ind w:left="814" w:hanging="360"/>
+        <w:ind w:left="1400" w:hanging="360"/>
       </w:pPr>
       <w:rPr>
         <w:rFonts w:ascii="Symbol" w:hAnsi="Symbol" w:hint="default"/>
@@ -37077,7 +38290,7 @@
       <w:lvlText w:val="o"/>
       <w:lvlJc w:val="left"/>
       <w:pPr>
-        <w:ind w:left="1534" w:hanging="360"/>
+        <w:ind w:left="2120" w:hanging="360"/>
       </w:pPr>
       <w:rPr>
         <w:rFonts w:ascii="Courier New" w:hAnsi="Courier New" w:cs="Courier New" w:hint="default"/>
@@ -37089,7 +38302,7 @@
       <w:lvlText w:val=""/>
       <w:lvlJc w:val="left"/>
       <w:pPr>
-        <w:ind w:left="2254" w:hanging="360"/>
+        <w:ind w:left="2840" w:hanging="360"/>
       </w:pPr>
       <w:rPr>
         <w:rFonts w:ascii="Wingdings" w:hAnsi="Wingdings" w:hint="default"/>
@@ -37101,7 +38314,7 @@
       <w:lvlText w:val=""/>
       <w:lvlJc w:val="left"/>
       <w:pPr>
-        <w:ind w:left="2974" w:hanging="360"/>
+        <w:ind w:left="3560" w:hanging="360"/>
       </w:pPr>
       <w:rPr>
         <w:rFonts w:ascii="Symbol" w:hAnsi="Symbol" w:hint="default"/>
@@ -37113,7 +38326,7 @@
       <w:lvlText w:val="o"/>
       <w:lvlJc w:val="left"/>
       <w:pPr>
-        <w:ind w:left="3694" w:hanging="360"/>
+        <w:ind w:left="4280" w:hanging="360"/>
       </w:pPr>
       <w:rPr>
         <w:rFonts w:ascii="Courier New" w:hAnsi="Courier New" w:cs="Courier New" w:hint="default"/>
@@ -37125,7 +38338,7 @@
       <w:lvlText w:val=""/>
       <w:lvlJc w:val="left"/>
       <w:pPr>
-        <w:ind w:left="4414" w:hanging="360"/>
+        <w:ind w:left="5000" w:hanging="360"/>
       </w:pPr>
       <w:rPr>
         <w:rFonts w:ascii="Wingdings" w:hAnsi="Wingdings" w:hint="default"/>
@@ -37137,7 +38350,7 @@
       <w:lvlText w:val=""/>
       <w:lvlJc w:val="left"/>
       <w:pPr>
-        <w:ind w:left="5134" w:hanging="360"/>
+        <w:ind w:left="5720" w:hanging="360"/>
       </w:pPr>
       <w:rPr>
         <w:rFonts w:ascii="Symbol" w:hAnsi="Symbol" w:hint="default"/>
@@ -37149,7 +38362,7 @@
       <w:lvlText w:val="o"/>
       <w:lvlJc w:val="left"/>
       <w:pPr>
-        <w:ind w:left="5854" w:hanging="360"/>
+        <w:ind w:left="6440" w:hanging="360"/>
       </w:pPr>
       <w:rPr>
         <w:rFonts w:ascii="Courier New" w:hAnsi="Courier New" w:cs="Courier New" w:hint="default"/>
@@ -37161,7 +38374,7 @@
       <w:lvlText w:val=""/>
       <w:lvlJc w:val="left"/>
       <w:pPr>
-        <w:ind w:left="6574" w:hanging="360"/>
+        <w:ind w:left="7160" w:hanging="360"/>
       </w:pPr>
       <w:rPr>
         <w:rFonts w:ascii="Wingdings" w:hAnsi="Wingdings" w:hint="default"/>
@@ -37169,9 +38382,9 @@
     </w:lvl>
   </w:abstractNum>
   <w:abstractNum w:abstractNumId="9" w15:restartNumberingAfterBreak="0">
-    <w:nsid w:val="13D57DC8"/>
+    <w:nsid w:val="13D0436B"/>
     <w:multiLevelType w:val="hybridMultilevel"/>
-    <w:tmpl w:val="4B0EB54C"/>
+    <w:tmpl w:val="690EA54C"/>
     <w:lvl w:ilvl="0" w:tplc="241A0001">
       <w:start w:val="1"/>
       <w:numFmt w:val="bullet"/>
@@ -37282,6 +38495,119 @@
     </w:lvl>
   </w:abstractNum>
   <w:abstractNum w:abstractNumId="10" w15:restartNumberingAfterBreak="0">
+    <w:nsid w:val="13D57DC8"/>
+    <w:multiLevelType w:val="hybridMultilevel"/>
+    <w:tmpl w:val="4B0EB54C"/>
+    <w:lvl w:ilvl="0" w:tplc="241A0001">
+      <w:start w:val="1"/>
+      <w:numFmt w:val="bullet"/>
+      <w:lvlText w:val=""/>
+      <w:lvlJc w:val="left"/>
+      <w:pPr>
+        <w:ind w:left="814" w:hanging="360"/>
+      </w:pPr>
+      <w:rPr>
+        <w:rFonts w:ascii="Symbol" w:hAnsi="Symbol" w:hint="default"/>
+      </w:rPr>
+    </w:lvl>
+    <w:lvl w:ilvl="1" w:tplc="241A0003" w:tentative="1">
+      <w:start w:val="1"/>
+      <w:numFmt w:val="bullet"/>
+      <w:lvlText w:val="o"/>
+      <w:lvlJc w:val="left"/>
+      <w:pPr>
+        <w:ind w:left="1534" w:hanging="360"/>
+      </w:pPr>
+      <w:rPr>
+        <w:rFonts w:ascii="Courier New" w:hAnsi="Courier New" w:cs="Courier New" w:hint="default"/>
+      </w:rPr>
+    </w:lvl>
+    <w:lvl w:ilvl="2" w:tplc="241A0005" w:tentative="1">
+      <w:start w:val="1"/>
+      <w:numFmt w:val="bullet"/>
+      <w:lvlText w:val=""/>
+      <w:lvlJc w:val="left"/>
+      <w:pPr>
+        <w:ind w:left="2254" w:hanging="360"/>
+      </w:pPr>
+      <w:rPr>
+        <w:rFonts w:ascii="Wingdings" w:hAnsi="Wingdings" w:hint="default"/>
+      </w:rPr>
+    </w:lvl>
+    <w:lvl w:ilvl="3" w:tplc="241A0001" w:tentative="1">
+      <w:start w:val="1"/>
+      <w:numFmt w:val="bullet"/>
+      <w:lvlText w:val=""/>
+      <w:lvlJc w:val="left"/>
+      <w:pPr>
+        <w:ind w:left="2974" w:hanging="360"/>
+      </w:pPr>
+      <w:rPr>
+        <w:rFonts w:ascii="Symbol" w:hAnsi="Symbol" w:hint="default"/>
+      </w:rPr>
+    </w:lvl>
+    <w:lvl w:ilvl="4" w:tplc="241A0003" w:tentative="1">
+      <w:start w:val="1"/>
+      <w:numFmt w:val="bullet"/>
+      <w:lvlText w:val="o"/>
+      <w:lvlJc w:val="left"/>
+      <w:pPr>
+        <w:ind w:left="3694" w:hanging="360"/>
+      </w:pPr>
+      <w:rPr>
+        <w:rFonts w:ascii="Courier New" w:hAnsi="Courier New" w:cs="Courier New" w:hint="default"/>
+      </w:rPr>
+    </w:lvl>
+    <w:lvl w:ilvl="5" w:tplc="241A0005" w:tentative="1">
+      <w:start w:val="1"/>
+      <w:numFmt w:val="bullet"/>
+      <w:lvlText w:val=""/>
+      <w:lvlJc w:val="left"/>
+      <w:pPr>
+        <w:ind w:left="4414" w:hanging="360"/>
+      </w:pPr>
+      <w:rPr>
+        <w:rFonts w:ascii="Wingdings" w:hAnsi="Wingdings" w:hint="default"/>
+      </w:rPr>
+    </w:lvl>
+    <w:lvl w:ilvl="6" w:tplc="241A0001" w:tentative="1">
+      <w:start w:val="1"/>
+      <w:numFmt w:val="bullet"/>
+      <w:lvlText w:val=""/>
+      <w:lvlJc w:val="left"/>
+      <w:pPr>
+        <w:ind w:left="5134" w:hanging="360"/>
+      </w:pPr>
+      <w:rPr>
+        <w:rFonts w:ascii="Symbol" w:hAnsi="Symbol" w:hint="default"/>
+      </w:rPr>
+    </w:lvl>
+    <w:lvl w:ilvl="7" w:tplc="241A0003" w:tentative="1">
+      <w:start w:val="1"/>
+      <w:numFmt w:val="bullet"/>
+      <w:lvlText w:val="o"/>
+      <w:lvlJc w:val="left"/>
+      <w:pPr>
+        <w:ind w:left="5854" w:hanging="360"/>
+      </w:pPr>
+      <w:rPr>
+        <w:rFonts w:ascii="Courier New" w:hAnsi="Courier New" w:cs="Courier New" w:hint="default"/>
+      </w:rPr>
+    </w:lvl>
+    <w:lvl w:ilvl="8" w:tplc="241A0005" w:tentative="1">
+      <w:start w:val="1"/>
+      <w:numFmt w:val="bullet"/>
+      <w:lvlText w:val=""/>
+      <w:lvlJc w:val="left"/>
+      <w:pPr>
+        <w:ind w:left="6574" w:hanging="360"/>
+      </w:pPr>
+      <w:rPr>
+        <w:rFonts w:ascii="Wingdings" w:hAnsi="Wingdings" w:hint="default"/>
+      </w:rPr>
+    </w:lvl>
+  </w:abstractNum>
+  <w:abstractNum w:abstractNumId="11" w15:restartNumberingAfterBreak="0">
     <w:nsid w:val="14997500"/>
     <w:multiLevelType w:val="hybridMultilevel"/>
     <w:tmpl w:val="C36EEC3E"/>
@@ -37493,7 +38819,7 @@
       </w:rPr>
     </w:lvl>
   </w:abstractNum>
-  <w:abstractNum w:abstractNumId="11" w15:restartNumberingAfterBreak="0">
+  <w:abstractNum w:abstractNumId="12" w15:restartNumberingAfterBreak="0">
     <w:nsid w:val="15035A65"/>
     <w:multiLevelType w:val="multilevel"/>
     <w:tmpl w:val="4A425D1A"/>
@@ -37642,7 +38968,7 @@
       </w:rPr>
     </w:lvl>
   </w:abstractNum>
-  <w:abstractNum w:abstractNumId="12" w15:restartNumberingAfterBreak="0">
+  <w:abstractNum w:abstractNumId="13" w15:restartNumberingAfterBreak="0">
     <w:nsid w:val="17A71BFE"/>
     <w:multiLevelType w:val="multilevel"/>
     <w:tmpl w:val="4ACCC58C"/>
@@ -37854,7 +39180,7 @@
       </w:rPr>
     </w:lvl>
   </w:abstractNum>
-  <w:abstractNum w:abstractNumId="13" w15:restartNumberingAfterBreak="0">
+  <w:abstractNum w:abstractNumId="14" w15:restartNumberingAfterBreak="0">
     <w:nsid w:val="2E221B9C"/>
     <w:multiLevelType w:val="hybridMultilevel"/>
     <w:tmpl w:val="BB089646"/>
@@ -37943,7 +39269,7 @@
       </w:pPr>
     </w:lvl>
   </w:abstractNum>
-  <w:abstractNum w:abstractNumId="14" w15:restartNumberingAfterBreak="0">
+  <w:abstractNum w:abstractNumId="15" w15:restartNumberingAfterBreak="0">
     <w:nsid w:val="2EAB193B"/>
     <w:multiLevelType w:val="multilevel"/>
     <w:tmpl w:val="241A001F"/>
@@ -38148,7 +39474,7 @@
       </w:rPr>
     </w:lvl>
   </w:abstractNum>
-  <w:abstractNum w:abstractNumId="15" w15:restartNumberingAfterBreak="0">
+  <w:abstractNum w:abstractNumId="16" w15:restartNumberingAfterBreak="0">
     <w:nsid w:val="322F6BF6"/>
     <w:multiLevelType w:val="hybridMultilevel"/>
     <w:tmpl w:val="13F86F1A"/>
@@ -38261,7 +39587,7 @@
       </w:rPr>
     </w:lvl>
   </w:abstractNum>
-  <w:abstractNum w:abstractNumId="16" w15:restartNumberingAfterBreak="0">
+  <w:abstractNum w:abstractNumId="17" w15:restartNumberingAfterBreak="0">
     <w:nsid w:val="35605016"/>
     <w:multiLevelType w:val="hybridMultilevel"/>
     <w:tmpl w:val="5D12E6DC"/>
@@ -38374,7 +39700,7 @@
       </w:rPr>
     </w:lvl>
   </w:abstractNum>
-  <w:abstractNum w:abstractNumId="17" w15:restartNumberingAfterBreak="0">
+  <w:abstractNum w:abstractNumId="18" w15:restartNumberingAfterBreak="0">
     <w:nsid w:val="37852403"/>
     <w:multiLevelType w:val="hybridMultilevel"/>
     <w:tmpl w:val="8E7A637E"/>
@@ -38487,7 +39813,7 @@
       </w:rPr>
     </w:lvl>
   </w:abstractNum>
-  <w:abstractNum w:abstractNumId="18" w15:restartNumberingAfterBreak="0">
+  <w:abstractNum w:abstractNumId="19" w15:restartNumberingAfterBreak="0">
     <w:nsid w:val="37EB7931"/>
     <w:multiLevelType w:val="hybridMultilevel"/>
     <w:tmpl w:val="29A8733A"/>
@@ -38600,7 +39926,7 @@
       </w:rPr>
     </w:lvl>
   </w:abstractNum>
-  <w:abstractNum w:abstractNumId="19" w15:restartNumberingAfterBreak="0">
+  <w:abstractNum w:abstractNumId="20" w15:restartNumberingAfterBreak="0">
     <w:nsid w:val="38277BD4"/>
     <w:multiLevelType w:val="hybridMultilevel"/>
     <w:tmpl w:val="A0E4CE74"/>
@@ -38713,7 +40039,7 @@
       </w:rPr>
     </w:lvl>
   </w:abstractNum>
-  <w:abstractNum w:abstractNumId="20" w15:restartNumberingAfterBreak="0">
+  <w:abstractNum w:abstractNumId="21" w15:restartNumberingAfterBreak="0">
     <w:nsid w:val="3AEE0340"/>
     <w:multiLevelType w:val="hybridMultilevel"/>
     <w:tmpl w:val="C1AC9320"/>
@@ -38826,7 +40152,7 @@
       </w:rPr>
     </w:lvl>
   </w:abstractNum>
-  <w:abstractNum w:abstractNumId="21" w15:restartNumberingAfterBreak="0">
+  <w:abstractNum w:abstractNumId="22" w15:restartNumberingAfterBreak="0">
     <w:nsid w:val="3E9F10A7"/>
     <w:multiLevelType w:val="hybridMultilevel"/>
     <w:tmpl w:val="24AC2B92"/>
@@ -38939,7 +40265,7 @@
       </w:rPr>
     </w:lvl>
   </w:abstractNum>
-  <w:abstractNum w:abstractNumId="22" w15:restartNumberingAfterBreak="0">
+  <w:abstractNum w:abstractNumId="23" w15:restartNumberingAfterBreak="0">
     <w:nsid w:val="4713770E"/>
     <w:multiLevelType w:val="hybridMultilevel"/>
     <w:tmpl w:val="68027C48"/>
@@ -39052,7 +40378,7 @@
       </w:rPr>
     </w:lvl>
   </w:abstractNum>
-  <w:abstractNum w:abstractNumId="23" w15:restartNumberingAfterBreak="0">
+  <w:abstractNum w:abstractNumId="24" w15:restartNumberingAfterBreak="0">
     <w:nsid w:val="4818799E"/>
     <w:multiLevelType w:val="multilevel"/>
     <w:tmpl w:val="01882E5A"/>
@@ -39201,7 +40527,7 @@
       </w:rPr>
     </w:lvl>
   </w:abstractNum>
-  <w:abstractNum w:abstractNumId="24" w15:restartNumberingAfterBreak="0">
+  <w:abstractNum w:abstractNumId="25" w15:restartNumberingAfterBreak="0">
     <w:nsid w:val="49476231"/>
     <w:multiLevelType w:val="multilevel"/>
     <w:tmpl w:val="6D282BD4"/>
@@ -39425,7 +40751,7 @@
       </w:rPr>
     </w:lvl>
   </w:abstractNum>
-  <w:abstractNum w:abstractNumId="25" w15:restartNumberingAfterBreak="0">
+  <w:abstractNum w:abstractNumId="26" w15:restartNumberingAfterBreak="0">
     <w:nsid w:val="49545090"/>
     <w:multiLevelType w:val="hybridMultilevel"/>
     <w:tmpl w:val="C57217D4"/>
@@ -39538,7 +40864,7 @@
       </w:rPr>
     </w:lvl>
   </w:abstractNum>
-  <w:abstractNum w:abstractNumId="26" w15:restartNumberingAfterBreak="0">
+  <w:abstractNum w:abstractNumId="27" w15:restartNumberingAfterBreak="0">
     <w:nsid w:val="4AD52466"/>
     <w:multiLevelType w:val="hybridMultilevel"/>
     <w:tmpl w:val="21EE0504"/>
@@ -39651,7 +40977,7 @@
       </w:rPr>
     </w:lvl>
   </w:abstractNum>
-  <w:abstractNum w:abstractNumId="27" w15:restartNumberingAfterBreak="0">
+  <w:abstractNum w:abstractNumId="28" w15:restartNumberingAfterBreak="0">
     <w:nsid w:val="4B9C64B2"/>
     <w:multiLevelType w:val="multilevel"/>
     <w:tmpl w:val="8CD8D9CC"/>
@@ -39800,7 +41126,7 @@
       </w:rPr>
     </w:lvl>
   </w:abstractNum>
-  <w:abstractNum w:abstractNumId="28" w15:restartNumberingAfterBreak="0">
+  <w:abstractNum w:abstractNumId="29" w15:restartNumberingAfterBreak="0">
     <w:nsid w:val="4C35568B"/>
     <w:multiLevelType w:val="hybridMultilevel"/>
     <w:tmpl w:val="D7E2A7F4"/>
@@ -39913,7 +41239,7 @@
       </w:rPr>
     </w:lvl>
   </w:abstractNum>
-  <w:abstractNum w:abstractNumId="29" w15:restartNumberingAfterBreak="0">
+  <w:abstractNum w:abstractNumId="30" w15:restartNumberingAfterBreak="0">
     <w:nsid w:val="4E0C7273"/>
     <w:multiLevelType w:val="hybridMultilevel"/>
     <w:tmpl w:val="D12C088C"/>
@@ -40026,7 +41352,120 @@
       </w:rPr>
     </w:lvl>
   </w:abstractNum>
-  <w:abstractNum w:abstractNumId="30" w15:restartNumberingAfterBreak="0">
+  <w:abstractNum w:abstractNumId="31" w15:restartNumberingAfterBreak="0">
+    <w:nsid w:val="538272AF"/>
+    <w:multiLevelType w:val="hybridMultilevel"/>
+    <w:tmpl w:val="C20AACF6"/>
+    <w:lvl w:ilvl="0" w:tplc="08090001">
+      <w:start w:val="1"/>
+      <w:numFmt w:val="bullet"/>
+      <w:lvlText w:val=""/>
+      <w:lvlJc w:val="left"/>
+      <w:pPr>
+        <w:ind w:left="360" w:hanging="360"/>
+      </w:pPr>
+      <w:rPr>
+        <w:rFonts w:ascii="Symbol" w:hAnsi="Symbol" w:hint="default"/>
+      </w:rPr>
+    </w:lvl>
+    <w:lvl w:ilvl="1" w:tplc="08090003">
+      <w:start w:val="1"/>
+      <w:numFmt w:val="bullet"/>
+      <w:lvlText w:val="o"/>
+      <w:lvlJc w:val="left"/>
+      <w:pPr>
+        <w:ind w:left="1080" w:hanging="360"/>
+      </w:pPr>
+      <w:rPr>
+        <w:rFonts w:ascii="Courier New" w:hAnsi="Courier New" w:cs="Courier New" w:hint="default"/>
+      </w:rPr>
+    </w:lvl>
+    <w:lvl w:ilvl="2" w:tplc="08090005">
+      <w:start w:val="1"/>
+      <w:numFmt w:val="bullet"/>
+      <w:lvlText w:val=""/>
+      <w:lvlJc w:val="left"/>
+      <w:pPr>
+        <w:ind w:left="1800" w:hanging="360"/>
+      </w:pPr>
+      <w:rPr>
+        <w:rFonts w:ascii="Wingdings" w:hAnsi="Wingdings" w:hint="default"/>
+      </w:rPr>
+    </w:lvl>
+    <w:lvl w:ilvl="3" w:tplc="08090001">
+      <w:start w:val="1"/>
+      <w:numFmt w:val="bullet"/>
+      <w:lvlText w:val=""/>
+      <w:lvlJc w:val="left"/>
+      <w:pPr>
+        <w:ind w:left="2520" w:hanging="360"/>
+      </w:pPr>
+      <w:rPr>
+        <w:rFonts w:ascii="Symbol" w:hAnsi="Symbol" w:hint="default"/>
+      </w:rPr>
+    </w:lvl>
+    <w:lvl w:ilvl="4" w:tplc="08090003">
+      <w:start w:val="1"/>
+      <w:numFmt w:val="bullet"/>
+      <w:lvlText w:val="o"/>
+      <w:lvlJc w:val="left"/>
+      <w:pPr>
+        <w:ind w:left="3240" w:hanging="360"/>
+      </w:pPr>
+      <w:rPr>
+        <w:rFonts w:ascii="Courier New" w:hAnsi="Courier New" w:cs="Courier New" w:hint="default"/>
+      </w:rPr>
+    </w:lvl>
+    <w:lvl w:ilvl="5" w:tplc="08090005">
+      <w:start w:val="1"/>
+      <w:numFmt w:val="bullet"/>
+      <w:lvlText w:val=""/>
+      <w:lvlJc w:val="left"/>
+      <w:pPr>
+        <w:ind w:left="3960" w:hanging="360"/>
+      </w:pPr>
+      <w:rPr>
+        <w:rFonts w:ascii="Wingdings" w:hAnsi="Wingdings" w:hint="default"/>
+      </w:rPr>
+    </w:lvl>
+    <w:lvl w:ilvl="6" w:tplc="08090001">
+      <w:start w:val="1"/>
+      <w:numFmt w:val="bullet"/>
+      <w:lvlText w:val=""/>
+      <w:lvlJc w:val="left"/>
+      <w:pPr>
+        <w:ind w:left="4680" w:hanging="360"/>
+      </w:pPr>
+      <w:rPr>
+        <w:rFonts w:ascii="Symbol" w:hAnsi="Symbol" w:hint="default"/>
+      </w:rPr>
+    </w:lvl>
+    <w:lvl w:ilvl="7" w:tplc="08090003">
+      <w:start w:val="1"/>
+      <w:numFmt w:val="bullet"/>
+      <w:lvlText w:val="o"/>
+      <w:lvlJc w:val="left"/>
+      <w:pPr>
+        <w:ind w:left="5400" w:hanging="360"/>
+      </w:pPr>
+      <w:rPr>
+        <w:rFonts w:ascii="Courier New" w:hAnsi="Courier New" w:cs="Courier New" w:hint="default"/>
+      </w:rPr>
+    </w:lvl>
+    <w:lvl w:ilvl="8" w:tplc="08090005">
+      <w:start w:val="1"/>
+      <w:numFmt w:val="bullet"/>
+      <w:lvlText w:val=""/>
+      <w:lvlJc w:val="left"/>
+      <w:pPr>
+        <w:ind w:left="6120" w:hanging="360"/>
+      </w:pPr>
+      <w:rPr>
+        <w:rFonts w:ascii="Wingdings" w:hAnsi="Wingdings" w:hint="default"/>
+      </w:rPr>
+    </w:lvl>
+  </w:abstractNum>
+  <w:abstractNum w:abstractNumId="32" w15:restartNumberingAfterBreak="0">
     <w:nsid w:val="5A9835B3"/>
     <w:multiLevelType w:val="multilevel"/>
     <w:tmpl w:val="BFEC50DA"/>
@@ -40240,7 +41679,7 @@
       </w:rPr>
     </w:lvl>
   </w:abstractNum>
-  <w:abstractNum w:abstractNumId="31" w15:restartNumberingAfterBreak="0">
+  <w:abstractNum w:abstractNumId="33" w15:restartNumberingAfterBreak="0">
     <w:nsid w:val="60BE2F34"/>
     <w:multiLevelType w:val="hybridMultilevel"/>
     <w:tmpl w:val="3A0EBF04"/>
@@ -40353,7 +41792,7 @@
       </w:rPr>
     </w:lvl>
   </w:abstractNum>
-  <w:abstractNum w:abstractNumId="32" w15:restartNumberingAfterBreak="0">
+  <w:abstractNum w:abstractNumId="34" w15:restartNumberingAfterBreak="0">
     <w:nsid w:val="628A05B6"/>
     <w:multiLevelType w:val="multilevel"/>
     <w:tmpl w:val="6E4E1B08"/>
@@ -40502,7 +41941,7 @@
       </w:rPr>
     </w:lvl>
   </w:abstractNum>
-  <w:abstractNum w:abstractNumId="33" w15:restartNumberingAfterBreak="0">
+  <w:abstractNum w:abstractNumId="35" w15:restartNumberingAfterBreak="0">
     <w:nsid w:val="63044B5F"/>
     <w:multiLevelType w:val="hybridMultilevel"/>
     <w:tmpl w:val="61FC66E6"/>
@@ -40615,7 +42054,7 @@
       </w:rPr>
     </w:lvl>
   </w:abstractNum>
-  <w:abstractNum w:abstractNumId="34" w15:restartNumberingAfterBreak="0">
+  <w:abstractNum w:abstractNumId="36" w15:restartNumberingAfterBreak="0">
     <w:nsid w:val="64AE37AA"/>
     <w:multiLevelType w:val="hybridMultilevel"/>
     <w:tmpl w:val="562A1034"/>
@@ -40704,7 +42143,7 @@
       </w:pPr>
     </w:lvl>
   </w:abstractNum>
-  <w:abstractNum w:abstractNumId="35" w15:restartNumberingAfterBreak="0">
+  <w:abstractNum w:abstractNumId="37" w15:restartNumberingAfterBreak="0">
     <w:nsid w:val="65747105"/>
     <w:multiLevelType w:val="hybridMultilevel"/>
     <w:tmpl w:val="1B608FEC"/>
@@ -40817,7 +42256,7 @@
       </w:rPr>
     </w:lvl>
   </w:abstractNum>
-  <w:abstractNum w:abstractNumId="36" w15:restartNumberingAfterBreak="0">
+  <w:abstractNum w:abstractNumId="38" w15:restartNumberingAfterBreak="0">
     <w:nsid w:val="66837E49"/>
     <w:multiLevelType w:val="hybridMultilevel"/>
     <w:tmpl w:val="2612E926"/>
@@ -40930,7 +42369,7 @@
       </w:rPr>
     </w:lvl>
   </w:abstractNum>
-  <w:abstractNum w:abstractNumId="37" w15:restartNumberingAfterBreak="0">
+  <w:abstractNum w:abstractNumId="39" w15:restartNumberingAfterBreak="0">
     <w:nsid w:val="70524DBC"/>
     <w:multiLevelType w:val="hybridMultilevel"/>
     <w:tmpl w:val="57887536"/>
@@ -41069,7 +42508,7 @@
       </w:rPr>
     </w:lvl>
   </w:abstractNum>
-  <w:abstractNum w:abstractNumId="38" w15:restartNumberingAfterBreak="0">
+  <w:abstractNum w:abstractNumId="40" w15:restartNumberingAfterBreak="0">
     <w:nsid w:val="7146658E"/>
     <w:multiLevelType w:val="hybridMultilevel"/>
     <w:tmpl w:val="81867AC4"/>
@@ -41281,7 +42720,7 @@
       </w:rPr>
     </w:lvl>
   </w:abstractNum>
-  <w:abstractNum w:abstractNumId="39" w15:restartNumberingAfterBreak="0">
+  <w:abstractNum w:abstractNumId="41" w15:restartNumberingAfterBreak="0">
     <w:nsid w:val="73037C1B"/>
     <w:multiLevelType w:val="hybridMultilevel"/>
     <w:tmpl w:val="D6F64F0E"/>
@@ -41394,7 +42833,7 @@
       </w:rPr>
     </w:lvl>
   </w:abstractNum>
-  <w:abstractNum w:abstractNumId="40" w15:restartNumberingAfterBreak="0">
+  <w:abstractNum w:abstractNumId="42" w15:restartNumberingAfterBreak="0">
     <w:nsid w:val="77CC1C5F"/>
     <w:multiLevelType w:val="multilevel"/>
     <w:tmpl w:val="BFEC50DA"/>
@@ -41609,103 +43048,103 @@
     </w:lvl>
   </w:abstractNum>
   <w:num w:numId="1" w16cid:durableId="923995977">
-    <w:abstractNumId w:val="30"/>
+    <w:abstractNumId w:val="32"/>
   </w:num>
   <w:num w:numId="2" w16cid:durableId="927424668">
-    <w:abstractNumId w:val="12"/>
+    <w:abstractNumId w:val="13"/>
   </w:num>
   <w:num w:numId="3" w16cid:durableId="1585070712">
-    <w:abstractNumId w:val="38"/>
+    <w:abstractNumId w:val="40"/>
   </w:num>
   <w:num w:numId="4" w16cid:durableId="1276448765">
-    <w:abstractNumId w:val="10"/>
+    <w:abstractNumId w:val="11"/>
   </w:num>
   <w:num w:numId="5" w16cid:durableId="332226751">
-    <w:abstractNumId w:val="24"/>
+    <w:abstractNumId w:val="25"/>
   </w:num>
   <w:num w:numId="6" w16cid:durableId="175072684">
-    <w:abstractNumId w:val="37"/>
+    <w:abstractNumId w:val="39"/>
   </w:num>
   <w:num w:numId="7" w16cid:durableId="2030909343">
-    <w:abstractNumId w:val="34"/>
+    <w:abstractNumId w:val="36"/>
   </w:num>
   <w:num w:numId="8" w16cid:durableId="1886527058">
     <w:abstractNumId w:val="1"/>
   </w:num>
   <w:num w:numId="9" w16cid:durableId="2086414874">
-    <w:abstractNumId w:val="13"/>
+    <w:abstractNumId w:val="14"/>
   </w:num>
   <w:num w:numId="10" w16cid:durableId="1984459206">
     <w:abstractNumId w:val="5"/>
   </w:num>
   <w:num w:numId="11" w16cid:durableId="1763063598">
-    <w:abstractNumId w:val="40"/>
+    <w:abstractNumId w:val="42"/>
   </w:num>
   <w:num w:numId="12" w16cid:durableId="912734822">
-    <w:abstractNumId w:val="14"/>
+    <w:abstractNumId w:val="15"/>
   </w:num>
   <w:num w:numId="13" w16cid:durableId="530727020">
     <w:abstractNumId w:val="3"/>
   </w:num>
   <w:num w:numId="14" w16cid:durableId="1824464561">
-    <w:abstractNumId w:val="7"/>
+    <w:abstractNumId w:val="8"/>
   </w:num>
   <w:num w:numId="15" w16cid:durableId="1087455587">
-    <w:abstractNumId w:val="32"/>
+    <w:abstractNumId w:val="34"/>
   </w:num>
   <w:num w:numId="16" w16cid:durableId="1834835878">
+    <w:abstractNumId w:val="17"/>
+  </w:num>
+  <w:num w:numId="17" w16cid:durableId="1110735782">
+    <w:abstractNumId w:val="24"/>
+  </w:num>
+  <w:num w:numId="18" w16cid:durableId="2003390314">
+    <w:abstractNumId w:val="28"/>
+  </w:num>
+  <w:num w:numId="19" w16cid:durableId="1747337491">
     <w:abstractNumId w:val="16"/>
   </w:num>
-  <w:num w:numId="17" w16cid:durableId="1110735782">
-    <w:abstractNumId w:val="23"/>
-  </w:num>
-  <w:num w:numId="18" w16cid:durableId="2003390314">
-    <w:abstractNumId w:val="27"/>
-  </w:num>
-  <w:num w:numId="19" w16cid:durableId="1747337491">
-    <w:abstractNumId w:val="15"/>
-  </w:num>
   <w:num w:numId="20" w16cid:durableId="1218590626">
-    <w:abstractNumId w:val="39"/>
+    <w:abstractNumId w:val="41"/>
   </w:num>
   <w:num w:numId="21" w16cid:durableId="1851672879">
-    <w:abstractNumId w:val="31"/>
+    <w:abstractNumId w:val="33"/>
   </w:num>
   <w:num w:numId="22" w16cid:durableId="488249768">
     <w:abstractNumId w:val="0"/>
   </w:num>
   <w:num w:numId="23" w16cid:durableId="1921135157">
-    <w:abstractNumId w:val="28"/>
+    <w:abstractNumId w:val="29"/>
   </w:num>
   <w:num w:numId="24" w16cid:durableId="334265123">
-    <w:abstractNumId w:val="11"/>
+    <w:abstractNumId w:val="12"/>
   </w:num>
   <w:num w:numId="25" w16cid:durableId="1996033565">
-    <w:abstractNumId w:val="6"/>
+    <w:abstractNumId w:val="7"/>
   </w:num>
   <w:num w:numId="26" w16cid:durableId="1976792563">
-    <w:abstractNumId w:val="25"/>
+    <w:abstractNumId w:val="26"/>
   </w:num>
   <w:num w:numId="27" w16cid:durableId="764418925">
-    <w:abstractNumId w:val="35"/>
+    <w:abstractNumId w:val="37"/>
   </w:num>
   <w:num w:numId="28" w16cid:durableId="1938706701">
-    <w:abstractNumId w:val="8"/>
+    <w:abstractNumId w:val="9"/>
   </w:num>
   <w:num w:numId="29" w16cid:durableId="1007751196">
-    <w:abstractNumId w:val="21"/>
+    <w:abstractNumId w:val="22"/>
   </w:num>
   <w:num w:numId="30" w16cid:durableId="1502426926">
-    <w:abstractNumId w:val="9"/>
+    <w:abstractNumId w:val="10"/>
   </w:num>
   <w:num w:numId="31" w16cid:durableId="1243494485">
-    <w:abstractNumId w:val="36"/>
+    <w:abstractNumId w:val="38"/>
   </w:num>
   <w:num w:numId="32" w16cid:durableId="1371027624">
-    <w:abstractNumId w:val="17"/>
+    <w:abstractNumId w:val="18"/>
   </w:num>
   <w:num w:numId="33" w16cid:durableId="1341080538">
-    <w:abstractNumId w:val="18"/>
+    <w:abstractNumId w:val="19"/>
   </w:num>
   <w:num w:numId="34" w16cid:durableId="1002317522">
     <w:abstractNumId w:val="2"/>
@@ -41714,22 +43153,28 @@
     <w:abstractNumId w:val="4"/>
   </w:num>
   <w:num w:numId="36" w16cid:durableId="1454982583">
-    <w:abstractNumId w:val="26"/>
+    <w:abstractNumId w:val="27"/>
   </w:num>
   <w:num w:numId="37" w16cid:durableId="617420782">
+    <w:abstractNumId w:val="21"/>
+  </w:num>
+  <w:num w:numId="38" w16cid:durableId="932974157">
+    <w:abstractNumId w:val="35"/>
+  </w:num>
+  <w:num w:numId="39" w16cid:durableId="2003855588">
     <w:abstractNumId w:val="20"/>
   </w:num>
-  <w:num w:numId="38" w16cid:durableId="932974157">
-    <w:abstractNumId w:val="33"/>
-  </w:num>
-  <w:num w:numId="39" w16cid:durableId="2003855588">
-    <w:abstractNumId w:val="19"/>
-  </w:num>
   <w:num w:numId="40" w16cid:durableId="393816658">
-    <w:abstractNumId w:val="29"/>
+    <w:abstractNumId w:val="30"/>
   </w:num>
   <w:num w:numId="41" w16cid:durableId="1279800101">
-    <w:abstractNumId w:val="22"/>
+    <w:abstractNumId w:val="23"/>
+  </w:num>
+  <w:num w:numId="42" w16cid:durableId="1500460706">
+    <w:abstractNumId w:val="31"/>
+  </w:num>
+  <w:num w:numId="43" w16cid:durableId="1010185462">
+    <w:abstractNumId w:val="6"/>
   </w:num>
 </w:numbering>
 </file>
@@ -42218,6 +43663,7 @@
   <w:style w:type="character" w:default="1" w:styleId="DefaultParagraphFont">
     <w:name w:val="Default Paragraph Font"/>
     <w:uiPriority w:val="1"/>
+    <w:semiHidden/>
     <w:unhideWhenUsed/>
   </w:style>
   <w:style w:type="table" w:default="1" w:styleId="TableNormal">

</xml_diff>